<commit_message>
feat(interface) : Implémentation de l'interface utilisateur, avec toutes les données du parking affichée (pour l'instant ce sont de fausses donées)
</commit_message>
<xml_diff>
--- a/fichiers/R-P_Parking-HugoSchweizer.docx
+++ b/fichiers/R-P_Parking-HugoSchweizer.docx
@@ -9,14 +9,12 @@
           <w:color w:val="000000" w:themeColor="text1"/>
         </w:rPr>
       </w:pPr>
-      <w:proofErr w:type="spellStart"/>
       <w:r>
         <w:rPr>
           <w:color w:val="000000" w:themeColor="text1"/>
         </w:rPr>
         <w:t>P_Parking</w:t>
       </w:r>
-      <w:proofErr w:type="spellEnd"/>
     </w:p>
     <w:p>
       <w:pPr>
@@ -123,7 +121,13 @@
         <w:jc w:val="center"/>
       </w:pPr>
       <w:r>
-        <w:t>Aurélie Curchaud</w:t>
+        <w:t>Aurélie Curch</w:t>
+      </w:r>
+      <w:r>
+        <w:t>o</w:t>
+      </w:r>
+      <w:r>
+        <w:t>d</w:t>
       </w:r>
     </w:p>
     <w:p>
@@ -2875,9 +2879,9 @@
       <w:pPr>
         <w:pStyle w:val="Titre2"/>
       </w:pPr>
-      <w:bookmarkStart w:id="3" w:name="_Toc532179969"/>
-      <w:bookmarkStart w:id="4" w:name="_Toc165969639"/>
-      <w:bookmarkStart w:id="5" w:name="_Toc239402774"/>
+      <w:bookmarkStart w:id="3" w:name="_Toc239402774"/>
+      <w:bookmarkStart w:id="4" w:name="_Toc532179969"/>
+      <w:bookmarkStart w:id="5" w:name="_Toc165969639"/>
       <w:r>
         <w:t>T</w:t>
       </w:r>
@@ -2887,7 +2891,7 @@
       <w:r>
         <w:t>e</w:t>
       </w:r>
-      <w:bookmarkEnd w:id="5"/>
+      <w:bookmarkEnd w:id="3"/>
     </w:p>
     <w:p>
       <w:pPr>
@@ -3167,8 +3171,8 @@
       <w:r>
         <w:t>Planification</w:t>
       </w:r>
-      <w:bookmarkEnd w:id="3"/>
       <w:bookmarkEnd w:id="4"/>
+      <w:bookmarkEnd w:id="5"/>
       <w:r>
         <w:t xml:space="preserve"> Initiale</w:t>
       </w:r>
@@ -3527,13 +3531,9 @@
       <w:r>
         <w:t>« </w:t>
       </w:r>
-      <w:proofErr w:type="spellStart"/>
-      <w:proofErr w:type="gramStart"/>
       <w:r>
         <w:t>console.writeLine</w:t>
       </w:r>
-      <w:proofErr w:type="spellEnd"/>
-      <w:proofErr w:type="gramEnd"/>
       <w:r>
         <w:t> »</w:t>
       </w:r>
@@ -3870,13 +3870,8 @@
           <w:numId w:val="22"/>
         </w:numPr>
       </w:pPr>
-      <w:proofErr w:type="gramStart"/>
-      <w:r>
-        <w:t>raison</w:t>
-      </w:r>
-      <w:proofErr w:type="gramEnd"/>
-      <w:r>
-        <w:t>, décisions, etc.</w:t>
+      <w:r>
+        <w:t>raison, décisions, etc.</w:t>
       </w:r>
     </w:p>
     <w:p>
@@ -3888,13 +3883,8 @@
         </w:numPr>
       </w:pPr>
       <w:r>
-        <w:t xml:space="preserve">Liste des bugs répertoriés avec la date de découverte et leur </w:t>
-      </w:r>
-      <w:proofErr w:type="gramStart"/>
-      <w:r>
-        <w:t>état:</w:t>
-      </w:r>
-      <w:proofErr w:type="gramEnd"/>
+        <w:t>Liste des bugs répertoriés avec la date de découverte et leur état:</w:t>
+      </w:r>
     </w:p>
     <w:p>
       <w:pPr>
@@ -4010,15 +4000,7 @@
         <w:t xml:space="preserve"> projet.</w:t>
       </w:r>
       <w:r>
-        <w:t xml:space="preserve"> Indiquer </w:t>
-      </w:r>
-      <w:proofErr w:type="gramStart"/>
-      <w:r>
-        <w:t>les différence</w:t>
-      </w:r>
-      <w:proofErr w:type="gramEnd"/>
-      <w:r>
-        <w:t xml:space="preserve"> entre les planifications initiales et détaillées avec le journal de travail.</w:t>
+        <w:t xml:space="preserve"> Indiquer les différence entre les planifications initiales et détaillées avec le journal de travail.</w:t>
       </w:r>
     </w:p>
     <w:p>
@@ -4042,16 +4024,11 @@
         </w:numPr>
       </w:pPr>
       <w:r>
-        <w:t xml:space="preserve">Si c’était à </w:t>
-      </w:r>
-      <w:proofErr w:type="gramStart"/>
-      <w:r>
-        <w:t>refaire</w:t>
+        <w:t>Si c’était à refaire</w:t>
       </w:r>
       <w:r>
         <w:t>:</w:t>
       </w:r>
-      <w:proofErr w:type="gramEnd"/>
     </w:p>
     <w:p>
       <w:pPr>
@@ -4118,13 +4095,8 @@
           <w:numId w:val="24"/>
         </w:numPr>
       </w:pPr>
-      <w:proofErr w:type="gramStart"/>
-      <w:r>
-        <w:t>Suite à</w:t>
-      </w:r>
-      <w:proofErr w:type="gramEnd"/>
-      <w:r>
-        <w:t xml:space="preserve"> donner, améliorations souhaitables, …</w:t>
+      <w:r>
+        <w:t>Suite à donner, améliorations souhaitables, …</w:t>
       </w:r>
     </w:p>
     <w:p>
@@ -4268,13 +4240,8 @@
           <w:numId w:val="25"/>
         </w:numPr>
       </w:pPr>
-      <w:proofErr w:type="gramStart"/>
-      <w:r>
-        <w:t>Listing</w:t>
-      </w:r>
-      <w:proofErr w:type="gramEnd"/>
-      <w:r>
-        <w:t xml:space="preserve"> du code source (partiel ou, plus rarement complet)</w:t>
+      <w:r>
+        <w:t>Listing du code source (partiel ou, plus rarement complet)</w:t>
       </w:r>
     </w:p>
     <w:p>
@@ -4755,21 +4722,12 @@
               <w:szCs w:val="16"/>
             </w:rPr>
           </w:pPr>
-          <w:proofErr w:type="gramStart"/>
           <w:r>
             <w:rPr>
               <w:rFonts w:cs="Arial"/>
               <w:szCs w:val="16"/>
             </w:rPr>
-            <w:t>Version:</w:t>
-          </w:r>
-          <w:proofErr w:type="gramEnd"/>
-          <w:r>
-            <w:rPr>
-              <w:rFonts w:cs="Arial"/>
-              <w:szCs w:val="16"/>
-            </w:rPr>
-            <w:t xml:space="preserve"> </w:t>
+            <w:t xml:space="preserve">Version: </w:t>
           </w:r>
           <w:fldSimple w:instr=" REVNUM   \* MERGEFORMAT ">
             <w:r>
@@ -4815,7 +4773,7 @@
               <w:noProof/>
               <w:szCs w:val="16"/>
             </w:rPr>
-            <w:t>28.08.2026 12:49</w:t>
+            <w:t>04.09.2026 08:34</w:t>
           </w:r>
           <w:r>
             <w:rPr>
@@ -9262,6 +9220,7 @@
   <w:style w:type="character" w:default="1" w:styleId="Policepardfaut">
     <w:name w:val="Default Paragraph Font"/>
     <w:uiPriority w:val="1"/>
+    <w:semiHidden/>
     <w:unhideWhenUsed/>
   </w:style>
   <w:style w:type="table" w:default="1" w:styleId="TableauNormal">
@@ -10093,6 +10052,12 @@
 </file>
 
 <file path=customXml/item1.xml><?xml version="1.0" encoding="utf-8"?>
+<p:properties xmlns:p="http://schemas.microsoft.com/office/2006/metadata/properties" xmlns:xsi="http://www.w3.org/2001/XMLSchema-instance" xmlns:pc="http://schemas.microsoft.com/office/infopath/2007/PartnerControls">
+  <documentManagement/>
+</p:properties>
+</file>
+
+<file path=customXml/item2.xml><?xml version="1.0" encoding="utf-8"?>
 <ct:contentTypeSchema xmlns:ct="http://schemas.microsoft.com/office/2006/metadata/contentType" xmlns:ma="http://schemas.microsoft.com/office/2006/metadata/properties/metaAttributes" ct:_="" ma:_="" ma:contentTypeName="Document" ma:contentTypeID="0x010100FBB99F57F4D89D439F52EDCD0CED316B" ma:contentTypeVersion="7" ma:contentTypeDescription="Crée un document." ma:contentTypeScope="" ma:versionID="7f146099027e1b74c82fbe61e090590b">
   <xsd:schema xmlns:xsd="http://www.w3.org/2001/XMLSchema" xmlns:xs="http://www.w3.org/2001/XMLSchema" xmlns:p="http://schemas.microsoft.com/office/2006/metadata/properties" xmlns:ns2="6b19550a-bdc3-4796-8096-c6911560d534" targetNamespace="http://schemas.microsoft.com/office/2006/metadata/properties" ma:root="true" ma:fieldsID="7044bf5f632aa66a3f32a70d04b92caa" ns2:_="">
     <xsd:import namespace="6b19550a-bdc3-4796-8096-c6911560d534"/>
@@ -10254,17 +10219,7 @@
 </ct:contentTypeSchema>
 </file>
 
-<file path=customXml/item2.xml><?xml version="1.0" encoding="utf-8"?>
-<p:properties xmlns:p="http://schemas.microsoft.com/office/2006/metadata/properties" xmlns:xsi="http://www.w3.org/2001/XMLSchema-instance" xmlns:pc="http://schemas.microsoft.com/office/infopath/2007/PartnerControls">
-  <documentManagement/>
-</p:properties>
-</file>
-
 <file path=customXml/item3.xml><?xml version="1.0" encoding="utf-8"?>
-<b:Sources xmlns:b="http://schemas.openxmlformats.org/officeDocument/2006/bibliography" xmlns="http://schemas.openxmlformats.org/officeDocument/2006/bibliography" SelectedStyle="\APA.XSL" StyleName="APA"/>
-</file>
-
-<file path=customXml/item4.xml><?xml version="1.0" encoding="utf-8"?>
 <?mso-contentType ?>
 <FormTemplates xmlns="http://schemas.microsoft.com/sharepoint/v3/contenttype/forms">
   <Display>DocumentLibraryForm</Display>
@@ -10273,7 +10228,20 @@
 </FormTemplates>
 </file>
 
+<file path=customXml/item4.xml><?xml version="1.0" encoding="utf-8"?>
+<b:Sources xmlns:b="http://schemas.openxmlformats.org/officeDocument/2006/bibliography" xmlns="http://schemas.openxmlformats.org/officeDocument/2006/bibliography" SelectedStyle="\APA.XSL" StyleName="APA"/>
+</file>
+
 <file path=customXml/itemProps1.xml><?xml version="1.0" encoding="utf-8"?>
+<ds:datastoreItem xmlns:ds="http://schemas.openxmlformats.org/officeDocument/2006/customXml" ds:itemID="{2319CDB8-A2CD-412D-8359-13E6B4DF1FF4}">
+  <ds:schemaRefs>
+    <ds:schemaRef ds:uri="http://schemas.microsoft.com/office/2006/metadata/properties"/>
+    <ds:schemaRef ds:uri="http://schemas.microsoft.com/office/infopath/2007/PartnerControls"/>
+  </ds:schemaRefs>
+</ds:datastoreItem>
+</file>
+
+<file path=customXml/itemProps2.xml><?xml version="1.0" encoding="utf-8"?>
 <ds:datastoreItem xmlns:ds="http://schemas.openxmlformats.org/officeDocument/2006/customXml" ds:itemID="{75ED066B-A5C4-4F00-9682-79C6BF6A6E3B}">
   <ds:schemaRefs>
     <ds:schemaRef ds:uri="http://schemas.microsoft.com/office/2006/metadata/contentType"/>
@@ -10291,27 +10259,18 @@
 </ds:datastoreItem>
 </file>
 
-<file path=customXml/itemProps2.xml><?xml version="1.0" encoding="utf-8"?>
-<ds:datastoreItem xmlns:ds="http://schemas.openxmlformats.org/officeDocument/2006/customXml" ds:itemID="{2319CDB8-A2CD-412D-8359-13E6B4DF1FF4}">
+<file path=customXml/itemProps3.xml><?xml version="1.0" encoding="utf-8"?>
+<ds:datastoreItem xmlns:ds="http://schemas.openxmlformats.org/officeDocument/2006/customXml" ds:itemID="{6C3F7A66-EDE3-46FD-83EB-3C265E5D2669}">
   <ds:schemaRefs>
-    <ds:schemaRef ds:uri="http://schemas.microsoft.com/office/2006/metadata/properties"/>
-    <ds:schemaRef ds:uri="http://schemas.microsoft.com/office/infopath/2007/PartnerControls"/>
+    <ds:schemaRef ds:uri="http://schemas.microsoft.com/sharepoint/v3/contenttype/forms"/>
   </ds:schemaRefs>
 </ds:datastoreItem>
 </file>
 
-<file path=customXml/itemProps3.xml><?xml version="1.0" encoding="utf-8"?>
+<file path=customXml/itemProps4.xml><?xml version="1.0" encoding="utf-8"?>
 <ds:datastoreItem xmlns:ds="http://schemas.openxmlformats.org/officeDocument/2006/customXml" ds:itemID="{C8C35155-3E6A-4058-B6E4-303717845E3B}">
   <ds:schemaRefs>
     <ds:schemaRef ds:uri="http://schemas.openxmlformats.org/officeDocument/2006/bibliography"/>
   </ds:schemaRefs>
 </ds:datastoreItem>
-</file>
-
-<file path=customXml/itemProps4.xml><?xml version="1.0" encoding="utf-8"?>
-<ds:datastoreItem xmlns:ds="http://schemas.openxmlformats.org/officeDocument/2006/customXml" ds:itemID="{6C3F7A66-EDE3-46FD-83EB-3C265E5D2669}">
-  <ds:schemaRefs>
-    <ds:schemaRef ds:uri="http://schemas.microsoft.com/sharepoint/v3/contenttype/forms"/>
-  </ds:schemaRefs>
-</ds:datastoreItem>
 </file>
</xml_diff>

<commit_message>
Doc(Word) : J'ai fini de remplire mon word. En faisant les derniers chapitres (Conception, Utilisation de l'IA, Bilan déroulement, Bilan produit, Conclusion)
</commit_message>
<xml_diff>
--- a/fichiers/R-P_Parking-HugoSchweizer.docx
+++ b/fichiers/R-P_Parking-HugoSchweizer.docx
@@ -4,7 +4,7 @@
   <w:body>
     <w:p>
       <w:pPr>
-        <w:pStyle w:val="Title"/>
+        <w:pStyle w:val="Titre"/>
         <w:rPr>
           <w:color w:val="000000" w:themeColor="text1"/>
         </w:rPr>
@@ -134,7 +134,7 @@
     </w:p>
     <w:p>
       <w:pPr>
-        <w:pStyle w:val="Title"/>
+        <w:pStyle w:val="Titre"/>
       </w:pPr>
       <w:r>
         <w:br w:type="page"/>
@@ -146,7 +146,7 @@
     </w:p>
     <w:p>
       <w:pPr>
-        <w:pStyle w:val="TOC1"/>
+        <w:pStyle w:val="TM10"/>
         <w:tabs>
           <w:tab w:val="left" w:pos="400"/>
           <w:tab w:val="right" w:leader="dot" w:pos="9060"/>
@@ -196,10 +196,10 @@
         </w:rPr>
         <w:fldChar w:fldCharType="separate"/>
       </w:r>
-      <w:hyperlink w:anchor="_Toc242002472" w:history="1">
-        <w:r>
-          <w:rPr>
-            <w:rStyle w:val="Hyperlink"/>
+      <w:hyperlink w:anchor="_Toc242089333" w:history="1">
+        <w:r>
+          <w:rPr>
+            <w:rStyle w:val="Lienhypertexte"/>
             <w:noProof/>
           </w:rPr>
           <w:t>1</w:t>
@@ -220,7 +220,7 @@
         </w:r>
         <w:r>
           <w:rPr>
-            <w:rStyle w:val="Hyperlink"/>
+            <w:rStyle w:val="Lienhypertexte"/>
             <w:noProof/>
           </w:rPr>
           <w:t>Spécifications</w:t>
@@ -244,7 +244,7 @@
             <w:noProof/>
             <w:webHidden/>
           </w:rPr>
-          <w:instrText xml:space="preserve"> PAGEREF _Toc242002472 \h </w:instrText>
+          <w:instrText xml:space="preserve"> PAGEREF _Toc242089333 \h </w:instrText>
         </w:r>
         <w:r>
           <w:rPr>
@@ -277,7 +277,7 @@
     </w:p>
     <w:p>
       <w:pPr>
-        <w:pStyle w:val="TOC2"/>
+        <w:pStyle w:val="TM2"/>
         <w:tabs>
           <w:tab w:val="left" w:pos="800"/>
           <w:tab w:val="right" w:leader="dot" w:pos="9060"/>
@@ -292,10 +292,10 @@
           <w14:ligatures w14:val="standardContextual"/>
         </w:rPr>
       </w:pPr>
-      <w:hyperlink w:anchor="_Toc242002473" w:history="1">
-        <w:r>
-          <w:rPr>
-            <w:rStyle w:val="Hyperlink"/>
+      <w:hyperlink w:anchor="_Toc242089334" w:history="1">
+        <w:r>
+          <w:rPr>
+            <w:rStyle w:val="Lienhypertexte"/>
             <w:noProof/>
           </w:rPr>
           <w:t>1.1</w:t>
@@ -314,7 +314,7 @@
         </w:r>
         <w:r>
           <w:rPr>
-            <w:rStyle w:val="Hyperlink"/>
+            <w:rStyle w:val="Lienhypertexte"/>
             <w:noProof/>
           </w:rPr>
           <w:t>Titre</w:t>
@@ -338,7 +338,7 @@
             <w:noProof/>
             <w:webHidden/>
           </w:rPr>
-          <w:instrText xml:space="preserve"> PAGEREF _Toc242002473 \h </w:instrText>
+          <w:instrText xml:space="preserve"> PAGEREF _Toc242089334 \h </w:instrText>
         </w:r>
         <w:r>
           <w:rPr>
@@ -371,7 +371,7 @@
     </w:p>
     <w:p>
       <w:pPr>
-        <w:pStyle w:val="TOC2"/>
+        <w:pStyle w:val="TM2"/>
         <w:tabs>
           <w:tab w:val="left" w:pos="800"/>
           <w:tab w:val="right" w:leader="dot" w:pos="9060"/>
@@ -386,10 +386,10 @@
           <w14:ligatures w14:val="standardContextual"/>
         </w:rPr>
       </w:pPr>
-      <w:hyperlink w:anchor="_Toc242002474" w:history="1">
-        <w:r>
-          <w:rPr>
-            <w:rStyle w:val="Hyperlink"/>
+      <w:hyperlink w:anchor="_Toc242089335" w:history="1">
+        <w:r>
+          <w:rPr>
+            <w:rStyle w:val="Lienhypertexte"/>
             <w:noProof/>
           </w:rPr>
           <w:t>1.2</w:t>
@@ -408,7 +408,7 @@
         </w:r>
         <w:r>
           <w:rPr>
-            <w:rStyle w:val="Hyperlink"/>
+            <w:rStyle w:val="Lienhypertexte"/>
             <w:noProof/>
           </w:rPr>
           <w:t>Description</w:t>
@@ -432,7 +432,7 @@
             <w:noProof/>
             <w:webHidden/>
           </w:rPr>
-          <w:instrText xml:space="preserve"> PAGEREF _Toc242002474 \h </w:instrText>
+          <w:instrText xml:space="preserve"> PAGEREF _Toc242089335 \h </w:instrText>
         </w:r>
         <w:r>
           <w:rPr>
@@ -465,7 +465,7 @@
     </w:p>
     <w:p>
       <w:pPr>
-        <w:pStyle w:val="TOC2"/>
+        <w:pStyle w:val="TM2"/>
         <w:tabs>
           <w:tab w:val="left" w:pos="800"/>
           <w:tab w:val="right" w:leader="dot" w:pos="9060"/>
@@ -480,10 +480,10 @@
           <w14:ligatures w14:val="standardContextual"/>
         </w:rPr>
       </w:pPr>
-      <w:hyperlink w:anchor="_Toc242002475" w:history="1">
-        <w:r>
-          <w:rPr>
-            <w:rStyle w:val="Hyperlink"/>
+      <w:hyperlink w:anchor="_Toc242089336" w:history="1">
+        <w:r>
+          <w:rPr>
+            <w:rStyle w:val="Lienhypertexte"/>
             <w:noProof/>
           </w:rPr>
           <w:t>1.3</w:t>
@@ -502,7 +502,7 @@
         </w:r>
         <w:r>
           <w:rPr>
-            <w:rStyle w:val="Hyperlink"/>
+            <w:rStyle w:val="Lienhypertexte"/>
             <w:noProof/>
           </w:rPr>
           <w:t>Matériel et logiciels à disposition</w:t>
@@ -526,7 +526,7 @@
             <w:noProof/>
             <w:webHidden/>
           </w:rPr>
-          <w:instrText xml:space="preserve"> PAGEREF _Toc242002475 \h </w:instrText>
+          <w:instrText xml:space="preserve"> PAGEREF _Toc242089336 \h </w:instrText>
         </w:r>
         <w:r>
           <w:rPr>
@@ -559,7 +559,7 @@
     </w:p>
     <w:p>
       <w:pPr>
-        <w:pStyle w:val="TOC2"/>
+        <w:pStyle w:val="TM2"/>
         <w:tabs>
           <w:tab w:val="left" w:pos="800"/>
           <w:tab w:val="right" w:leader="dot" w:pos="9060"/>
@@ -574,10 +574,10 @@
           <w14:ligatures w14:val="standardContextual"/>
         </w:rPr>
       </w:pPr>
-      <w:hyperlink w:anchor="_Toc242002476" w:history="1">
-        <w:r>
-          <w:rPr>
-            <w:rStyle w:val="Hyperlink"/>
+      <w:hyperlink w:anchor="_Toc242089337" w:history="1">
+        <w:r>
+          <w:rPr>
+            <w:rStyle w:val="Lienhypertexte"/>
             <w:noProof/>
           </w:rPr>
           <w:t>1.4</w:t>
@@ -596,7 +596,7 @@
         </w:r>
         <w:r>
           <w:rPr>
-            <w:rStyle w:val="Hyperlink"/>
+            <w:rStyle w:val="Lienhypertexte"/>
             <w:noProof/>
           </w:rPr>
           <w:t>Prérequis</w:t>
@@ -620,7 +620,7 @@
             <w:noProof/>
             <w:webHidden/>
           </w:rPr>
-          <w:instrText xml:space="preserve"> PAGEREF _Toc242002476 \h </w:instrText>
+          <w:instrText xml:space="preserve"> PAGEREF _Toc242089337 \h </w:instrText>
         </w:r>
         <w:r>
           <w:rPr>
@@ -653,7 +653,7 @@
     </w:p>
     <w:p>
       <w:pPr>
-        <w:pStyle w:val="TOC2"/>
+        <w:pStyle w:val="TM2"/>
         <w:tabs>
           <w:tab w:val="left" w:pos="800"/>
           <w:tab w:val="right" w:leader="dot" w:pos="9060"/>
@@ -668,10 +668,10 @@
           <w14:ligatures w14:val="standardContextual"/>
         </w:rPr>
       </w:pPr>
-      <w:hyperlink w:anchor="_Toc242002477" w:history="1">
-        <w:r>
-          <w:rPr>
-            <w:rStyle w:val="Hyperlink"/>
+      <w:hyperlink w:anchor="_Toc242089338" w:history="1">
+        <w:r>
+          <w:rPr>
+            <w:rStyle w:val="Lienhypertexte"/>
             <w:noProof/>
           </w:rPr>
           <w:t>1.5</w:t>
@@ -690,7 +690,7 @@
         </w:r>
         <w:r>
           <w:rPr>
-            <w:rStyle w:val="Hyperlink"/>
+            <w:rStyle w:val="Lienhypertexte"/>
             <w:noProof/>
           </w:rPr>
           <w:t>Cahier des charges</w:t>
@@ -714,7 +714,7 @@
             <w:noProof/>
             <w:webHidden/>
           </w:rPr>
-          <w:instrText xml:space="preserve"> PAGEREF _Toc242002477 \h </w:instrText>
+          <w:instrText xml:space="preserve"> PAGEREF _Toc242089338 \h </w:instrText>
         </w:r>
         <w:r>
           <w:rPr>
@@ -747,7 +747,7 @@
     </w:p>
     <w:p>
       <w:pPr>
-        <w:pStyle w:val="TOC2"/>
+        <w:pStyle w:val="TM2"/>
         <w:tabs>
           <w:tab w:val="left" w:pos="800"/>
           <w:tab w:val="right" w:leader="dot" w:pos="9060"/>
@@ -762,10 +762,10 @@
           <w14:ligatures w14:val="standardContextual"/>
         </w:rPr>
       </w:pPr>
-      <w:hyperlink w:anchor="_Toc242002478" w:history="1">
-        <w:r>
-          <w:rPr>
-            <w:rStyle w:val="Hyperlink"/>
+      <w:hyperlink w:anchor="_Toc242089339" w:history="1">
+        <w:r>
+          <w:rPr>
+            <w:rStyle w:val="Lienhypertexte"/>
             <w:noProof/>
           </w:rPr>
           <w:t>1.6</w:t>
@@ -784,7 +784,7 @@
         </w:r>
         <w:r>
           <w:rPr>
-            <w:rStyle w:val="Hyperlink"/>
+            <w:rStyle w:val="Lienhypertexte"/>
             <w:noProof/>
           </w:rPr>
           <w:t>Les points suivants seront évalués</w:t>
@@ -808,7 +808,7 @@
             <w:noProof/>
             <w:webHidden/>
           </w:rPr>
-          <w:instrText xml:space="preserve"> PAGEREF _Toc242002478 \h </w:instrText>
+          <w:instrText xml:space="preserve"> PAGEREF _Toc242089339 \h </w:instrText>
         </w:r>
         <w:r>
           <w:rPr>
@@ -841,7 +841,7 @@
     </w:p>
     <w:p>
       <w:pPr>
-        <w:pStyle w:val="TOC2"/>
+        <w:pStyle w:val="TM2"/>
         <w:tabs>
           <w:tab w:val="left" w:pos="800"/>
           <w:tab w:val="right" w:leader="dot" w:pos="9060"/>
@@ -856,10 +856,10 @@
           <w14:ligatures w14:val="standardContextual"/>
         </w:rPr>
       </w:pPr>
-      <w:hyperlink w:anchor="_Toc242002479" w:history="1">
-        <w:r>
-          <w:rPr>
-            <w:rStyle w:val="Hyperlink"/>
+      <w:hyperlink w:anchor="_Toc242089340" w:history="1">
+        <w:r>
+          <w:rPr>
+            <w:rStyle w:val="Lienhypertexte"/>
             <w:noProof/>
           </w:rPr>
           <w:t>1.7</w:t>
@@ -878,7 +878,7 @@
         </w:r>
         <w:r>
           <w:rPr>
-            <w:rStyle w:val="Hyperlink"/>
+            <w:rStyle w:val="Lienhypertexte"/>
             <w:noProof/>
           </w:rPr>
           <w:t>Validation et conditions de réussite</w:t>
@@ -902,7 +902,7 @@
             <w:noProof/>
             <w:webHidden/>
           </w:rPr>
-          <w:instrText xml:space="preserve"> PAGEREF _Toc242002479 \h </w:instrText>
+          <w:instrText xml:space="preserve"> PAGEREF _Toc242089340 \h </w:instrText>
         </w:r>
         <w:r>
           <w:rPr>
@@ -935,7 +935,7 @@
     </w:p>
     <w:p>
       <w:pPr>
-        <w:pStyle w:val="TOC1"/>
+        <w:pStyle w:val="TM10"/>
         <w:tabs>
           <w:tab w:val="left" w:pos="400"/>
           <w:tab w:val="right" w:leader="dot" w:pos="9060"/>
@@ -952,10 +952,10 @@
           <w14:ligatures w14:val="standardContextual"/>
         </w:rPr>
       </w:pPr>
-      <w:hyperlink w:anchor="_Toc242002480" w:history="1">
-        <w:r>
-          <w:rPr>
-            <w:rStyle w:val="Hyperlink"/>
+      <w:hyperlink w:anchor="_Toc242089341" w:history="1">
+        <w:r>
+          <w:rPr>
+            <w:rStyle w:val="Lienhypertexte"/>
             <w:noProof/>
           </w:rPr>
           <w:t>2</w:t>
@@ -976,7 +976,7 @@
         </w:r>
         <w:r>
           <w:rPr>
-            <w:rStyle w:val="Hyperlink"/>
+            <w:rStyle w:val="Lienhypertexte"/>
             <w:noProof/>
           </w:rPr>
           <w:t>Planification Initiale</w:t>
@@ -1000,7 +1000,7 @@
             <w:noProof/>
             <w:webHidden/>
           </w:rPr>
-          <w:instrText xml:space="preserve"> PAGEREF _Toc242002480 \h </w:instrText>
+          <w:instrText xml:space="preserve"> PAGEREF _Toc242089341 \h </w:instrText>
         </w:r>
         <w:r>
           <w:rPr>
@@ -1033,7 +1033,7 @@
     </w:p>
     <w:p>
       <w:pPr>
-        <w:pStyle w:val="TOC1"/>
+        <w:pStyle w:val="TM10"/>
         <w:tabs>
           <w:tab w:val="left" w:pos="400"/>
           <w:tab w:val="right" w:leader="dot" w:pos="9060"/>
@@ -1050,10 +1050,10 @@
           <w14:ligatures w14:val="standardContextual"/>
         </w:rPr>
       </w:pPr>
-      <w:hyperlink w:anchor="_Toc242002481" w:history="1">
-        <w:r>
-          <w:rPr>
-            <w:rStyle w:val="Hyperlink"/>
+      <w:hyperlink w:anchor="_Toc242089342" w:history="1">
+        <w:r>
+          <w:rPr>
+            <w:rStyle w:val="Lienhypertexte"/>
             <w:noProof/>
           </w:rPr>
           <w:t>3</w:t>
@@ -1074,7 +1074,7 @@
         </w:r>
         <w:r>
           <w:rPr>
-            <w:rStyle w:val="Hyperlink"/>
+            <w:rStyle w:val="Lienhypertexte"/>
             <w:noProof/>
           </w:rPr>
           <w:t>Analyse</w:t>
@@ -1098,7 +1098,7 @@
             <w:noProof/>
             <w:webHidden/>
           </w:rPr>
-          <w:instrText xml:space="preserve"> PAGEREF _Toc242002481 \h </w:instrText>
+          <w:instrText xml:space="preserve"> PAGEREF _Toc242089342 \h </w:instrText>
         </w:r>
         <w:r>
           <w:rPr>
@@ -1131,7 +1131,7 @@
     </w:p>
     <w:p>
       <w:pPr>
-        <w:pStyle w:val="TOC2"/>
+        <w:pStyle w:val="TM2"/>
         <w:tabs>
           <w:tab w:val="left" w:pos="800"/>
           <w:tab w:val="right" w:leader="dot" w:pos="9060"/>
@@ -1146,10 +1146,10 @@
           <w14:ligatures w14:val="standardContextual"/>
         </w:rPr>
       </w:pPr>
-      <w:hyperlink w:anchor="_Toc242002482" w:history="1">
-        <w:r>
-          <w:rPr>
-            <w:rStyle w:val="Hyperlink"/>
+      <w:hyperlink w:anchor="_Toc242089343" w:history="1">
+        <w:r>
+          <w:rPr>
+            <w:rStyle w:val="Lienhypertexte"/>
             <w:noProof/>
           </w:rPr>
           <w:t>3.1</w:t>
@@ -1168,7 +1168,7 @@
         </w:r>
         <w:r>
           <w:rPr>
-            <w:rStyle w:val="Hyperlink"/>
+            <w:rStyle w:val="Lienhypertexte"/>
             <w:noProof/>
           </w:rPr>
           <w:t>Opportunités</w:t>
@@ -1192,7 +1192,7 @@
             <w:noProof/>
             <w:webHidden/>
           </w:rPr>
-          <w:instrText xml:space="preserve"> PAGEREF _Toc242002482 \h </w:instrText>
+          <w:instrText xml:space="preserve"> PAGEREF _Toc242089343 \h </w:instrText>
         </w:r>
         <w:r>
           <w:rPr>
@@ -1225,7 +1225,7 @@
     </w:p>
     <w:p>
       <w:pPr>
-        <w:pStyle w:val="TOC2"/>
+        <w:pStyle w:val="TM2"/>
         <w:tabs>
           <w:tab w:val="left" w:pos="800"/>
           <w:tab w:val="right" w:leader="dot" w:pos="9060"/>
@@ -1240,10 +1240,10 @@
           <w14:ligatures w14:val="standardContextual"/>
         </w:rPr>
       </w:pPr>
-      <w:hyperlink w:anchor="_Toc242002483" w:history="1">
-        <w:r>
-          <w:rPr>
-            <w:rStyle w:val="Hyperlink"/>
+      <w:hyperlink w:anchor="_Toc242089344" w:history="1">
+        <w:r>
+          <w:rPr>
+            <w:rStyle w:val="Lienhypertexte"/>
             <w:noProof/>
           </w:rPr>
           <w:t>3.2</w:t>
@@ -1262,7 +1262,7 @@
         </w:r>
         <w:r>
           <w:rPr>
-            <w:rStyle w:val="Hyperlink"/>
+            <w:rStyle w:val="Lienhypertexte"/>
             <w:noProof/>
           </w:rPr>
           <w:t>Document d’analyse et conception</w:t>
@@ -1286,7 +1286,7 @@
             <w:noProof/>
             <w:webHidden/>
           </w:rPr>
-          <w:instrText xml:space="preserve"> PAGEREF _Toc242002483 \h </w:instrText>
+          <w:instrText xml:space="preserve"> PAGEREF _Toc242089344 \h </w:instrText>
         </w:r>
         <w:r>
           <w:rPr>
@@ -1319,7 +1319,7 @@
     </w:p>
     <w:p>
       <w:pPr>
-        <w:pStyle w:val="TOC2"/>
+        <w:pStyle w:val="TM2"/>
         <w:tabs>
           <w:tab w:val="left" w:pos="800"/>
           <w:tab w:val="right" w:leader="dot" w:pos="9060"/>
@@ -1334,10 +1334,10 @@
           <w14:ligatures w14:val="standardContextual"/>
         </w:rPr>
       </w:pPr>
-      <w:hyperlink w:anchor="_Toc242002484" w:history="1">
-        <w:r>
-          <w:rPr>
-            <w:rStyle w:val="Hyperlink"/>
+      <w:hyperlink w:anchor="_Toc242089345" w:history="1">
+        <w:r>
+          <w:rPr>
+            <w:rStyle w:val="Lienhypertexte"/>
             <w:noProof/>
           </w:rPr>
           <w:t>3.3</w:t>
@@ -1356,7 +1356,7 @@
         </w:r>
         <w:r>
           <w:rPr>
-            <w:rStyle w:val="Hyperlink"/>
+            <w:rStyle w:val="Lienhypertexte"/>
             <w:noProof/>
           </w:rPr>
           <w:t>Conception des tests</w:t>
@@ -1380,7 +1380,7 @@
             <w:noProof/>
             <w:webHidden/>
           </w:rPr>
-          <w:instrText xml:space="preserve"> PAGEREF _Toc242002484 \h </w:instrText>
+          <w:instrText xml:space="preserve"> PAGEREF _Toc242089345 \h </w:instrText>
         </w:r>
         <w:r>
           <w:rPr>
@@ -1413,7 +1413,7 @@
     </w:p>
     <w:p>
       <w:pPr>
-        <w:pStyle w:val="TOC1"/>
+        <w:pStyle w:val="TM10"/>
         <w:tabs>
           <w:tab w:val="left" w:pos="400"/>
           <w:tab w:val="right" w:leader="dot" w:pos="9060"/>
@@ -1430,10 +1430,10 @@
           <w14:ligatures w14:val="standardContextual"/>
         </w:rPr>
       </w:pPr>
-      <w:hyperlink w:anchor="_Toc242002485" w:history="1">
-        <w:r>
-          <w:rPr>
-            <w:rStyle w:val="Hyperlink"/>
+      <w:hyperlink w:anchor="_Toc242089346" w:history="1">
+        <w:r>
+          <w:rPr>
+            <w:rStyle w:val="Lienhypertexte"/>
             <w:noProof/>
           </w:rPr>
           <w:t>4</w:t>
@@ -1454,7 +1454,7 @@
         </w:r>
         <w:r>
           <w:rPr>
-            <w:rStyle w:val="Hyperlink"/>
+            <w:rStyle w:val="Lienhypertexte"/>
             <w:noProof/>
           </w:rPr>
           <w:t>Réalisation</w:t>
@@ -1478,7 +1478,7 @@
             <w:noProof/>
             <w:webHidden/>
           </w:rPr>
-          <w:instrText xml:space="preserve"> PAGEREF _Toc242002485 \h </w:instrText>
+          <w:instrText xml:space="preserve"> PAGEREF _Toc242089346 \h </w:instrText>
         </w:r>
         <w:r>
           <w:rPr>
@@ -1511,7 +1511,7 @@
     </w:p>
     <w:p>
       <w:pPr>
-        <w:pStyle w:val="TOC2"/>
+        <w:pStyle w:val="TM2"/>
         <w:tabs>
           <w:tab w:val="left" w:pos="800"/>
           <w:tab w:val="right" w:leader="dot" w:pos="9060"/>
@@ -1526,10 +1526,10 @@
           <w14:ligatures w14:val="standardContextual"/>
         </w:rPr>
       </w:pPr>
-      <w:hyperlink w:anchor="_Toc242002486" w:history="1">
-        <w:r>
-          <w:rPr>
-            <w:rStyle w:val="Hyperlink"/>
+      <w:hyperlink w:anchor="_Toc242089347" w:history="1">
+        <w:r>
+          <w:rPr>
+            <w:rStyle w:val="Lienhypertexte"/>
             <w:noProof/>
           </w:rPr>
           <w:t>4.1</w:t>
@@ -1548,7 +1548,7 @@
         </w:r>
         <w:r>
           <w:rPr>
-            <w:rStyle w:val="Hyperlink"/>
+            <w:rStyle w:val="Lienhypertexte"/>
             <w:noProof/>
           </w:rPr>
           <w:t>Dossier de Réalisation</w:t>
@@ -1572,7 +1572,7 @@
             <w:noProof/>
             <w:webHidden/>
           </w:rPr>
-          <w:instrText xml:space="preserve"> PAGEREF _Toc242002486 \h </w:instrText>
+          <w:instrText xml:space="preserve"> PAGEREF _Toc242089347 \h </w:instrText>
         </w:r>
         <w:r>
           <w:rPr>
@@ -1605,7 +1605,7 @@
     </w:p>
     <w:p>
       <w:pPr>
-        <w:pStyle w:val="TOC2"/>
+        <w:pStyle w:val="TM2"/>
         <w:tabs>
           <w:tab w:val="left" w:pos="800"/>
           <w:tab w:val="right" w:leader="dot" w:pos="9060"/>
@@ -1620,10 +1620,10 @@
           <w14:ligatures w14:val="standardContextual"/>
         </w:rPr>
       </w:pPr>
-      <w:hyperlink w:anchor="_Toc242002487" w:history="1">
-        <w:r>
-          <w:rPr>
-            <w:rStyle w:val="Hyperlink"/>
+      <w:hyperlink w:anchor="_Toc242089348" w:history="1">
+        <w:r>
+          <w:rPr>
+            <w:rStyle w:val="Lienhypertexte"/>
             <w:noProof/>
           </w:rPr>
           <w:t>4.2</w:t>
@@ -1642,7 +1642,7 @@
         </w:r>
         <w:r>
           <w:rPr>
-            <w:rStyle w:val="Hyperlink"/>
+            <w:rStyle w:val="Lienhypertexte"/>
             <w:noProof/>
           </w:rPr>
           <w:t>Modifications</w:t>
@@ -1666,7 +1666,7 @@
             <w:noProof/>
             <w:webHidden/>
           </w:rPr>
-          <w:instrText xml:space="preserve"> PAGEREF _Toc242002487 \h </w:instrText>
+          <w:instrText xml:space="preserve"> PAGEREF _Toc242089348 \h </w:instrText>
         </w:r>
         <w:r>
           <w:rPr>
@@ -1699,7 +1699,7 @@
     </w:p>
     <w:p>
       <w:pPr>
-        <w:pStyle w:val="TOC1"/>
+        <w:pStyle w:val="TM10"/>
         <w:tabs>
           <w:tab w:val="left" w:pos="400"/>
           <w:tab w:val="right" w:leader="dot" w:pos="9060"/>
@@ -1716,10 +1716,10 @@
           <w14:ligatures w14:val="standardContextual"/>
         </w:rPr>
       </w:pPr>
-      <w:hyperlink w:anchor="_Toc242002488" w:history="1">
-        <w:r>
-          <w:rPr>
-            <w:rStyle w:val="Hyperlink"/>
+      <w:hyperlink w:anchor="_Toc242089349" w:history="1">
+        <w:r>
+          <w:rPr>
+            <w:rStyle w:val="Lienhypertexte"/>
             <w:noProof/>
           </w:rPr>
           <w:t>5</w:t>
@@ -1740,7 +1740,7 @@
         </w:r>
         <w:r>
           <w:rPr>
-            <w:rStyle w:val="Hyperlink"/>
+            <w:rStyle w:val="Lienhypertexte"/>
             <w:noProof/>
           </w:rPr>
           <w:t>Tests</w:t>
@@ -1764,7 +1764,7 @@
             <w:noProof/>
             <w:webHidden/>
           </w:rPr>
-          <w:instrText xml:space="preserve"> PAGEREF _Toc242002488 \h </w:instrText>
+          <w:instrText xml:space="preserve"> PAGEREF _Toc242089349 \h </w:instrText>
         </w:r>
         <w:r>
           <w:rPr>
@@ -1797,7 +1797,7 @@
     </w:p>
     <w:p>
       <w:pPr>
-        <w:pStyle w:val="TOC2"/>
+        <w:pStyle w:val="TM2"/>
         <w:tabs>
           <w:tab w:val="left" w:pos="800"/>
           <w:tab w:val="right" w:leader="dot" w:pos="9060"/>
@@ -1812,10 +1812,10 @@
           <w14:ligatures w14:val="standardContextual"/>
         </w:rPr>
       </w:pPr>
-      <w:hyperlink w:anchor="_Toc242002489" w:history="1">
-        <w:r>
-          <w:rPr>
-            <w:rStyle w:val="Hyperlink"/>
+      <w:hyperlink w:anchor="_Toc242089350" w:history="1">
+        <w:r>
+          <w:rPr>
+            <w:rStyle w:val="Lienhypertexte"/>
             <w:noProof/>
           </w:rPr>
           <w:t>5.1</w:t>
@@ -1834,7 +1834,7 @@
         </w:r>
         <w:r>
           <w:rPr>
-            <w:rStyle w:val="Hyperlink"/>
+            <w:rStyle w:val="Lienhypertexte"/>
             <w:noProof/>
           </w:rPr>
           <w:t>Dossier des tests</w:t>
@@ -1858,7 +1858,7 @@
             <w:noProof/>
             <w:webHidden/>
           </w:rPr>
-          <w:instrText xml:space="preserve"> PAGEREF _Toc242002489 \h </w:instrText>
+          <w:instrText xml:space="preserve"> PAGEREF _Toc242089350 \h </w:instrText>
         </w:r>
         <w:r>
           <w:rPr>
@@ -1891,7 +1891,7 @@
     </w:p>
     <w:p>
       <w:pPr>
-        <w:pStyle w:val="TOC1"/>
+        <w:pStyle w:val="TM10"/>
         <w:tabs>
           <w:tab w:val="left" w:pos="400"/>
           <w:tab w:val="right" w:leader="dot" w:pos="9060"/>
@@ -1908,10 +1908,10 @@
           <w14:ligatures w14:val="standardContextual"/>
         </w:rPr>
       </w:pPr>
-      <w:hyperlink w:anchor="_Toc242002490" w:history="1">
-        <w:r>
-          <w:rPr>
-            <w:rStyle w:val="Hyperlink"/>
+      <w:hyperlink w:anchor="_Toc242089351" w:history="1">
+        <w:r>
+          <w:rPr>
+            <w:rStyle w:val="Lienhypertexte"/>
             <w:noProof/>
           </w:rPr>
           <w:t>6</w:t>
@@ -1932,10 +1932,10 @@
         </w:r>
         <w:r>
           <w:rPr>
-            <w:rStyle w:val="Hyperlink"/>
-            <w:noProof/>
-          </w:rPr>
-          <w:t>Conclusion</w:t>
+            <w:rStyle w:val="Lienhypertexte"/>
+            <w:noProof/>
+          </w:rPr>
+          <w:t>CONCEPTION</w:t>
         </w:r>
         <w:r>
           <w:rPr>
@@ -1956,7 +1956,7 @@
             <w:noProof/>
             <w:webHidden/>
           </w:rPr>
-          <w:instrText xml:space="preserve"> PAGEREF _Toc242002490 \h </w:instrText>
+          <w:instrText xml:space="preserve"> PAGEREF _Toc242089351 \h </w:instrText>
         </w:r>
         <w:r>
           <w:rPr>
@@ -1989,7 +1989,7 @@
     </w:p>
     <w:p>
       <w:pPr>
-        <w:pStyle w:val="TOC2"/>
+        <w:pStyle w:val="TM2"/>
         <w:tabs>
           <w:tab w:val="left" w:pos="800"/>
           <w:tab w:val="right" w:leader="dot" w:pos="9060"/>
@@ -2004,10 +2004,10 @@
           <w14:ligatures w14:val="standardContextual"/>
         </w:rPr>
       </w:pPr>
-      <w:hyperlink w:anchor="_Toc242002491" w:history="1">
-        <w:r>
-          <w:rPr>
-            <w:rStyle w:val="Hyperlink"/>
+      <w:hyperlink w:anchor="_Toc242089352" w:history="1">
+        <w:r>
+          <w:rPr>
+            <w:rStyle w:val="Lienhypertexte"/>
             <w:noProof/>
           </w:rPr>
           <w:t>6.1</w:t>
@@ -2026,10 +2026,10 @@
         </w:r>
         <w:r>
           <w:rPr>
-            <w:rStyle w:val="Hyperlink"/>
-            <w:noProof/>
-          </w:rPr>
-          <w:t>Bilan des fonctionnalités demandées</w:t>
+            <w:rStyle w:val="Lienhypertexte"/>
+            <w:noProof/>
+          </w:rPr>
+          <w:t>Diagramme de classe :</w:t>
         </w:r>
         <w:r>
           <w:rPr>
@@ -2050,7 +2050,7 @@
             <w:noProof/>
             <w:webHidden/>
           </w:rPr>
-          <w:instrText xml:space="preserve"> PAGEREF _Toc242002491 \h </w:instrText>
+          <w:instrText xml:space="preserve"> PAGEREF _Toc242089352 \h </w:instrText>
         </w:r>
         <w:r>
           <w:rPr>
@@ -2083,195 +2083,7 @@
     </w:p>
     <w:p>
       <w:pPr>
-        <w:pStyle w:val="TOC2"/>
-        <w:tabs>
-          <w:tab w:val="left" w:pos="800"/>
-          <w:tab w:val="right" w:leader="dot" w:pos="9060"/>
-        </w:tabs>
-        <w:rPr>
-          <w:rFonts w:eastAsiaTheme="minorEastAsia" w:cstheme="minorBidi"/>
-          <w:smallCaps w:val="0"/>
-          <w:noProof/>
-          <w:kern w:val="2"/>
-          <w:sz w:val="24"/>
-          <w:szCs w:val="24"/>
-          <w14:ligatures w14:val="standardContextual"/>
-        </w:rPr>
-      </w:pPr>
-      <w:hyperlink w:anchor="_Toc242002492" w:history="1">
-        <w:r>
-          <w:rPr>
-            <w:rStyle w:val="Hyperlink"/>
-            <w:noProof/>
-          </w:rPr>
-          <w:t>6.2</w:t>
-        </w:r>
-        <w:r>
-          <w:rPr>
-            <w:rFonts w:eastAsiaTheme="minorEastAsia" w:cstheme="minorBidi"/>
-            <w:smallCaps w:val="0"/>
-            <w:noProof/>
-            <w:kern w:val="2"/>
-            <w:sz w:val="24"/>
-            <w:szCs w:val="24"/>
-            <w14:ligatures w14:val="standardContextual"/>
-          </w:rPr>
-          <w:tab/>
-        </w:r>
-        <w:r>
-          <w:rPr>
-            <w:rStyle w:val="Hyperlink"/>
-            <w:noProof/>
-          </w:rPr>
-          <w:t>Bilan de la planification</w:t>
-        </w:r>
-        <w:r>
-          <w:rPr>
-            <w:noProof/>
-            <w:webHidden/>
-          </w:rPr>
-          <w:tab/>
-        </w:r>
-        <w:r>
-          <w:rPr>
-            <w:noProof/>
-            <w:webHidden/>
-          </w:rPr>
-          <w:fldChar w:fldCharType="begin"/>
-        </w:r>
-        <w:r>
-          <w:rPr>
-            <w:noProof/>
-            <w:webHidden/>
-          </w:rPr>
-          <w:instrText xml:space="preserve"> PAGEREF _Toc242002492 \h </w:instrText>
-        </w:r>
-        <w:r>
-          <w:rPr>
-            <w:noProof/>
-            <w:webHidden/>
-          </w:rPr>
-        </w:r>
-        <w:r>
-          <w:rPr>
-            <w:noProof/>
-            <w:webHidden/>
-          </w:rPr>
-          <w:fldChar w:fldCharType="separate"/>
-        </w:r>
-        <w:r>
-          <w:rPr>
-            <w:noProof/>
-            <w:webHidden/>
-          </w:rPr>
-          <w:t>5</w:t>
-        </w:r>
-        <w:r>
-          <w:rPr>
-            <w:noProof/>
-            <w:webHidden/>
-          </w:rPr>
-          <w:fldChar w:fldCharType="end"/>
-        </w:r>
-      </w:hyperlink>
-    </w:p>
-    <w:p>
-      <w:pPr>
-        <w:pStyle w:val="TOC2"/>
-        <w:tabs>
-          <w:tab w:val="left" w:pos="800"/>
-          <w:tab w:val="right" w:leader="dot" w:pos="9060"/>
-        </w:tabs>
-        <w:rPr>
-          <w:rFonts w:eastAsiaTheme="minorEastAsia" w:cstheme="minorBidi"/>
-          <w:smallCaps w:val="0"/>
-          <w:noProof/>
-          <w:kern w:val="2"/>
-          <w:sz w:val="24"/>
-          <w:szCs w:val="24"/>
-          <w14:ligatures w14:val="standardContextual"/>
-        </w:rPr>
-      </w:pPr>
-      <w:hyperlink w:anchor="_Toc242002493" w:history="1">
-        <w:r>
-          <w:rPr>
-            <w:rStyle w:val="Hyperlink"/>
-            <w:noProof/>
-          </w:rPr>
-          <w:t>6.3</w:t>
-        </w:r>
-        <w:r>
-          <w:rPr>
-            <w:rFonts w:eastAsiaTheme="minorEastAsia" w:cstheme="minorBidi"/>
-            <w:smallCaps w:val="0"/>
-            <w:noProof/>
-            <w:kern w:val="2"/>
-            <w:sz w:val="24"/>
-            <w:szCs w:val="24"/>
-            <w14:ligatures w14:val="standardContextual"/>
-          </w:rPr>
-          <w:tab/>
-        </w:r>
-        <w:r>
-          <w:rPr>
-            <w:rStyle w:val="Hyperlink"/>
-            <w:noProof/>
-          </w:rPr>
-          <w:t>Bilan personnel</w:t>
-        </w:r>
-        <w:r>
-          <w:rPr>
-            <w:noProof/>
-            <w:webHidden/>
-          </w:rPr>
-          <w:tab/>
-        </w:r>
-        <w:r>
-          <w:rPr>
-            <w:noProof/>
-            <w:webHidden/>
-          </w:rPr>
-          <w:fldChar w:fldCharType="begin"/>
-        </w:r>
-        <w:r>
-          <w:rPr>
-            <w:noProof/>
-            <w:webHidden/>
-          </w:rPr>
-          <w:instrText xml:space="preserve"> PAGEREF _Toc242002493 \h </w:instrText>
-        </w:r>
-        <w:r>
-          <w:rPr>
-            <w:noProof/>
-            <w:webHidden/>
-          </w:rPr>
-        </w:r>
-        <w:r>
-          <w:rPr>
-            <w:noProof/>
-            <w:webHidden/>
-          </w:rPr>
-          <w:fldChar w:fldCharType="separate"/>
-        </w:r>
-        <w:r>
-          <w:rPr>
-            <w:noProof/>
-            <w:webHidden/>
-          </w:rPr>
-          <w:t>5</w:t>
-        </w:r>
-        <w:r>
-          <w:rPr>
-            <w:noProof/>
-            <w:webHidden/>
-          </w:rPr>
-          <w:fldChar w:fldCharType="end"/>
-        </w:r>
-      </w:hyperlink>
-    </w:p>
-    <w:p>
-      <w:pPr>
-        <w:pStyle w:val="TOC1"/>
+        <w:pStyle w:val="TM10"/>
         <w:tabs>
           <w:tab w:val="left" w:pos="400"/>
           <w:tab w:val="right" w:leader="dot" w:pos="9060"/>
@@ -2288,10 +2100,10 @@
           <w14:ligatures w14:val="standardContextual"/>
         </w:rPr>
       </w:pPr>
-      <w:hyperlink w:anchor="_Toc242002494" w:history="1">
-        <w:r>
-          <w:rPr>
-            <w:rStyle w:val="Hyperlink"/>
+      <w:hyperlink w:anchor="_Toc242089353" w:history="1">
+        <w:r>
+          <w:rPr>
+            <w:rStyle w:val="Lienhypertexte"/>
             <w:noProof/>
           </w:rPr>
           <w:t>7</w:t>
@@ -2312,10 +2124,10 @@
         </w:r>
         <w:r>
           <w:rPr>
-            <w:rStyle w:val="Hyperlink"/>
-            <w:noProof/>
-          </w:rPr>
-          <w:t>Divers</w:t>
+            <w:rStyle w:val="Lienhypertexte"/>
+            <w:noProof/>
+          </w:rPr>
+          <w:t>Utilisation de l’IA</w:t>
         </w:r>
         <w:r>
           <w:rPr>
@@ -2336,7 +2148,7 @@
             <w:noProof/>
             <w:webHidden/>
           </w:rPr>
-          <w:instrText xml:space="preserve"> PAGEREF _Toc242002494 \h </w:instrText>
+          <w:instrText xml:space="preserve"> PAGEREF _Toc242089353 \h </w:instrText>
         </w:r>
         <w:r>
           <w:rPr>
@@ -2356,7 +2168,7 @@
             <w:noProof/>
             <w:webHidden/>
           </w:rPr>
-          <w:t>5</w:t>
+          <w:t>6</w:t>
         </w:r>
         <w:r>
           <w:rPr>
@@ -2369,289 +2181,7 @@
     </w:p>
     <w:p>
       <w:pPr>
-        <w:pStyle w:val="TOC2"/>
-        <w:tabs>
-          <w:tab w:val="left" w:pos="800"/>
-          <w:tab w:val="right" w:leader="dot" w:pos="9060"/>
-        </w:tabs>
-        <w:rPr>
-          <w:rFonts w:eastAsiaTheme="minorEastAsia" w:cstheme="minorBidi"/>
-          <w:smallCaps w:val="0"/>
-          <w:noProof/>
-          <w:kern w:val="2"/>
-          <w:sz w:val="24"/>
-          <w:szCs w:val="24"/>
-          <w14:ligatures w14:val="standardContextual"/>
-        </w:rPr>
-      </w:pPr>
-      <w:hyperlink w:anchor="_Toc242002495" w:history="1">
-        <w:r>
-          <w:rPr>
-            <w:rStyle w:val="Hyperlink"/>
-            <w:noProof/>
-          </w:rPr>
-          <w:t>7.1</w:t>
-        </w:r>
-        <w:r>
-          <w:rPr>
-            <w:rFonts w:eastAsiaTheme="minorEastAsia" w:cstheme="minorBidi"/>
-            <w:smallCaps w:val="0"/>
-            <w:noProof/>
-            <w:kern w:val="2"/>
-            <w:sz w:val="24"/>
-            <w:szCs w:val="24"/>
-            <w14:ligatures w14:val="standardContextual"/>
-          </w:rPr>
-          <w:tab/>
-        </w:r>
-        <w:r>
-          <w:rPr>
-            <w:rStyle w:val="Hyperlink"/>
-            <w:noProof/>
-          </w:rPr>
-          <w:t>Journal de travail</w:t>
-        </w:r>
-        <w:r>
-          <w:rPr>
-            <w:noProof/>
-            <w:webHidden/>
-          </w:rPr>
-          <w:tab/>
-        </w:r>
-        <w:r>
-          <w:rPr>
-            <w:noProof/>
-            <w:webHidden/>
-          </w:rPr>
-          <w:fldChar w:fldCharType="begin"/>
-        </w:r>
-        <w:r>
-          <w:rPr>
-            <w:noProof/>
-            <w:webHidden/>
-          </w:rPr>
-          <w:instrText xml:space="preserve"> PAGEREF _Toc242002495 \h </w:instrText>
-        </w:r>
-        <w:r>
-          <w:rPr>
-            <w:noProof/>
-            <w:webHidden/>
-          </w:rPr>
-        </w:r>
-        <w:r>
-          <w:rPr>
-            <w:noProof/>
-            <w:webHidden/>
-          </w:rPr>
-          <w:fldChar w:fldCharType="separate"/>
-        </w:r>
-        <w:r>
-          <w:rPr>
-            <w:noProof/>
-            <w:webHidden/>
-          </w:rPr>
-          <w:t>5</w:t>
-        </w:r>
-        <w:r>
-          <w:rPr>
-            <w:noProof/>
-            <w:webHidden/>
-          </w:rPr>
-          <w:fldChar w:fldCharType="end"/>
-        </w:r>
-      </w:hyperlink>
-    </w:p>
-    <w:p>
-      <w:pPr>
-        <w:pStyle w:val="TOC2"/>
-        <w:tabs>
-          <w:tab w:val="left" w:pos="800"/>
-          <w:tab w:val="right" w:leader="dot" w:pos="9060"/>
-        </w:tabs>
-        <w:rPr>
-          <w:rFonts w:eastAsiaTheme="minorEastAsia" w:cstheme="minorBidi"/>
-          <w:smallCaps w:val="0"/>
-          <w:noProof/>
-          <w:kern w:val="2"/>
-          <w:sz w:val="24"/>
-          <w:szCs w:val="24"/>
-          <w14:ligatures w14:val="standardContextual"/>
-        </w:rPr>
-      </w:pPr>
-      <w:hyperlink w:anchor="_Toc242002496" w:history="1">
-        <w:r>
-          <w:rPr>
-            <w:rStyle w:val="Hyperlink"/>
-            <w:noProof/>
-          </w:rPr>
-          <w:t>7.2</w:t>
-        </w:r>
-        <w:r>
-          <w:rPr>
-            <w:rFonts w:eastAsiaTheme="minorEastAsia" w:cstheme="minorBidi"/>
-            <w:smallCaps w:val="0"/>
-            <w:noProof/>
-            <w:kern w:val="2"/>
-            <w:sz w:val="24"/>
-            <w:szCs w:val="24"/>
-            <w14:ligatures w14:val="standardContextual"/>
-          </w:rPr>
-          <w:tab/>
-        </w:r>
-        <w:r>
-          <w:rPr>
-            <w:rStyle w:val="Hyperlink"/>
-            <w:noProof/>
-          </w:rPr>
-          <w:t>Bibliographie</w:t>
-        </w:r>
-        <w:r>
-          <w:rPr>
-            <w:noProof/>
-            <w:webHidden/>
-          </w:rPr>
-          <w:tab/>
-        </w:r>
-        <w:r>
-          <w:rPr>
-            <w:noProof/>
-            <w:webHidden/>
-          </w:rPr>
-          <w:fldChar w:fldCharType="begin"/>
-        </w:r>
-        <w:r>
-          <w:rPr>
-            <w:noProof/>
-            <w:webHidden/>
-          </w:rPr>
-          <w:instrText xml:space="preserve"> PAGEREF _Toc242002496 \h </w:instrText>
-        </w:r>
-        <w:r>
-          <w:rPr>
-            <w:noProof/>
-            <w:webHidden/>
-          </w:rPr>
-        </w:r>
-        <w:r>
-          <w:rPr>
-            <w:noProof/>
-            <w:webHidden/>
-          </w:rPr>
-          <w:fldChar w:fldCharType="separate"/>
-        </w:r>
-        <w:r>
-          <w:rPr>
-            <w:noProof/>
-            <w:webHidden/>
-          </w:rPr>
-          <w:t>5</w:t>
-        </w:r>
-        <w:r>
-          <w:rPr>
-            <w:noProof/>
-            <w:webHidden/>
-          </w:rPr>
-          <w:fldChar w:fldCharType="end"/>
-        </w:r>
-      </w:hyperlink>
-    </w:p>
-    <w:p>
-      <w:pPr>
-        <w:pStyle w:val="TOC2"/>
-        <w:tabs>
-          <w:tab w:val="left" w:pos="800"/>
-          <w:tab w:val="right" w:leader="dot" w:pos="9060"/>
-        </w:tabs>
-        <w:rPr>
-          <w:rFonts w:eastAsiaTheme="minorEastAsia" w:cstheme="minorBidi"/>
-          <w:smallCaps w:val="0"/>
-          <w:noProof/>
-          <w:kern w:val="2"/>
-          <w:sz w:val="24"/>
-          <w:szCs w:val="24"/>
-          <w14:ligatures w14:val="standardContextual"/>
-        </w:rPr>
-      </w:pPr>
-      <w:hyperlink w:anchor="_Toc242002497" w:history="1">
-        <w:r>
-          <w:rPr>
-            <w:rStyle w:val="Hyperlink"/>
-            <w:noProof/>
-          </w:rPr>
-          <w:t>7.3</w:t>
-        </w:r>
-        <w:r>
-          <w:rPr>
-            <w:rFonts w:eastAsiaTheme="minorEastAsia" w:cstheme="minorBidi"/>
-            <w:smallCaps w:val="0"/>
-            <w:noProof/>
-            <w:kern w:val="2"/>
-            <w:sz w:val="24"/>
-            <w:szCs w:val="24"/>
-            <w14:ligatures w14:val="standardContextual"/>
-          </w:rPr>
-          <w:tab/>
-        </w:r>
-        <w:r>
-          <w:rPr>
-            <w:rStyle w:val="Hyperlink"/>
-            <w:noProof/>
-          </w:rPr>
-          <w:t>Webographie</w:t>
-        </w:r>
-        <w:r>
-          <w:rPr>
-            <w:noProof/>
-            <w:webHidden/>
-          </w:rPr>
-          <w:tab/>
-        </w:r>
-        <w:r>
-          <w:rPr>
-            <w:noProof/>
-            <w:webHidden/>
-          </w:rPr>
-          <w:fldChar w:fldCharType="begin"/>
-        </w:r>
-        <w:r>
-          <w:rPr>
-            <w:noProof/>
-            <w:webHidden/>
-          </w:rPr>
-          <w:instrText xml:space="preserve"> PAGEREF _Toc242002497 \h </w:instrText>
-        </w:r>
-        <w:r>
-          <w:rPr>
-            <w:noProof/>
-            <w:webHidden/>
-          </w:rPr>
-        </w:r>
-        <w:r>
-          <w:rPr>
-            <w:noProof/>
-            <w:webHidden/>
-          </w:rPr>
-          <w:fldChar w:fldCharType="separate"/>
-        </w:r>
-        <w:r>
-          <w:rPr>
-            <w:noProof/>
-            <w:webHidden/>
-          </w:rPr>
-          <w:t>5</w:t>
-        </w:r>
-        <w:r>
-          <w:rPr>
-            <w:noProof/>
-            <w:webHidden/>
-          </w:rPr>
-          <w:fldChar w:fldCharType="end"/>
-        </w:r>
-      </w:hyperlink>
-    </w:p>
-    <w:p>
-      <w:pPr>
-        <w:pStyle w:val="TOC1"/>
+        <w:pStyle w:val="TM10"/>
         <w:tabs>
           <w:tab w:val="left" w:pos="400"/>
           <w:tab w:val="right" w:leader="dot" w:pos="9060"/>
@@ -2668,10 +2198,10 @@
           <w14:ligatures w14:val="standardContextual"/>
         </w:rPr>
       </w:pPr>
-      <w:hyperlink w:anchor="_Toc242002498" w:history="1">
-        <w:r>
-          <w:rPr>
-            <w:rStyle w:val="Hyperlink"/>
+      <w:hyperlink w:anchor="_Toc242089354" w:history="1">
+        <w:r>
+          <w:rPr>
+            <w:rStyle w:val="Lienhypertexte"/>
             <w:noProof/>
           </w:rPr>
           <w:t>8</w:t>
@@ -2692,10 +2222,10 @@
         </w:r>
         <w:r>
           <w:rPr>
-            <w:rStyle w:val="Hyperlink"/>
-            <w:noProof/>
-          </w:rPr>
-          <w:t>Annexes</w:t>
+            <w:rStyle w:val="Lienhypertexte"/>
+            <w:noProof/>
+          </w:rPr>
+          <w:t>Bilan déroulement</w:t>
         </w:r>
         <w:r>
           <w:rPr>
@@ -2716,7 +2246,7 @@
             <w:noProof/>
             <w:webHidden/>
           </w:rPr>
-          <w:instrText xml:space="preserve"> PAGEREF _Toc242002498 \h </w:instrText>
+          <w:instrText xml:space="preserve"> PAGEREF _Toc242089354 \h </w:instrText>
         </w:r>
         <w:r>
           <w:rPr>
@@ -2736,7 +2266,203 @@
             <w:noProof/>
             <w:webHidden/>
           </w:rPr>
-          <w:t>5</w:t>
+          <w:t>6</w:t>
+        </w:r>
+        <w:r>
+          <w:rPr>
+            <w:noProof/>
+            <w:webHidden/>
+          </w:rPr>
+          <w:fldChar w:fldCharType="end"/>
+        </w:r>
+      </w:hyperlink>
+    </w:p>
+    <w:p>
+      <w:pPr>
+        <w:pStyle w:val="TM10"/>
+        <w:tabs>
+          <w:tab w:val="left" w:pos="400"/>
+          <w:tab w:val="right" w:leader="dot" w:pos="9060"/>
+        </w:tabs>
+        <w:rPr>
+          <w:rFonts w:eastAsiaTheme="minorEastAsia" w:cstheme="minorBidi"/>
+          <w:b w:val="0"/>
+          <w:bCs w:val="0"/>
+          <w:caps w:val="0"/>
+          <w:noProof/>
+          <w:kern w:val="2"/>
+          <w:sz w:val="24"/>
+          <w:szCs w:val="24"/>
+          <w14:ligatures w14:val="standardContextual"/>
+        </w:rPr>
+      </w:pPr>
+      <w:hyperlink w:anchor="_Toc242089355" w:history="1">
+        <w:r>
+          <w:rPr>
+            <w:rStyle w:val="Lienhypertexte"/>
+            <w:noProof/>
+          </w:rPr>
+          <w:t>9</w:t>
+        </w:r>
+        <w:r>
+          <w:rPr>
+            <w:rFonts w:eastAsiaTheme="minorEastAsia" w:cstheme="minorBidi"/>
+            <w:b w:val="0"/>
+            <w:bCs w:val="0"/>
+            <w:caps w:val="0"/>
+            <w:noProof/>
+            <w:kern w:val="2"/>
+            <w:sz w:val="24"/>
+            <w:szCs w:val="24"/>
+            <w14:ligatures w14:val="standardContextual"/>
+          </w:rPr>
+          <w:tab/>
+        </w:r>
+        <w:r>
+          <w:rPr>
+            <w:rStyle w:val="Lienhypertexte"/>
+            <w:noProof/>
+          </w:rPr>
+          <w:t>Bilan produit</w:t>
+        </w:r>
+        <w:r>
+          <w:rPr>
+            <w:noProof/>
+            <w:webHidden/>
+          </w:rPr>
+          <w:tab/>
+        </w:r>
+        <w:r>
+          <w:rPr>
+            <w:noProof/>
+            <w:webHidden/>
+          </w:rPr>
+          <w:fldChar w:fldCharType="begin"/>
+        </w:r>
+        <w:r>
+          <w:rPr>
+            <w:noProof/>
+            <w:webHidden/>
+          </w:rPr>
+          <w:instrText xml:space="preserve"> PAGEREF _Toc242089355 \h </w:instrText>
+        </w:r>
+        <w:r>
+          <w:rPr>
+            <w:noProof/>
+            <w:webHidden/>
+          </w:rPr>
+        </w:r>
+        <w:r>
+          <w:rPr>
+            <w:noProof/>
+            <w:webHidden/>
+          </w:rPr>
+          <w:fldChar w:fldCharType="separate"/>
+        </w:r>
+        <w:r>
+          <w:rPr>
+            <w:noProof/>
+            <w:webHidden/>
+          </w:rPr>
+          <w:t>6</w:t>
+        </w:r>
+        <w:r>
+          <w:rPr>
+            <w:noProof/>
+            <w:webHidden/>
+          </w:rPr>
+          <w:fldChar w:fldCharType="end"/>
+        </w:r>
+      </w:hyperlink>
+    </w:p>
+    <w:p>
+      <w:pPr>
+        <w:pStyle w:val="TM10"/>
+        <w:tabs>
+          <w:tab w:val="left" w:pos="600"/>
+          <w:tab w:val="right" w:leader="dot" w:pos="9060"/>
+        </w:tabs>
+        <w:rPr>
+          <w:rFonts w:eastAsiaTheme="minorEastAsia" w:cstheme="minorBidi"/>
+          <w:b w:val="0"/>
+          <w:bCs w:val="0"/>
+          <w:caps w:val="0"/>
+          <w:noProof/>
+          <w:kern w:val="2"/>
+          <w:sz w:val="24"/>
+          <w:szCs w:val="24"/>
+          <w14:ligatures w14:val="standardContextual"/>
+        </w:rPr>
+      </w:pPr>
+      <w:hyperlink w:anchor="_Toc242089356" w:history="1">
+        <w:r>
+          <w:rPr>
+            <w:rStyle w:val="Lienhypertexte"/>
+            <w:noProof/>
+          </w:rPr>
+          <w:t>10</w:t>
+        </w:r>
+        <w:r>
+          <w:rPr>
+            <w:rFonts w:eastAsiaTheme="minorEastAsia" w:cstheme="minorBidi"/>
+            <w:b w:val="0"/>
+            <w:bCs w:val="0"/>
+            <w:caps w:val="0"/>
+            <w:noProof/>
+            <w:kern w:val="2"/>
+            <w:sz w:val="24"/>
+            <w:szCs w:val="24"/>
+            <w14:ligatures w14:val="standardContextual"/>
+          </w:rPr>
+          <w:tab/>
+        </w:r>
+        <w:r>
+          <w:rPr>
+            <w:rStyle w:val="Lienhypertexte"/>
+            <w:noProof/>
+          </w:rPr>
+          <w:t>Conclusion</w:t>
+        </w:r>
+        <w:r>
+          <w:rPr>
+            <w:noProof/>
+            <w:webHidden/>
+          </w:rPr>
+          <w:tab/>
+        </w:r>
+        <w:r>
+          <w:rPr>
+            <w:noProof/>
+            <w:webHidden/>
+          </w:rPr>
+          <w:fldChar w:fldCharType="begin"/>
+        </w:r>
+        <w:r>
+          <w:rPr>
+            <w:noProof/>
+            <w:webHidden/>
+          </w:rPr>
+          <w:instrText xml:space="preserve"> PAGEREF _Toc242089356 \h </w:instrText>
+        </w:r>
+        <w:r>
+          <w:rPr>
+            <w:noProof/>
+            <w:webHidden/>
+          </w:rPr>
+        </w:r>
+        <w:r>
+          <w:rPr>
+            <w:noProof/>
+            <w:webHidden/>
+          </w:rPr>
+          <w:fldChar w:fldCharType="separate"/>
+        </w:r>
+        <w:r>
+          <w:rPr>
+            <w:noProof/>
+            <w:webHidden/>
+          </w:rPr>
+          <w:t>6</w:t>
         </w:r>
         <w:r>
           <w:rPr>
@@ -2765,11 +2491,11 @@
     </w:p>
     <w:p>
       <w:pPr>
-        <w:pStyle w:val="Heading1"/>
+        <w:pStyle w:val="Titre1"/>
       </w:pPr>
       <w:bookmarkStart w:id="0" w:name="_Toc532179955"/>
       <w:bookmarkStart w:id="1" w:name="_Toc165969637"/>
-      <w:bookmarkStart w:id="2" w:name="_Toc242002472"/>
+      <w:bookmarkStart w:id="2" w:name="_Toc242089333"/>
       <w:r>
         <w:lastRenderedPageBreak/>
         <w:t>Spécifications</w:t>
@@ -2780,16 +2506,16 @@
     </w:p>
     <w:p>
       <w:pPr>
-        <w:pStyle w:val="BodyText"/>
-      </w:pPr>
-    </w:p>
-    <w:p>
-      <w:pPr>
-        <w:pStyle w:val="Heading2"/>
+        <w:pStyle w:val="Corpsdetexte"/>
+      </w:pPr>
+    </w:p>
+    <w:p>
+      <w:pPr>
+        <w:pStyle w:val="Titre2"/>
       </w:pPr>
       <w:bookmarkStart w:id="3" w:name="_Toc532179969"/>
       <w:bookmarkStart w:id="4" w:name="_Toc165969639"/>
-      <w:bookmarkStart w:id="5" w:name="_Toc242002473"/>
+      <w:bookmarkStart w:id="5" w:name="_Toc242089334"/>
       <w:r>
         <w:t>T</w:t>
       </w:r>
@@ -2803,7 +2529,7 @@
     </w:p>
     <w:p>
       <w:pPr>
-        <w:pStyle w:val="BodyTextIndent"/>
+        <w:pStyle w:val="Retraitcorpsdetexte"/>
         <w:ind w:left="0"/>
       </w:pPr>
       <w:r>
@@ -2812,9 +2538,9 @@
     </w:p>
     <w:p>
       <w:pPr>
-        <w:pStyle w:val="Heading2"/>
-      </w:pPr>
-      <w:bookmarkStart w:id="6" w:name="_Toc242002474"/>
+        <w:pStyle w:val="Titre2"/>
+      </w:pPr>
+      <w:bookmarkStart w:id="6" w:name="_Toc242089335"/>
       <w:r>
         <w:t>Description</w:t>
       </w:r>
@@ -2822,12 +2548,12 @@
     </w:p>
     <w:p>
       <w:pPr>
-        <w:pStyle w:val="BodyTextIndent"/>
-      </w:pPr>
-    </w:p>
-    <w:p>
-      <w:pPr>
-        <w:pStyle w:val="BodyTextIndent"/>
+        <w:pStyle w:val="Retraitcorpsdetexte"/>
+      </w:pPr>
+    </w:p>
+    <w:p>
+      <w:pPr>
+        <w:pStyle w:val="Retraitcorpsdetexte"/>
         <w:ind w:left="0"/>
       </w:pPr>
       <w:r>
@@ -2836,9 +2562,9 @@
     </w:p>
     <w:p>
       <w:pPr>
-        <w:pStyle w:val="Heading2"/>
-      </w:pPr>
-      <w:bookmarkStart w:id="7" w:name="_Toc242002475"/>
+        <w:pStyle w:val="Titre2"/>
+      </w:pPr>
+      <w:bookmarkStart w:id="7" w:name="_Toc242089336"/>
       <w:r>
         <w:t>Matériel et logiciels à disposition</w:t>
       </w:r>
@@ -2846,13 +2572,13 @@
     </w:p>
     <w:p>
       <w:pPr>
-        <w:pStyle w:val="BodyTextIndent"/>
+        <w:pStyle w:val="Retraitcorpsdetexte"/>
         <w:ind w:left="0"/>
       </w:pPr>
     </w:p>
     <w:p>
       <w:pPr>
-        <w:pStyle w:val="ListParagraph"/>
+        <w:pStyle w:val="Paragraphedeliste"/>
         <w:numPr>
           <w:ilvl w:val="0"/>
           <w:numId w:val="10"/>
@@ -2864,7 +2590,7 @@
     </w:p>
     <w:p>
       <w:pPr>
-        <w:pStyle w:val="ListParagraph"/>
+        <w:pStyle w:val="Paragraphedeliste"/>
         <w:numPr>
           <w:ilvl w:val="0"/>
           <w:numId w:val="10"/>
@@ -2876,9 +2602,9 @@
     </w:p>
     <w:p>
       <w:pPr>
-        <w:pStyle w:val="Heading2"/>
-      </w:pPr>
-      <w:bookmarkStart w:id="8" w:name="_Toc242002476"/>
+        <w:pStyle w:val="Titre2"/>
+      </w:pPr>
+      <w:bookmarkStart w:id="8" w:name="_Toc242089337"/>
       <w:r>
         <w:t>P</w:t>
       </w:r>
@@ -2889,12 +2615,12 @@
     </w:p>
     <w:p>
       <w:pPr>
-        <w:pStyle w:val="BodyTextIndent"/>
-      </w:pPr>
-    </w:p>
-    <w:p>
-      <w:pPr>
-        <w:pStyle w:val="BodyTextIndent"/>
+        <w:pStyle w:val="Retraitcorpsdetexte"/>
+      </w:pPr>
+    </w:p>
+    <w:p>
+      <w:pPr>
+        <w:pStyle w:val="Retraitcorpsdetexte"/>
         <w:numPr>
           <w:ilvl w:val="0"/>
           <w:numId w:val="10"/>
@@ -2906,7 +2632,7 @@
     </w:p>
     <w:p>
       <w:pPr>
-        <w:pStyle w:val="BodyTextIndent"/>
+        <w:pStyle w:val="Retraitcorpsdetexte"/>
         <w:numPr>
           <w:ilvl w:val="0"/>
           <w:numId w:val="10"/>
@@ -2918,9 +2644,9 @@
     </w:p>
     <w:p>
       <w:pPr>
-        <w:pStyle w:val="Heading2"/>
-      </w:pPr>
-      <w:bookmarkStart w:id="9" w:name="_Toc242002477"/>
+        <w:pStyle w:val="Titre2"/>
+      </w:pPr>
+      <w:bookmarkStart w:id="9" w:name="_Toc242089338"/>
       <w:r>
         <w:t>Cahier des charges</w:t>
       </w:r>
@@ -2928,7 +2654,7 @@
     </w:p>
     <w:p>
       <w:pPr>
-        <w:pStyle w:val="BodyTextIndent3"/>
+        <w:pStyle w:val="Retraitcorpsdetexte3"/>
       </w:pPr>
       <w:r>
         <w:t xml:space="preserve">Cahier des charges en </w:t>
@@ -2942,9 +2668,9 @@
     </w:p>
     <w:p>
       <w:pPr>
-        <w:pStyle w:val="Heading2"/>
-      </w:pPr>
-      <w:bookmarkStart w:id="10" w:name="_Toc242002478"/>
+        <w:pStyle w:val="Titre2"/>
+      </w:pPr>
+      <w:bookmarkStart w:id="10" w:name="_Toc242089339"/>
       <w:r>
         <w:t>Les points suivants seront évalués</w:t>
       </w:r>
@@ -2952,7 +2678,7 @@
     </w:p>
     <w:p>
       <w:pPr>
-        <w:pStyle w:val="BodyTextIndent"/>
+        <w:pStyle w:val="Retraitcorpsdetexte"/>
         <w:numPr>
           <w:ilvl w:val="0"/>
           <w:numId w:val="5"/>
@@ -2964,7 +2690,7 @@
     </w:p>
     <w:p>
       <w:pPr>
-        <w:pStyle w:val="BodyTextIndent"/>
+        <w:pStyle w:val="Retraitcorpsdetexte"/>
         <w:numPr>
           <w:ilvl w:val="0"/>
           <w:numId w:val="5"/>
@@ -2985,7 +2711,7 @@
     </w:p>
     <w:p>
       <w:pPr>
-        <w:pStyle w:val="BodyTextIndent"/>
+        <w:pStyle w:val="Retraitcorpsdetexte"/>
         <w:numPr>
           <w:ilvl w:val="0"/>
           <w:numId w:val="5"/>
@@ -2997,7 +2723,7 @@
     </w:p>
     <w:p>
       <w:pPr>
-        <w:pStyle w:val="BodyTextIndent"/>
+        <w:pStyle w:val="Retraitcorpsdetexte"/>
         <w:numPr>
           <w:ilvl w:val="0"/>
           <w:numId w:val="5"/>
@@ -3015,7 +2741,7 @@
     </w:p>
     <w:p>
       <w:pPr>
-        <w:pStyle w:val="BodyTextIndent"/>
+        <w:pStyle w:val="Retraitcorpsdetexte"/>
         <w:numPr>
           <w:ilvl w:val="0"/>
           <w:numId w:val="5"/>
@@ -3027,9 +2753,9 @@
     </w:p>
     <w:p>
       <w:pPr>
-        <w:pStyle w:val="Heading2"/>
-      </w:pPr>
-      <w:bookmarkStart w:id="11" w:name="_Toc242002479"/>
+        <w:pStyle w:val="Titre2"/>
+      </w:pPr>
+      <w:bookmarkStart w:id="11" w:name="_Toc242089340"/>
       <w:r>
         <w:t>Validation et conditions de réussite</w:t>
       </w:r>
@@ -3037,7 +2763,7 @@
     </w:p>
     <w:p>
       <w:pPr>
-        <w:pStyle w:val="BodyTextIndent"/>
+        <w:pStyle w:val="Retraitcorpsdetexte"/>
         <w:numPr>
           <w:ilvl w:val="0"/>
           <w:numId w:val="5"/>
@@ -3049,7 +2775,7 @@
     </w:p>
     <w:p>
       <w:pPr>
-        <w:pStyle w:val="BodyTextIndent"/>
+        <w:pStyle w:val="Retraitcorpsdetexte"/>
         <w:numPr>
           <w:ilvl w:val="0"/>
           <w:numId w:val="5"/>
@@ -3061,7 +2787,7 @@
     </w:p>
     <w:p>
       <w:pPr>
-        <w:pStyle w:val="BodyTextIndent"/>
+        <w:pStyle w:val="Retraitcorpsdetexte"/>
         <w:numPr>
           <w:ilvl w:val="0"/>
           <w:numId w:val="5"/>
@@ -3073,9 +2799,9 @@
     </w:p>
     <w:p>
       <w:pPr>
-        <w:pStyle w:val="Heading1"/>
-      </w:pPr>
-      <w:bookmarkStart w:id="12" w:name="_Toc242002480"/>
+        <w:pStyle w:val="Titre1"/>
+      </w:pPr>
+      <w:bookmarkStart w:id="12" w:name="_Toc242089341"/>
       <w:r>
         <w:t>Planification</w:t>
       </w:r>
@@ -3088,7 +2814,7 @@
     </w:p>
     <w:p>
       <w:pPr>
-        <w:pStyle w:val="BodyText"/>
+        <w:pStyle w:val="Corpsdetexte"/>
       </w:pPr>
       <w:r>
         <w:t xml:space="preserve">Se référer à </w:t>
@@ -3096,7 +2822,7 @@
       <w:hyperlink r:id="rId12" w:history="1">
         <w:r>
           <w:rPr>
-            <w:rStyle w:val="Hyperlink"/>
+            <w:rStyle w:val="Lienhypertexte"/>
           </w:rPr>
           <w:t>Planning — pm2etml</w:t>
         </w:r>
@@ -3113,11 +2839,11 @@
     </w:p>
     <w:p>
       <w:pPr>
-        <w:pStyle w:val="Heading1"/>
+        <w:pStyle w:val="Titre1"/>
       </w:pPr>
       <w:bookmarkStart w:id="13" w:name="_Toc532179957"/>
       <w:bookmarkStart w:id="14" w:name="_Toc165969641"/>
-      <w:bookmarkStart w:id="15" w:name="_Toc242002481"/>
+      <w:bookmarkStart w:id="15" w:name="_Toc242089342"/>
       <w:r>
         <w:t>Analyse</w:t>
       </w:r>
@@ -3127,9 +2853,9 @@
     </w:p>
     <w:p>
       <w:pPr>
-        <w:pStyle w:val="Heading2"/>
-      </w:pPr>
-      <w:bookmarkStart w:id="16" w:name="_Toc242002482"/>
+        <w:pStyle w:val="Titre2"/>
+      </w:pPr>
+      <w:bookmarkStart w:id="16" w:name="_Toc242089343"/>
       <w:r>
         <w:t>Opportunités</w:t>
       </w:r>
@@ -3137,7 +2863,7 @@
     </w:p>
     <w:p>
       <w:pPr>
-        <w:pStyle w:val="BodyTextIndent"/>
+        <w:pStyle w:val="Retraitcorpsdetexte"/>
       </w:pPr>
     </w:p>
     <w:p>
@@ -3147,7 +2873,7 @@
     </w:p>
     <w:p>
       <w:pPr>
-        <w:pStyle w:val="ListParagraph"/>
+        <w:pStyle w:val="Paragraphedeliste"/>
         <w:numPr>
           <w:ilvl w:val="0"/>
           <w:numId w:val="10"/>
@@ -3159,7 +2885,7 @@
     </w:p>
     <w:p>
       <w:pPr>
-        <w:pStyle w:val="ListParagraph"/>
+        <w:pStyle w:val="Paragraphedeliste"/>
         <w:numPr>
           <w:ilvl w:val="0"/>
           <w:numId w:val="10"/>
@@ -3182,11 +2908,11 @@
     </w:p>
     <w:p>
       <w:pPr>
-        <w:pStyle w:val="Heading2"/>
+        <w:pStyle w:val="Titre2"/>
       </w:pPr>
       <w:bookmarkStart w:id="17" w:name="_Toc532179959"/>
       <w:bookmarkStart w:id="18" w:name="_Toc165969643"/>
-      <w:bookmarkStart w:id="19" w:name="_Toc242002483"/>
+      <w:bookmarkStart w:id="19" w:name="_Toc242089344"/>
       <w:r>
         <w:lastRenderedPageBreak/>
         <w:t>Document d’analyse</w:t>
@@ -3200,7 +2926,7 @@
     </w:p>
     <w:p>
       <w:pPr>
-        <w:pStyle w:val="BodyTextIndent"/>
+        <w:pStyle w:val="Retraitcorpsdetexte"/>
         <w:ind w:left="0"/>
       </w:pPr>
       <w:r>
@@ -3209,7 +2935,7 @@
     </w:p>
     <w:p>
       <w:pPr>
-        <w:pStyle w:val="BodyTextIndent"/>
+        <w:pStyle w:val="Retraitcorpsdetexte"/>
         <w:numPr>
           <w:ilvl w:val="0"/>
           <w:numId w:val="10"/>
@@ -3229,7 +2955,7 @@
     </w:p>
     <w:p>
       <w:pPr>
-        <w:pStyle w:val="BodyTextIndent"/>
+        <w:pStyle w:val="Retraitcorpsdetexte"/>
         <w:ind w:left="720"/>
       </w:pPr>
       <w:r>
@@ -3238,7 +2964,7 @@
     </w:p>
     <w:p>
       <w:pPr>
-        <w:pStyle w:val="BodyTextIndent"/>
+        <w:pStyle w:val="Retraitcorpsdetexte"/>
         <w:numPr>
           <w:ilvl w:val="0"/>
           <w:numId w:val="10"/>
@@ -3272,7 +2998,7 @@
     </w:p>
     <w:p>
       <w:pPr>
-        <w:pStyle w:val="BodyTextIndent"/>
+        <w:pStyle w:val="Retraitcorpsdetexte"/>
         <w:ind w:left="720"/>
       </w:pPr>
       <w:r>
@@ -3281,13 +3007,13 @@
     </w:p>
     <w:p>
       <w:pPr>
-        <w:pStyle w:val="BodyTextIndent"/>
+        <w:pStyle w:val="Retraitcorpsdetexte"/>
         <w:ind w:left="0"/>
       </w:pPr>
     </w:p>
     <w:p>
       <w:pPr>
-        <w:pStyle w:val="BodyTextIndent"/>
+        <w:pStyle w:val="Retraitcorpsdetexte"/>
         <w:numPr>
           <w:ilvl w:val="0"/>
           <w:numId w:val="10"/>
@@ -3306,7 +3032,7 @@
     </w:p>
     <w:p>
       <w:pPr>
-        <w:pStyle w:val="BodyTextIndent"/>
+        <w:pStyle w:val="Retraitcorpsdetexte"/>
         <w:ind w:left="720"/>
       </w:pPr>
       <w:r>
@@ -3315,7 +3041,7 @@
     </w:p>
     <w:p>
       <w:pPr>
-        <w:pStyle w:val="BodyTextIndent"/>
+        <w:pStyle w:val="Retraitcorpsdetexte"/>
         <w:numPr>
           <w:ilvl w:val="0"/>
           <w:numId w:val="10"/>
@@ -3334,7 +3060,7 @@
     </w:p>
     <w:p>
       <w:pPr>
-        <w:pStyle w:val="BodyTextIndent"/>
+        <w:pStyle w:val="Retraitcorpsdetexte"/>
         <w:ind w:left="720"/>
       </w:pPr>
       <w:r>
@@ -3343,7 +3069,7 @@
     </w:p>
     <w:p>
       <w:pPr>
-        <w:pStyle w:val="BodyTextIndent"/>
+        <w:pStyle w:val="Retraitcorpsdetexte"/>
         <w:numPr>
           <w:ilvl w:val="0"/>
           <w:numId w:val="10"/>
@@ -3362,7 +3088,7 @@
     </w:p>
     <w:p>
       <w:pPr>
-        <w:pStyle w:val="BodyTextIndent"/>
+        <w:pStyle w:val="Retraitcorpsdetexte"/>
         <w:ind w:left="720"/>
       </w:pPr>
       <w:r>
@@ -3371,7 +3097,7 @@
     </w:p>
     <w:p>
       <w:pPr>
-        <w:pStyle w:val="BodyTextIndent"/>
+        <w:pStyle w:val="Retraitcorpsdetexte"/>
         <w:numPr>
           <w:ilvl w:val="0"/>
           <w:numId w:val="10"/>
@@ -3390,7 +3116,7 @@
     </w:p>
     <w:p>
       <w:pPr>
-        <w:pStyle w:val="BodyTextIndent"/>
+        <w:pStyle w:val="Retraitcorpsdetexte"/>
         <w:ind w:left="720"/>
       </w:pPr>
       <w:r>
@@ -3412,19 +3138,16 @@
         <w:sym w:font="Symbol" w:char="F0B7"/>
       </w:r>
       <w:r>
-        <w:t xml:space="preserve"> SORTIE (heure de sortie) – Plaque d’immatriculation (n° place, montant payé)</w:t>
-      </w:r>
-      <w:r>
-        <w:t xml:space="preserve"> </w:t>
-      </w:r>
-    </w:p>
-    <w:p>
-      <w:pPr>
-        <w:pStyle w:val="Heading2"/>
+        <w:t xml:space="preserve"> SORTIE (heure de sortie) – Plaque d’immatriculation (n° place, montant payé) </w:t>
+      </w:r>
+    </w:p>
+    <w:p>
+      <w:pPr>
+        <w:pStyle w:val="Titre2"/>
       </w:pPr>
       <w:bookmarkStart w:id="20" w:name="_Toc532179967"/>
       <w:bookmarkStart w:id="21" w:name="_Toc165969651"/>
-      <w:bookmarkStart w:id="22" w:name="_Toc242002484"/>
+      <w:bookmarkStart w:id="22" w:name="_Toc242089345"/>
       <w:r>
         <w:t>Conception des tests</w:t>
       </w:r>
@@ -3471,11 +3194,11 @@
     </w:p>
     <w:p>
       <w:pPr>
-        <w:pStyle w:val="Heading1"/>
+        <w:pStyle w:val="Titre1"/>
       </w:pPr>
       <w:bookmarkStart w:id="24" w:name="_Toc532179964"/>
       <w:bookmarkStart w:id="25" w:name="_Toc165969648"/>
-      <w:bookmarkStart w:id="26" w:name="_Toc242002485"/>
+      <w:bookmarkStart w:id="26" w:name="_Toc242089346"/>
       <w:bookmarkEnd w:id="23"/>
       <w:r>
         <w:t>Réalisation</w:t>
@@ -3486,11 +3209,11 @@
     </w:p>
     <w:p>
       <w:pPr>
-        <w:pStyle w:val="Heading2"/>
+        <w:pStyle w:val="Titre2"/>
       </w:pPr>
       <w:bookmarkStart w:id="27" w:name="_Toc532179965"/>
       <w:bookmarkStart w:id="28" w:name="_Toc165969649"/>
-      <w:bookmarkStart w:id="29" w:name="_Toc242002486"/>
+      <w:bookmarkStart w:id="29" w:name="_Toc242089347"/>
       <w:r>
         <w:t>Dossier de Réalisation</w:t>
       </w:r>
@@ -3500,164 +3223,46 @@
     </w:p>
     <w:p>
       <w:pPr>
-        <w:pStyle w:val="Informations"/>
-        <w:numPr>
-          <w:ilvl w:val="5"/>
-          <w:numId w:val="6"/>
-        </w:numPr>
-      </w:pPr>
-      <w:r>
-        <w:t>Ce</w:t>
-      </w:r>
-      <w:r>
-        <w:t>tte partie</w:t>
-      </w:r>
-      <w:r>
-        <w:t xml:space="preserve"> permet de reproduire ou reprendre le projet par un tiers.</w:t>
-      </w:r>
-    </w:p>
-    <w:p>
-      <w:pPr>
-        <w:pStyle w:val="Informations"/>
-        <w:numPr>
-          <w:ilvl w:val="5"/>
-          <w:numId w:val="6"/>
-        </w:numPr>
-      </w:pPr>
-      <w:r>
-        <w:t xml:space="preserve">Pour chaque </w:t>
-      </w:r>
-      <w:r>
-        <w:t xml:space="preserve">étape, il faut décrire sa mise en </w:t>
-      </w:r>
-      <w:r>
-        <w:t>œuvre. Typiquement</w:t>
-      </w:r>
-      <w:r>
-        <w:t> :</w:t>
-      </w:r>
-    </w:p>
-    <w:p>
-      <w:pPr>
-        <w:pStyle w:val="Informations"/>
-        <w:numPr>
-          <w:ilvl w:val="6"/>
-          <w:numId w:val="6"/>
-        </w:numPr>
-      </w:pPr>
-      <w:r>
-        <w:t>Versions des outils logiciels utilisés (OS, applications, pilotes, librairies, etc.)</w:t>
-      </w:r>
-    </w:p>
-    <w:p>
-      <w:pPr>
-        <w:pStyle w:val="Informations"/>
-        <w:numPr>
-          <w:ilvl w:val="6"/>
-          <w:numId w:val="6"/>
-        </w:numPr>
+        <w:pStyle w:val="Retraitcorpsdetexte"/>
+      </w:pPr>
+      <w:r>
+        <w:t xml:space="preserve">Outils utilisés : </w:t>
+      </w:r>
+    </w:p>
+    <w:p>
+      <w:pPr>
+        <w:pStyle w:val="Retraitcorpsdetexte"/>
+      </w:pPr>
+      <w:r>
+        <w:t>Windows 11, Visual Studio 2022, .Net Framework</w:t>
+      </w:r>
+    </w:p>
+    <w:p>
+      <w:pPr>
+        <w:pStyle w:val="Retraitcorpsdetexte"/>
       </w:pPr>
       <w:r>
         <w:t>Configurations spéciales</w:t>
       </w:r>
       <w:r>
-        <w:t xml:space="preserve"> des outils (Equipements, </w:t>
-      </w:r>
-      <w:r>
-        <w:t>PC</w:t>
-      </w:r>
-      <w:r>
-        <w:t xml:space="preserve">, machines, </w:t>
-      </w:r>
-      <w:r>
-        <w:t xml:space="preserve">outillage, </w:t>
-      </w:r>
-      <w:r>
-        <w:t>etc.)</w:t>
-      </w:r>
-    </w:p>
-    <w:p>
-      <w:pPr>
-        <w:pStyle w:val="Informations"/>
-        <w:numPr>
-          <w:ilvl w:val="6"/>
-          <w:numId w:val="6"/>
-        </w:numPr>
-      </w:pPr>
-      <w:r>
-        <w:t xml:space="preserve">Code source </w:t>
-      </w:r>
-      <w:r>
-        <w:t xml:space="preserve">commenté </w:t>
-      </w:r>
-      <w:r>
-        <w:t xml:space="preserve">des </w:t>
-      </w:r>
-      <w:r>
-        <w:t>éléments logiciels</w:t>
-      </w:r>
-      <w:r>
-        <w:t xml:space="preserve"> développés.</w:t>
-      </w:r>
-    </w:p>
-    <w:p>
-      <w:pPr>
-        <w:pStyle w:val="Informations"/>
-        <w:numPr>
-          <w:ilvl w:val="6"/>
-          <w:numId w:val="6"/>
-        </w:numPr>
-      </w:pPr>
-      <w:r>
-        <w:t>Modèle physique d’une base de données.</w:t>
-      </w:r>
-    </w:p>
-    <w:p>
-      <w:pPr>
-        <w:pStyle w:val="Informations"/>
-        <w:numPr>
-          <w:ilvl w:val="6"/>
-          <w:numId w:val="6"/>
-        </w:numPr>
-      </w:pPr>
-      <w:r>
-        <w:t>Arborescences des documents produits</w:t>
-      </w:r>
-      <w:r>
-        <w:t>.</w:t>
-      </w:r>
-    </w:p>
-    <w:p>
-      <w:pPr>
-        <w:pStyle w:val="Informations"/>
-        <w:numPr>
-          <w:ilvl w:val="5"/>
-          <w:numId w:val="6"/>
-        </w:numPr>
-      </w:pPr>
-      <w:r>
-        <w:t>Il faut décrire le parcours de réalisation e</w:t>
-      </w:r>
-      <w:r>
-        <w:t>t</w:t>
-      </w:r>
-      <w:r>
-        <w:t xml:space="preserve"> justifi</w:t>
-      </w:r>
-      <w:r>
-        <w:t>er</w:t>
-      </w:r>
-      <w:r>
-        <w:t xml:space="preserve"> les choix. </w:t>
-      </w:r>
-    </w:p>
-    <w:p>
-      <w:pPr>
-        <w:pStyle w:val="Heading2"/>
+        <w:t xml:space="preserve"> : </w:t>
+      </w:r>
+    </w:p>
+    <w:p>
+      <w:pPr>
+        <w:pStyle w:val="Retraitcorpsdetexte"/>
+      </w:pPr>
+      <w:r>
+        <w:t>Aucune</w:t>
+      </w:r>
+    </w:p>
+    <w:p>
+      <w:pPr>
+        <w:pStyle w:val="Titre2"/>
       </w:pPr>
       <w:bookmarkStart w:id="30" w:name="_Toc532179960"/>
       <w:bookmarkStart w:id="31" w:name="_Toc165969644"/>
-      <w:bookmarkStart w:id="32" w:name="_Toc242002487"/>
+      <w:bookmarkStart w:id="32" w:name="_Toc242089348"/>
       <w:r>
         <w:t>Modifications</w:t>
       </w:r>
@@ -3667,47 +3272,19 @@
     </w:p>
     <w:p>
       <w:pPr>
-        <w:pStyle w:val="Informations"/>
-        <w:numPr>
-          <w:ilvl w:val="5"/>
-          <w:numId w:val="7"/>
-        </w:numPr>
-      </w:pPr>
-      <w:r>
-        <w:t>Historique</w:t>
-      </w:r>
-      <w:r>
-        <w:t xml:space="preserve"> des modifications demandées (ou nécessaires) au</w:t>
-      </w:r>
-      <w:r>
-        <w:t>x</w:t>
-      </w:r>
-      <w:r>
-        <w:t xml:space="preserve"> spécifications détaillé</w:t>
-      </w:r>
-      <w:r>
-        <w:t>es.</w:t>
-      </w:r>
-    </w:p>
-    <w:p>
-      <w:pPr>
-        <w:pStyle w:val="Informations"/>
-        <w:numPr>
-          <w:ilvl w:val="5"/>
-          <w:numId w:val="7"/>
-        </w:numPr>
-      </w:pPr>
-      <w:r>
-        <w:t>Date, raison, description, etc.</w:t>
-      </w:r>
-    </w:p>
-    <w:p>
-      <w:pPr>
-        <w:pStyle w:val="Heading1"/>
+        <w:pStyle w:val="Retraitcorpsdetexte"/>
+      </w:pPr>
+      <w:r>
+        <w:t>Aucune Modification n’a été faite.</w:t>
+      </w:r>
+    </w:p>
+    <w:p>
+      <w:pPr>
+        <w:pStyle w:val="Titre1"/>
       </w:pPr>
       <w:bookmarkStart w:id="33" w:name="_Toc532179966"/>
       <w:bookmarkStart w:id="34" w:name="_Toc165969650"/>
-      <w:bookmarkStart w:id="35" w:name="_Toc242002488"/>
+      <w:bookmarkStart w:id="35" w:name="_Toc242089349"/>
       <w:r>
         <w:t>Tests</w:t>
       </w:r>
@@ -3717,12 +3294,12 @@
     </w:p>
     <w:p>
       <w:pPr>
-        <w:pStyle w:val="Heading2"/>
+        <w:pStyle w:val="Titre2"/>
       </w:pPr>
       <w:bookmarkStart w:id="36" w:name="_Toc532179968"/>
       <w:bookmarkStart w:id="37" w:name="_Toc165969652"/>
       <w:bookmarkStart w:id="38" w:name="_Ref308525868"/>
-      <w:bookmarkStart w:id="39" w:name="_Toc242002489"/>
+      <w:bookmarkStart w:id="39" w:name="_Toc242089350"/>
       <w:r>
         <w:t>Dossier des tests</w:t>
       </w:r>
@@ -3733,12 +3310,11 @@
     </w:p>
     <w:p>
       <w:pPr>
-        <w:pStyle w:val="BodyTextIndent"/>
-      </w:pPr>
-    </w:p>
-    <w:p>
-      <w:r>
-        <w:lastRenderedPageBreak/>
+        <w:pStyle w:val="Retraitcorpsdetexte"/>
+      </w:pPr>
+    </w:p>
+    <w:p>
+      <w:r>
         <w:t xml:space="preserve">J’ai </w:t>
       </w:r>
       <w:r>
@@ -3783,6 +3359,9 @@
     </w:p>
     <w:p>
       <w:r>
+        <w:rPr>
+          <w:noProof/>
+        </w:rPr>
         <w:drawing>
           <wp:inline distT="0" distB="0" distL="0" distR="0" wp14:anchorId="41F86328" wp14:editId="57C2412D">
             <wp:extent cx="5759450" cy="3023235"/>
@@ -3835,1076 +3414,319 @@
     </w:p>
     <w:p>
       <w:pPr>
-        <w:pStyle w:val="Heading1"/>
-      </w:pPr>
-      <w:bookmarkStart w:id="40" w:name="_Toc165969653"/>
-      <w:bookmarkStart w:id="41" w:name="_Toc242002490"/>
-      <w:r>
-        <w:t>Conclusion</w:t>
+        <w:pStyle w:val="Titre1"/>
+      </w:pPr>
+      <w:bookmarkStart w:id="40" w:name="_Toc242089351"/>
+      <w:r>
+        <w:t>CONCEPTION</w:t>
       </w:r>
       <w:bookmarkEnd w:id="40"/>
+    </w:p>
+    <w:p>
+      <w:pPr>
+        <w:pStyle w:val="Titre2"/>
+      </w:pPr>
+      <w:bookmarkStart w:id="41" w:name="_Toc242089352"/>
+      <w:r>
+        <w:t>Diagramme de classe :</w:t>
+      </w:r>
       <w:bookmarkEnd w:id="41"/>
-    </w:p>
-    <w:p>
-      <w:pPr>
-        <w:pStyle w:val="Heading2"/>
-      </w:pPr>
-      <w:bookmarkStart w:id="42" w:name="_Toc165969654"/>
-      <w:bookmarkStart w:id="43" w:name="_Toc242002491"/>
-      <w:r>
-        <w:t xml:space="preserve">Bilan des </w:t>
+      <w:r>
+        <w:t xml:space="preserve"> </w:t>
+      </w:r>
+    </w:p>
+    <w:p>
+      <w:pPr>
+        <w:pStyle w:val="Corpsdetexte"/>
+      </w:pPr>
+      <w:r>
+        <w:rPr>
+          <w:noProof/>
+        </w:rPr>
+        <w:drawing>
+          <wp:inline distT="0" distB="0" distL="0" distR="0" wp14:anchorId="11AA7C23" wp14:editId="16DFA91C">
+            <wp:extent cx="5759450" cy="2897505"/>
+            <wp:effectExtent l="0" t="0" r="0" b="0"/>
+            <wp:docPr id="1531506494" name="Image 1"/>
+            <wp:cNvGraphicFramePr>
+              <a:graphicFrameLocks xmlns:a="http://schemas.openxmlformats.org/drawingml/2006/main" noChangeAspect="1"/>
+            </wp:cNvGraphicFramePr>
+            <a:graphic xmlns:a="http://schemas.openxmlformats.org/drawingml/2006/main">
+              <a:graphicData uri="http://schemas.openxmlformats.org/drawingml/2006/picture">
+                <pic:pic xmlns:pic="http://schemas.openxmlformats.org/drawingml/2006/picture">
+                  <pic:nvPicPr>
+                    <pic:cNvPr id="1531506494" name=""/>
+                    <pic:cNvPicPr/>
+                  </pic:nvPicPr>
+                  <pic:blipFill>
+                    <a:blip r:embed="rId14"/>
+                    <a:stretch>
+                      <a:fillRect/>
+                    </a:stretch>
+                  </pic:blipFill>
+                  <pic:spPr>
+                    <a:xfrm>
+                      <a:off x="0" y="0"/>
+                      <a:ext cx="5759450" cy="2897505"/>
+                    </a:xfrm>
+                    <a:prstGeom prst="rect">
+                      <a:avLst/>
+                    </a:prstGeom>
+                  </pic:spPr>
+                </pic:pic>
+              </a:graphicData>
+            </a:graphic>
+          </wp:inline>
+        </w:drawing>
+      </w:r>
+    </w:p>
+    <w:p>
+      <w:pPr>
+        <w:pStyle w:val="Corpsdetexte"/>
+      </w:pPr>
+      <w:r>
+        <w:t xml:space="preserve">Fait sur looping, Toutes les classes sont reliées à la class Parking et sont accessible de toutes. Il n’y a que parking et ticket qui ont </w:t>
+      </w:r>
+      <w:r>
+        <w:t>des méthodes</w:t>
+      </w:r>
+      <w:r>
+        <w:t>.</w:t>
+      </w:r>
+    </w:p>
+    <w:p>
+      <w:r>
+        <w:br w:type="page"/>
+      </w:r>
+    </w:p>
+    <w:p>
+      <w:pPr>
+        <w:pStyle w:val="Corpsdetexte"/>
+      </w:pPr>
+    </w:p>
+    <w:p>
+      <w:pPr>
+        <w:pStyle w:val="Titre1"/>
+      </w:pPr>
+      <w:bookmarkStart w:id="42" w:name="_Toc242089353"/>
+      <w:r>
+        <w:t>Utilisation de l’IA</w:t>
       </w:r>
       <w:bookmarkEnd w:id="42"/>
-      <w:r>
-        <w:t>fonctionnalités demandées</w:t>
-      </w:r>
-      <w:bookmarkStart w:id="44" w:name="_Toc165969655"/>
-      <w:bookmarkStart w:id="45" w:name="_Toc242002492"/>
-      <w:bookmarkEnd w:id="43"/>
-    </w:p>
-    <w:p>
-      <w:r>
-        <w:t>Toutes les fonctionnalités demandées dans les spécifications de départ ont été réalisées.</w:t>
-      </w:r>
-    </w:p>
-    <w:p>
-      <w:pPr>
-        <w:ind w:left="567"/>
+    </w:p>
+    <w:p>
+      <w:pPr>
+        <w:pStyle w:val="Corpsdetexte"/>
+      </w:pPr>
+      <w:r>
         <w:rPr>
           <w:b/>
           <w:bCs/>
         </w:rPr>
+        <w:t>Nom</w:t>
+      </w:r>
+      <w:r>
+        <w:t xml:space="preserve"> : </w:t>
+      </w:r>
+      <w:proofErr w:type="spellStart"/>
+      <w:r>
+        <w:t>ChatGPT</w:t>
+      </w:r>
+      <w:proofErr w:type="spellEnd"/>
+    </w:p>
+    <w:p>
+      <w:pPr>
+        <w:pStyle w:val="Corpsdetexte"/>
       </w:pPr>
       <w:r>
         <w:rPr>
           <w:b/>
           <w:bCs/>
         </w:rPr>
-        <w:t>1. Entrer un véhicule</w:t>
-      </w:r>
-    </w:p>
-    <w:p>
-      <w:pPr>
-        <w:numPr>
-          <w:ilvl w:val="0"/>
-          <w:numId w:val="11"/>
-        </w:numPr>
-      </w:pPr>
-      <w:r>
-        <w:t>Saisie et vérification de la plaque d’immatriculation (2 lettres + jusqu’à 6 chiffres).</w:t>
-      </w:r>
-    </w:p>
-    <w:p>
-      <w:pPr>
-        <w:numPr>
-          <w:ilvl w:val="0"/>
-          <w:numId w:val="11"/>
-        </w:numPr>
-      </w:pPr>
-      <w:r>
-        <w:t>Attribution automatique d’une place.</w:t>
-      </w:r>
-    </w:p>
-    <w:p>
-      <w:pPr>
-        <w:numPr>
-          <w:ilvl w:val="0"/>
-          <w:numId w:val="11"/>
-        </w:numPr>
-      </w:pPr>
-      <w:r>
-        <w:t>Génération d’un ticket avec l’heure d’entrée, la place et le tarif horaire.</w:t>
-      </w:r>
-    </w:p>
-    <w:p>
-      <w:pPr>
-        <w:numPr>
-          <w:ilvl w:val="0"/>
-          <w:numId w:val="11"/>
-        </w:numPr>
+        <w:t>Prompt</w:t>
+      </w:r>
+      <w:r>
+        <w:t xml:space="preserve"> : </w:t>
+      </w:r>
+      <w:r>
+        <w:t xml:space="preserve">On dresse le bilan des tests effectués (qui, quand, avec quelles données…) sous forme de procédure. Lorsque cela est possible, fournir un tableau des tests effectués avec les résultats obtenus et les actions à entreprendre en conséquence (et une estimation de leur durée). Si des tests prévus dans la stratégie n'ont pas pu être effectués : raison, décisions, etc. Liste des bugs répertoriés avec la date de découverte et leur </w:t>
+      </w:r>
+      <w:r>
+        <w:t>état :</w:t>
+      </w:r>
+      <w:r>
+        <w:t xml:space="preserve"> Corrigé, date de correction, corrigé par, etc. fait moi un tableau </w:t>
+      </w:r>
+      <w:r>
+        <w:t>Excel</w:t>
+      </w:r>
+      <w:r>
+        <w:t xml:space="preserve"> de ça</w:t>
+      </w:r>
+    </w:p>
+    <w:p>
+      <w:pPr>
+        <w:pStyle w:val="Corpsdetexte"/>
       </w:pPr>
       <w:r>
         <w:rPr>
           <w:b/>
           <w:bCs/>
         </w:rPr>
-        <w:t>État :</w:t>
-      </w:r>
-      <w:r>
-        <w:t xml:space="preserve"> </w:t>
-      </w:r>
-      <w:r>
-        <w:rPr>
-          <w:rFonts w:ascii="Segoe UI Emoji" w:hAnsi="Segoe UI Emoji" w:cs="Segoe UI Emoji"/>
-        </w:rPr>
-        <w:t>✅</w:t>
-      </w:r>
-      <w:r>
-        <w:t xml:space="preserve"> R</w:t>
-      </w:r>
-      <w:r>
-        <w:rPr>
-          <w:rFonts w:ascii="Century Gothic" w:hAnsi="Century Gothic" w:cs="Century Gothic"/>
-        </w:rPr>
-        <w:t>é</w:t>
-      </w:r>
-      <w:r>
-        <w:t>ussi</w:t>
-      </w:r>
-    </w:p>
-    <w:p>
-      <w:pPr>
-        <w:numPr>
-          <w:ilvl w:val="0"/>
-          <w:numId w:val="11"/>
-        </w:numPr>
-      </w:pPr>
-      <w:r>
-        <w:rPr>
-          <w:b/>
-          <w:bCs/>
-        </w:rPr>
-        <w:t>Travail restant :</w:t>
-      </w:r>
-      <w:r>
-        <w:t xml:space="preserve"> 0 %</w:t>
-      </w:r>
-    </w:p>
-    <w:p>
-      <w:pPr>
-        <w:ind w:left="567"/>
-        <w:rPr>
-          <w:b/>
-          <w:bCs/>
-        </w:rPr>
-      </w:pPr>
-      <w:r>
-        <w:rPr>
-          <w:b/>
-          <w:bCs/>
-        </w:rPr>
-        <w:t>2. Enlever un véhicule</w:t>
-      </w:r>
-    </w:p>
-    <w:p>
-      <w:pPr>
-        <w:numPr>
-          <w:ilvl w:val="0"/>
-          <w:numId w:val="12"/>
-        </w:numPr>
-      </w:pPr>
-      <w:r>
-        <w:t>Recherche par plaque d’immatriculation ou numéro de place.</w:t>
-      </w:r>
-    </w:p>
-    <w:p>
-      <w:pPr>
-        <w:numPr>
-          <w:ilvl w:val="0"/>
-          <w:numId w:val="12"/>
-        </w:numPr>
-      </w:pPr>
-      <w:r>
-        <w:t>Affichage de l’heure d’entrée, de sortie, de la durée et du montant à payer.</w:t>
-      </w:r>
-    </w:p>
-    <w:p>
-      <w:pPr>
-        <w:numPr>
-          <w:ilvl w:val="0"/>
-          <w:numId w:val="12"/>
-        </w:numPr>
-      </w:pPr>
-      <w:r>
-        <w:t>Possibilité de simuler la durée de stationnement.</w:t>
-      </w:r>
-    </w:p>
-    <w:p>
-      <w:pPr>
-        <w:numPr>
-          <w:ilvl w:val="0"/>
-          <w:numId w:val="12"/>
-        </w:numPr>
-      </w:pPr>
-      <w:r>
-        <w:t>Confirmation demandée avant la sortie.</w:t>
-      </w:r>
-    </w:p>
-    <w:p>
-      <w:pPr>
-        <w:numPr>
-          <w:ilvl w:val="0"/>
-          <w:numId w:val="12"/>
-        </w:numPr>
-      </w:pPr>
-      <w:r>
-        <w:t>Libération automatique de la place après confirmation.</w:t>
-      </w:r>
-    </w:p>
-    <w:p>
-      <w:pPr>
-        <w:numPr>
-          <w:ilvl w:val="0"/>
-          <w:numId w:val="12"/>
-        </w:numPr>
-      </w:pPr>
-      <w:r>
-        <w:rPr>
-          <w:b/>
-          <w:bCs/>
-        </w:rPr>
-        <w:t>État :</w:t>
-      </w:r>
-      <w:r>
-        <w:t xml:space="preserve"> </w:t>
-      </w:r>
-      <w:r>
-        <w:rPr>
-          <w:rFonts w:ascii="Segoe UI Emoji" w:hAnsi="Segoe UI Emoji" w:cs="Segoe UI Emoji"/>
-        </w:rPr>
-        <w:t>✅</w:t>
-      </w:r>
-      <w:r>
-        <w:t xml:space="preserve"> R</w:t>
-      </w:r>
-      <w:r>
-        <w:rPr>
-          <w:rFonts w:ascii="Century Gothic" w:hAnsi="Century Gothic" w:cs="Century Gothic"/>
-        </w:rPr>
-        <w:t>é</w:t>
-      </w:r>
-      <w:r>
-        <w:t>ussi</w:t>
-      </w:r>
-    </w:p>
-    <w:p>
-      <w:pPr>
-        <w:numPr>
-          <w:ilvl w:val="0"/>
-          <w:numId w:val="12"/>
-        </w:numPr>
-      </w:pPr>
-      <w:r>
-        <w:rPr>
-          <w:b/>
-          <w:bCs/>
-        </w:rPr>
-        <w:t>Travail restant :</w:t>
-      </w:r>
-      <w:r>
-        <w:t xml:space="preserve"> 0 %</w:t>
-      </w:r>
-    </w:p>
-    <w:p>
-      <w:pPr>
-        <w:ind w:left="567"/>
-        <w:rPr>
-          <w:b/>
-          <w:bCs/>
-        </w:rPr>
-      </w:pPr>
-      <w:r>
-        <w:rPr>
-          <w:b/>
-          <w:bCs/>
-        </w:rPr>
-        <w:t>3. Afficher l’état du parking</w:t>
-      </w:r>
-    </w:p>
-    <w:p>
-      <w:pPr>
-        <w:numPr>
-          <w:ilvl w:val="0"/>
-          <w:numId w:val="13"/>
-        </w:numPr>
-      </w:pPr>
-      <w:r>
-        <w:t>Affichage du plan du parking.</w:t>
-      </w:r>
-    </w:p>
-    <w:p>
-      <w:pPr>
-        <w:numPr>
-          <w:ilvl w:val="0"/>
-          <w:numId w:val="13"/>
-        </w:numPr>
-      </w:pPr>
-      <w:r>
-        <w:t>Identification des places libres et occupées.</w:t>
-      </w:r>
-    </w:p>
-    <w:p>
-      <w:pPr>
-        <w:numPr>
-          <w:ilvl w:val="0"/>
-          <w:numId w:val="13"/>
-        </w:numPr>
-      </w:pPr>
-      <w:r>
-        <w:rPr>
-          <w:b/>
-          <w:bCs/>
-        </w:rPr>
-        <w:t>État :</w:t>
-      </w:r>
-      <w:r>
-        <w:t xml:space="preserve"> </w:t>
-      </w:r>
-      <w:r>
-        <w:rPr>
-          <w:rFonts w:ascii="Segoe UI Emoji" w:hAnsi="Segoe UI Emoji" w:cs="Segoe UI Emoji"/>
-        </w:rPr>
-        <w:t>✅</w:t>
-      </w:r>
-      <w:r>
-        <w:t xml:space="preserve"> R</w:t>
-      </w:r>
-      <w:r>
-        <w:rPr>
-          <w:rFonts w:ascii="Century Gothic" w:hAnsi="Century Gothic" w:cs="Century Gothic"/>
-        </w:rPr>
-        <w:t>é</w:t>
-      </w:r>
-      <w:r>
-        <w:t>ussi</w:t>
-      </w:r>
-    </w:p>
-    <w:p>
-      <w:pPr>
-        <w:numPr>
-          <w:ilvl w:val="0"/>
-          <w:numId w:val="13"/>
-        </w:numPr>
-      </w:pPr>
-      <w:r>
-        <w:rPr>
-          <w:b/>
-          <w:bCs/>
-        </w:rPr>
-        <w:t>Travail restant :</w:t>
-      </w:r>
-      <w:r>
-        <w:t xml:space="preserve"> 0 %</w:t>
-      </w:r>
-    </w:p>
-    <w:p>
-      <w:pPr>
-        <w:ind w:left="567"/>
-        <w:rPr>
-          <w:b/>
-          <w:bCs/>
-        </w:rPr>
-      </w:pPr>
-      <w:r>
-        <w:rPr>
-          <w:b/>
-          <w:bCs/>
-        </w:rPr>
-        <w:t>4. Rechercher un véhicule</w:t>
-      </w:r>
-    </w:p>
-    <w:p>
-      <w:pPr>
-        <w:numPr>
-          <w:ilvl w:val="0"/>
-          <w:numId w:val="14"/>
-        </w:numPr>
-      </w:pPr>
-      <w:r>
-        <w:t>Recherche par plaque d’immatriculation ou numéro de place.</w:t>
-      </w:r>
-    </w:p>
-    <w:p>
-      <w:pPr>
-        <w:numPr>
-          <w:ilvl w:val="0"/>
-          <w:numId w:val="14"/>
-        </w:numPr>
-      </w:pPr>
-      <w:r>
-        <w:t>Affichage de la plaque, de l’heure d’entrée, de la durée, du prix actuel et du numéro de place.</w:t>
-      </w:r>
-    </w:p>
-    <w:p>
-      <w:pPr>
-        <w:numPr>
-          <w:ilvl w:val="0"/>
-          <w:numId w:val="14"/>
-        </w:numPr>
-      </w:pPr>
-      <w:r>
-        <w:rPr>
-          <w:b/>
-          <w:bCs/>
-        </w:rPr>
-        <w:t>État :</w:t>
-      </w:r>
-      <w:r>
-        <w:t xml:space="preserve"> </w:t>
-      </w:r>
-      <w:r>
-        <w:rPr>
-          <w:rFonts w:ascii="Segoe UI Emoji" w:hAnsi="Segoe UI Emoji" w:cs="Segoe UI Emoji"/>
-        </w:rPr>
-        <w:t>✅</w:t>
-      </w:r>
-      <w:r>
-        <w:t xml:space="preserve"> R</w:t>
-      </w:r>
-      <w:r>
-        <w:rPr>
-          <w:rFonts w:ascii="Century Gothic" w:hAnsi="Century Gothic" w:cs="Century Gothic"/>
-        </w:rPr>
-        <w:t>é</w:t>
-      </w:r>
-      <w:r>
-        <w:t>ussi</w:t>
-      </w:r>
-    </w:p>
-    <w:p>
-      <w:pPr>
-        <w:numPr>
-          <w:ilvl w:val="0"/>
-          <w:numId w:val="14"/>
-        </w:numPr>
-      </w:pPr>
-      <w:r>
-        <w:rPr>
-          <w:b/>
-          <w:bCs/>
-        </w:rPr>
-        <w:t>Travail restant :</w:t>
-      </w:r>
-      <w:r>
-        <w:t xml:space="preserve"> 0 %</w:t>
-      </w:r>
-    </w:p>
-    <w:p>
-      <w:pPr>
-        <w:ind w:left="567"/>
-        <w:rPr>
-          <w:b/>
-          <w:bCs/>
-        </w:rPr>
-      </w:pPr>
-      <w:r>
-        <w:rPr>
-          <w:b/>
-          <w:bCs/>
-        </w:rPr>
-        <w:lastRenderedPageBreak/>
-        <w:t>5. Statistiques du jour</w:t>
-      </w:r>
-    </w:p>
-    <w:p>
-      <w:pPr>
-        <w:numPr>
-          <w:ilvl w:val="0"/>
-          <w:numId w:val="15"/>
-        </w:numPr>
-      </w:pPr>
-      <w:r>
-        <w:t>Affichage du nombre de places occupées.</w:t>
-      </w:r>
-    </w:p>
-    <w:p>
-      <w:pPr>
-        <w:numPr>
-          <w:ilvl w:val="0"/>
-          <w:numId w:val="15"/>
-        </w:numPr>
-      </w:pPr>
-      <w:r>
-        <w:t>Affichage du pourcentage d’occupation.</w:t>
-      </w:r>
-    </w:p>
-    <w:p>
-      <w:pPr>
-        <w:numPr>
-          <w:ilvl w:val="0"/>
-          <w:numId w:val="15"/>
-        </w:numPr>
-      </w:pPr>
-      <w:r>
-        <w:t>Affichage du montant total payé.</w:t>
-      </w:r>
-    </w:p>
-    <w:p>
-      <w:pPr>
-        <w:numPr>
-          <w:ilvl w:val="0"/>
-          <w:numId w:val="15"/>
-        </w:numPr>
-      </w:pPr>
-      <w:r>
-        <w:t>Affichage de la durée actuelle de stationnement des véhicules.</w:t>
-      </w:r>
-    </w:p>
-    <w:p>
-      <w:pPr>
-        <w:numPr>
-          <w:ilvl w:val="0"/>
-          <w:numId w:val="15"/>
-        </w:numPr>
-      </w:pPr>
-      <w:r>
-        <w:rPr>
-          <w:b/>
-          <w:bCs/>
-        </w:rPr>
-        <w:t>État :</w:t>
-      </w:r>
-      <w:r>
-        <w:t xml:space="preserve"> </w:t>
-      </w:r>
-      <w:r>
-        <w:rPr>
-          <w:rFonts w:ascii="Segoe UI Emoji" w:hAnsi="Segoe UI Emoji" w:cs="Segoe UI Emoji"/>
-        </w:rPr>
-        <w:t>✅</w:t>
-      </w:r>
-      <w:r>
-        <w:t xml:space="preserve"> R</w:t>
-      </w:r>
-      <w:r>
-        <w:rPr>
-          <w:rFonts w:ascii="Century Gothic" w:hAnsi="Century Gothic" w:cs="Century Gothic"/>
-        </w:rPr>
-        <w:t>é</w:t>
-      </w:r>
-      <w:r>
-        <w:t>ussi</w:t>
-      </w:r>
-    </w:p>
-    <w:p>
-      <w:pPr>
-        <w:numPr>
-          <w:ilvl w:val="0"/>
-          <w:numId w:val="15"/>
-        </w:numPr>
-      </w:pPr>
-      <w:r>
-        <w:rPr>
-          <w:b/>
-          <w:bCs/>
-        </w:rPr>
-        <w:t>Travail restant :</w:t>
-      </w:r>
-      <w:r>
-        <w:t xml:space="preserve"> 0 %</w:t>
-      </w:r>
-    </w:p>
-    <w:p>
-      <w:pPr>
-        <w:ind w:left="567"/>
-        <w:rPr>
-          <w:b/>
-          <w:bCs/>
-        </w:rPr>
-      </w:pPr>
-      <w:r>
-        <w:rPr>
-          <w:b/>
-          <w:bCs/>
-        </w:rPr>
-        <w:t>6. Historique des transactions</w:t>
-      </w:r>
-    </w:p>
-    <w:p>
-      <w:pPr>
-        <w:numPr>
-          <w:ilvl w:val="0"/>
-          <w:numId w:val="16"/>
-        </w:numPr>
-      </w:pPr>
-      <w:r>
-        <w:t>Affichage des entrées : heure d’entrée, plaque et numéro de place.</w:t>
-      </w:r>
-    </w:p>
-    <w:p>
-      <w:pPr>
-        <w:numPr>
-          <w:ilvl w:val="0"/>
-          <w:numId w:val="16"/>
-        </w:numPr>
-      </w:pPr>
-      <w:r>
-        <w:t xml:space="preserve">Affichage des sorties : heure de sortie, plaque, numéro de place et montant </w:t>
+        <w:t>Pourquoi</w:t>
+      </w:r>
+      <w:r>
+        <w:t xml:space="preserve"> : J’ai utilisé </w:t>
+      </w:r>
+      <w:r>
+        <w:t>l’IA</w:t>
+      </w:r>
+      <w:r>
+        <w:t xml:space="preserve"> pour me faire un modèle de tableau pour les tests unitaires.</w:t>
+      </w:r>
+    </w:p>
+    <w:p>
+      <w:pPr>
+        <w:pStyle w:val="Corpsdetexte"/>
+      </w:pPr>
+    </w:p>
+    <w:p>
+      <w:pPr>
+        <w:pStyle w:val="Corpsdetexte"/>
+      </w:pPr>
+    </w:p>
+    <w:p>
+      <w:pPr>
+        <w:pStyle w:val="Titre1"/>
+      </w:pPr>
+      <w:bookmarkStart w:id="43" w:name="_Toc242089354"/>
+      <w:r>
+        <w:t>Bi</w:t>
+      </w:r>
+      <w:r>
+        <w:t>lan déroulement</w:t>
+      </w:r>
+      <w:bookmarkEnd w:id="43"/>
+    </w:p>
+    <w:p>
+      <w:pPr>
+        <w:pStyle w:val="Corpsdetexte"/>
+      </w:pPr>
+      <w:r>
+        <w:t>La planification était finalement très surestimée car finalement j’ai réussi à finir tous les objectifs le 4 octobre au lieu du 30 octobre.</w:t>
+      </w:r>
+    </w:p>
+    <w:p>
+      <w:pPr>
+        <w:pStyle w:val="Corpsdetexte"/>
+      </w:pPr>
+      <w:r>
+        <w:t>Ma méthodologie était de simplement suivre les points de ma planification et dès que je terminais une étape, je la mettais en « Effectué » puis je remplissais mon journal de travail et finalement mon commit.</w:t>
+      </w:r>
+    </w:p>
+    <w:p>
+      <w:pPr>
+        <w:pStyle w:val="Corpsdetexte"/>
+      </w:pPr>
+      <w:r>
+        <w:t>Je n’ai pas rencontré de problème durant le proje</w:t>
+      </w:r>
+      <w:r>
+        <w:t>t</w:t>
+      </w:r>
+      <w:r>
+        <w:t>.</w:t>
+      </w:r>
+    </w:p>
+    <w:p>
+      <w:pPr>
+        <w:pStyle w:val="Corpsdetexte"/>
+      </w:pPr>
+    </w:p>
+    <w:p>
+      <w:pPr>
+        <w:pStyle w:val="Corpsdetexte"/>
+      </w:pPr>
+    </w:p>
+    <w:p>
+      <w:pPr>
+        <w:pStyle w:val="Titre1"/>
+      </w:pPr>
+      <w:bookmarkStart w:id="44" w:name="_Toc242089355"/>
+      <w:r>
+        <w:t>Bilan produit</w:t>
+      </w:r>
+      <w:bookmarkEnd w:id="44"/>
+    </w:p>
+    <w:p>
+      <w:pPr>
+        <w:pStyle w:val="Corpsdetexte"/>
+      </w:pPr>
+      <w:r>
+        <w:t>Tous les objectifs ont été fait et à 100%.</w:t>
+      </w:r>
+    </w:p>
+    <w:p>
+      <w:pPr>
+        <w:pStyle w:val="Corpsdetexte"/>
+      </w:pPr>
+      <w:r>
+        <w:t>Tous les objectifs que j’avais mis je les ai suivis à la lettre, quasiment aucune modification n’a été faite sur les objectifs de la planification.</w:t>
+      </w:r>
+    </w:p>
+    <w:p>
+      <w:pPr>
+        <w:pStyle w:val="Titre1"/>
+      </w:pPr>
+      <w:bookmarkStart w:id="45" w:name="_Toc165969653"/>
+      <w:bookmarkStart w:id="46" w:name="_Toc242089356"/>
+      <w:r>
+        <w:t>Conclusion</w:t>
+      </w:r>
+      <w:bookmarkEnd w:id="45"/>
+      <w:bookmarkEnd w:id="46"/>
+    </w:p>
+    <w:p>
+      <w:pPr>
+        <w:pStyle w:val="Corpsdetexte"/>
+      </w:pPr>
+      <w:r>
+        <w:t xml:space="preserve">Le projet c’est très bien déroulé, tous les objectifs ont été rempli à 100% et dans les temps. L’utilisation de l’IA était plus que correcte. J’ai détaillé le plus possible mon journal de travail et j’ai respecté la norme pour les commit et les ai </w:t>
       </w:r>
       <w:proofErr w:type="gramStart"/>
       <w:r>
-        <w:t>payé</w:t>
+        <w:t>fait</w:t>
       </w:r>
       <w:proofErr w:type="gramEnd"/>
       <w:r>
-        <w:t>.</w:t>
-      </w:r>
-    </w:p>
-    <w:p>
-      <w:pPr>
-        <w:numPr>
-          <w:ilvl w:val="0"/>
-          <w:numId w:val="16"/>
-        </w:numPr>
-      </w:pPr>
-      <w:r>
-        <w:rPr>
-          <w:b/>
-          <w:bCs/>
-        </w:rPr>
-        <w:t>État :</w:t>
-      </w:r>
-      <w:r>
-        <w:t xml:space="preserve"> </w:t>
-      </w:r>
-      <w:r>
-        <w:rPr>
-          <w:rFonts w:ascii="Segoe UI Emoji" w:hAnsi="Segoe UI Emoji" w:cs="Segoe UI Emoji"/>
-        </w:rPr>
-        <w:t>✅</w:t>
-      </w:r>
-      <w:r>
-        <w:t xml:space="preserve"> R</w:t>
-      </w:r>
-      <w:r>
-        <w:rPr>
-          <w:rFonts w:ascii="Century Gothic" w:hAnsi="Century Gothic" w:cs="Century Gothic"/>
-        </w:rPr>
-        <w:t>é</w:t>
-      </w:r>
-      <w:r>
-        <w:t>ussi</w:t>
-      </w:r>
-    </w:p>
-    <w:p>
-      <w:pPr>
-        <w:numPr>
-          <w:ilvl w:val="0"/>
-          <w:numId w:val="16"/>
-        </w:numPr>
-      </w:pPr>
-      <w:r>
-        <w:rPr>
-          <w:b/>
-          <w:bCs/>
-        </w:rPr>
-        <w:t>Travail restant :</w:t>
-      </w:r>
-      <w:r>
-        <w:t xml:space="preserve"> 0 %</w:t>
-      </w:r>
-    </w:p>
-    <w:p>
-      <w:pPr>
-        <w:ind w:left="567"/>
-        <w:rPr>
-          <w:b/>
-          <w:bCs/>
-        </w:rPr>
-      </w:pPr>
-      <w:r>
-        <w:rPr>
-          <w:b/>
-          <w:bCs/>
-        </w:rPr>
-        <w:t>Conclusion</w:t>
-      </w:r>
-    </w:p>
-    <w:p>
-      <w:pPr>
-        <w:numPr>
-          <w:ilvl w:val="0"/>
-          <w:numId w:val="17"/>
-        </w:numPr>
-      </w:pPr>
-      <w:r>
-        <w:rPr>
-          <w:b/>
-          <w:bCs/>
-        </w:rPr>
-        <w:t>Taux de réalisation global : 100 %</w:t>
-      </w:r>
-    </w:p>
-    <w:p>
-      <w:pPr>
-        <w:numPr>
-          <w:ilvl w:val="0"/>
-          <w:numId w:val="17"/>
-        </w:numPr>
-      </w:pPr>
-      <w:r>
-        <w:rPr>
-          <w:b/>
-          <w:bCs/>
-        </w:rPr>
-        <w:t>Travail supplémentaire nécessaire : 0 %</w:t>
-      </w:r>
-    </w:p>
-    <w:p/>
-    <w:p>
-      <w:pPr>
-        <w:pStyle w:val="Heading2"/>
-      </w:pPr>
-      <w:r>
-        <w:t>Bilan de la planification</w:t>
-      </w:r>
-      <w:bookmarkEnd w:id="44"/>
-      <w:bookmarkEnd w:id="45"/>
+        <w:t xml:space="preserve"> atomiquement. </w:t>
+      </w:r>
+    </w:p>
+    <w:p>
+      <w:pPr>
+        <w:pStyle w:val="Corpsdetexte"/>
+      </w:pPr>
+      <w:r>
+        <w:t xml:space="preserve">Si c’était à refaire j’aurais commencé à commenter mon code dès le début et non à la fin comme je l’ai fait. J’aurais aussi rendu plus atomique </w:t>
+      </w:r>
+      <w:proofErr w:type="gramStart"/>
+      <w:r>
+        <w:t>mes méthode</w:t>
+      </w:r>
+      <w:proofErr w:type="gramEnd"/>
+      <w:r>
+        <w:t xml:space="preserve"> dès le départ.</w:t>
+      </w:r>
     </w:p>
     <w:p>
       <w:pPr>
         <w:pStyle w:val="Informations"/>
-        <w:numPr>
-          <w:ilvl w:val="5"/>
-          <w:numId w:val="8"/>
-        </w:numPr>
-      </w:pPr>
-      <w:r>
-        <w:t xml:space="preserve">Distinguer </w:t>
-      </w:r>
-      <w:r>
-        <w:t xml:space="preserve">et expliquer </w:t>
-      </w:r>
-      <w:r>
-        <w:t xml:space="preserve">les tâches qui ont généré des retards ou de l'avance dans la </w:t>
-      </w:r>
-      <w:r>
-        <w:t>gestion du</w:t>
-      </w:r>
-      <w:r>
-        <w:t xml:space="preserve"> projet.</w:t>
-      </w:r>
-      <w:r>
-        <w:t xml:space="preserve"> Indiquer </w:t>
-      </w:r>
-      <w:proofErr w:type="gramStart"/>
-      <w:r>
-        <w:t>les différence</w:t>
-      </w:r>
-      <w:proofErr w:type="gramEnd"/>
-      <w:r>
-        <w:t xml:space="preserve"> entre les planifications initiales et détaillées avec le journal de travail.</w:t>
-      </w:r>
-    </w:p>
-    <w:p>
-      <w:pPr>
-        <w:pStyle w:val="Heading2"/>
-      </w:pPr>
-      <w:bookmarkStart w:id="46" w:name="_Toc165969656"/>
-      <w:bookmarkStart w:id="47" w:name="_Toc242002493"/>
-      <w:r>
-        <w:t>Bilan personnel</w:t>
-      </w:r>
-      <w:bookmarkEnd w:id="46"/>
-      <w:bookmarkEnd w:id="47"/>
-    </w:p>
-    <w:p>
-      <w:pPr>
-        <w:pStyle w:val="Informations"/>
-        <w:numPr>
-          <w:ilvl w:val="5"/>
-          <w:numId w:val="8"/>
-        </w:numPr>
-      </w:pPr>
-      <w:r>
-        <w:t xml:space="preserve">Si c’était à </w:t>
-      </w:r>
-      <w:proofErr w:type="gramStart"/>
-      <w:r>
-        <w:t>refaire</w:t>
-      </w:r>
-      <w:r>
-        <w:t>:</w:t>
-      </w:r>
-      <w:proofErr w:type="gramEnd"/>
-    </w:p>
-    <w:p>
-      <w:pPr>
-        <w:pStyle w:val="Informations"/>
-        <w:numPr>
-          <w:ilvl w:val="6"/>
-          <w:numId w:val="8"/>
-        </w:numPr>
-      </w:pPr>
-      <w:r>
-        <w:t>Q</w:t>
-      </w:r>
-      <w:r>
-        <w:t xml:space="preserve">u’est-ce </w:t>
-      </w:r>
-      <w:r>
-        <w:t>qu’il faudrait garder</w:t>
-      </w:r>
-      <w:r>
-        <w:t> </w:t>
-      </w:r>
-      <w:r>
-        <w:t>? Les</w:t>
-      </w:r>
-      <w:r>
-        <w:t xml:space="preserve"> plus et les moins ?</w:t>
-      </w:r>
-    </w:p>
-    <w:p>
-      <w:pPr>
-        <w:pStyle w:val="Informations"/>
-        <w:numPr>
-          <w:ilvl w:val="6"/>
-          <w:numId w:val="8"/>
-        </w:numPr>
-      </w:pPr>
-      <w:r>
-        <w:t>Q</w:t>
-      </w:r>
-      <w:r>
-        <w:t xml:space="preserve">u’est-ce </w:t>
-      </w:r>
-      <w:r>
-        <w:t>qu’il faudrait gérer, réaliser ou traiter différemment ?</w:t>
-      </w:r>
-    </w:p>
-    <w:p>
-      <w:pPr>
-        <w:pStyle w:val="Informations"/>
-        <w:numPr>
-          <w:ilvl w:val="5"/>
-          <w:numId w:val="8"/>
-        </w:numPr>
-      </w:pPr>
-      <w:r>
-        <w:t>Qu’est que ce projet m’a appris ?</w:t>
-      </w:r>
-    </w:p>
-    <w:p>
-      <w:pPr>
-        <w:pStyle w:val="Informations"/>
-        <w:numPr>
-          <w:ilvl w:val="5"/>
-          <w:numId w:val="8"/>
-        </w:numPr>
-      </w:pPr>
-      <w:proofErr w:type="gramStart"/>
-      <w:r>
-        <w:t>Suite à</w:t>
-      </w:r>
-      <w:proofErr w:type="gramEnd"/>
-      <w:r>
-        <w:t xml:space="preserve"> donner, améliorations souhaitables, …</w:t>
-      </w:r>
-    </w:p>
-    <w:p>
-      <w:pPr>
-        <w:pStyle w:val="Informations"/>
-        <w:numPr>
-          <w:ilvl w:val="5"/>
-          <w:numId w:val="8"/>
-        </w:numPr>
-      </w:pPr>
-      <w:r>
-        <w:t>Remerciements, signature, etc.</w:t>
-      </w:r>
-    </w:p>
-    <w:p>
-      <w:pPr>
-        <w:pStyle w:val="Heading1"/>
-      </w:pPr>
-      <w:bookmarkStart w:id="48" w:name="_Toc532179971"/>
-      <w:bookmarkStart w:id="49" w:name="_Toc165969657"/>
-      <w:bookmarkStart w:id="50" w:name="_Toc242002494"/>
-      <w:r>
-        <w:t>Divers</w:t>
-      </w:r>
-      <w:bookmarkEnd w:id="48"/>
-      <w:bookmarkEnd w:id="49"/>
-      <w:bookmarkEnd w:id="50"/>
-    </w:p>
-    <w:p>
-      <w:pPr>
-        <w:pStyle w:val="Heading2"/>
-      </w:pPr>
-      <w:bookmarkStart w:id="51" w:name="_Toc532179972"/>
-      <w:bookmarkStart w:id="52" w:name="_Toc165969658"/>
-      <w:bookmarkStart w:id="53" w:name="_Toc242002495"/>
-      <w:r>
-        <w:t>Journal de travail</w:t>
-      </w:r>
-      <w:bookmarkEnd w:id="51"/>
-      <w:bookmarkEnd w:id="52"/>
-      <w:bookmarkEnd w:id="53"/>
-    </w:p>
-    <w:p>
-      <w:pPr>
-        <w:pStyle w:val="Informations"/>
-        <w:numPr>
-          <w:ilvl w:val="5"/>
-          <w:numId w:val="9"/>
-        </w:numPr>
-      </w:pPr>
-      <w:r>
-        <w:t>Date, activité</w:t>
-      </w:r>
-      <w:r>
-        <w:t xml:space="preserve"> (description qui permet</w:t>
-      </w:r>
-      <w:r>
-        <w:t xml:space="preserve"> de reproduire le cheminement du projet)</w:t>
-      </w:r>
-      <w:r>
-        <w:t>, durée</w:t>
-      </w:r>
-      <w:r>
-        <w:t>, liens et références sur des documents externes</w:t>
-      </w:r>
-      <w:r>
-        <w:t>.</w:t>
-      </w:r>
-      <w:r>
-        <w:t xml:space="preserve"> Lorsqu’une activité de recherches a été entreprise, il convient d’énumérer ce qui a été trouvé, avec les références.</w:t>
-      </w:r>
-    </w:p>
-    <w:p>
-      <w:pPr>
-        <w:pStyle w:val="Heading2"/>
-      </w:pPr>
-      <w:bookmarkStart w:id="54" w:name="_Toc242002496"/>
-      <w:r>
-        <w:t>Bibliographie</w:t>
-      </w:r>
-      <w:bookmarkEnd w:id="54"/>
-    </w:p>
-    <w:p>
-      <w:pPr>
-        <w:pStyle w:val="Informations"/>
-        <w:numPr>
-          <w:ilvl w:val="5"/>
-          <w:numId w:val="9"/>
-        </w:numPr>
-      </w:pPr>
-      <w:r>
-        <w:t>Références des livres</w:t>
-      </w:r>
-      <w:r>
-        <w:t>, revues et publications</w:t>
-      </w:r>
-      <w:r>
-        <w:t xml:space="preserve"> u</w:t>
-      </w:r>
-      <w:r>
-        <w:t>tilisés durant le projet.</w:t>
-      </w:r>
-    </w:p>
-    <w:p>
-      <w:pPr>
-        <w:pStyle w:val="Heading2"/>
-      </w:pPr>
-      <w:bookmarkStart w:id="55" w:name="_Toc242002497"/>
-      <w:r>
-        <w:t>Webographie</w:t>
-      </w:r>
-      <w:bookmarkEnd w:id="55"/>
-    </w:p>
-    <w:p>
-      <w:pPr>
-        <w:pStyle w:val="Informations"/>
-        <w:numPr>
-          <w:ilvl w:val="5"/>
-          <w:numId w:val="9"/>
-        </w:numPr>
-      </w:pPr>
-      <w:r>
-        <w:t>Références des sites Internet consultés durant le projet.</w:t>
-      </w:r>
-    </w:p>
-    <w:p>
-      <w:pPr>
-        <w:pStyle w:val="Heading1"/>
-      </w:pPr>
-      <w:bookmarkStart w:id="56" w:name="_Toc242002498"/>
-      <w:r>
-        <w:t>Annexes</w:t>
-      </w:r>
-      <w:bookmarkEnd w:id="56"/>
-    </w:p>
-    <w:p>
-      <w:pPr>
-        <w:pStyle w:val="Informations"/>
-        <w:numPr>
-          <w:ilvl w:val="5"/>
-          <w:numId w:val="9"/>
-        </w:numPr>
-      </w:pPr>
-      <w:proofErr w:type="gramStart"/>
-      <w:r>
-        <w:t>Listing</w:t>
-      </w:r>
-      <w:proofErr w:type="gramEnd"/>
-      <w:r>
-        <w:t xml:space="preserve"> du code source (partiel ou, plus rarement complet)</w:t>
-      </w:r>
-    </w:p>
-    <w:p>
-      <w:pPr>
-        <w:pStyle w:val="Informations"/>
-        <w:numPr>
-          <w:ilvl w:val="5"/>
-          <w:numId w:val="9"/>
-        </w:numPr>
-      </w:pPr>
-      <w:r>
-        <w:t>Guide</w:t>
-      </w:r>
-      <w:r>
-        <w:t>(s)</w:t>
-      </w:r>
-      <w:r>
-        <w:t xml:space="preserve"> d’utilisation et/ou guide de l’administrateur</w:t>
-      </w:r>
-    </w:p>
-    <w:p>
-      <w:pPr>
-        <w:pStyle w:val="Informations"/>
-        <w:numPr>
-          <w:ilvl w:val="5"/>
-          <w:numId w:val="9"/>
-        </w:numPr>
-      </w:pPr>
-      <w:r>
-        <w:t>Etat ou</w:t>
-      </w:r>
-      <w:r>
-        <w:t xml:space="preserve"> « dump » </w:t>
-      </w:r>
-      <w:r>
-        <w:t xml:space="preserve">de la configuration </w:t>
-      </w:r>
-      <w:r>
-        <w:t>des équipements</w:t>
-      </w:r>
-      <w:r>
-        <w:t xml:space="preserve"> (routeur, switch, robot, etc.).</w:t>
-      </w:r>
-    </w:p>
-    <w:p>
-      <w:pPr>
-        <w:pStyle w:val="Informations"/>
-        <w:numPr>
-          <w:ilvl w:val="5"/>
-          <w:numId w:val="9"/>
-        </w:numPr>
-      </w:pPr>
-      <w:r>
-        <w:t>Extraits</w:t>
-      </w:r>
-      <w:r>
-        <w:t xml:space="preserve"> de catalogue, documentation de fabricant</w:t>
-      </w:r>
-      <w:r>
-        <w:t>, etc.</w:t>
-      </w:r>
+        <w:ind w:left="2160"/>
+      </w:pPr>
     </w:p>
     <w:sectPr>
-      <w:headerReference w:type="default" r:id="rId14"/>
-      <w:footerReference w:type="default" r:id="rId15"/>
+      <w:headerReference w:type="default" r:id="rId15"/>
+      <w:footerReference w:type="default" r:id="rId16"/>
       <w:pgSz w:w="11906" w:h="16838" w:code="9"/>
       <w:pgMar w:top="1418" w:right="1418" w:bottom="1418" w:left="1418" w:header="709" w:footer="709" w:gutter="0"/>
       <w:cols w:space="708"/>
@@ -4938,7 +3760,7 @@
 <w:ftr xmlns:wpc="http://schemas.microsoft.com/office/word/2010/wordprocessingCanvas" xmlns:cx="http://schemas.microsoft.com/office/drawing/2014/chartex" xmlns:cx1="http://schemas.microsoft.com/office/drawing/2015/9/8/chartex" xmlns:cx2="http://schemas.microsoft.com/office/drawing/2015/10/21/chartex" xmlns:cx3="http://schemas.microsoft.com/office/drawing/2016/5/9/chartex" xmlns:cx4="http://schemas.microsoft.com/office/drawing/2016/5/10/chartex" xmlns:cx5="http://schemas.microsoft.com/office/drawing/2016/5/11/chartex" xmlns:cx6="http://schemas.microsoft.com/office/drawing/2016/5/12/chartex" xmlns:cx7="http://schemas.microsoft.com/office/drawing/2016/5/13/chartex" xmlns:cx8="http://schemas.microsoft.com/office/drawing/2016/5/14/chartex" xmlns:mc="http://schemas.openxmlformats.org/markup-compatibility/2006" xmlns:aink="http://schemas.microsoft.com/office/drawing/2016/ink" xmlns:am3d="http://schemas.microsoft.com/office/drawing/2017/model3d" xmlns:o="urn:schemas-microsoft-com:office:office" xmlns:oel="http://schemas.microsoft.com/office/2019/extlst" xmlns:r="http://schemas.openxmlformats.org/officeDocument/2006/relationships" xmlns:m="http://schemas.openxmlformats.org/officeDocument/2006/math" xmlns:v="urn:schemas-microsoft-com:vml" xmlns:wp14="http://schemas.microsoft.com/office/word/2010/wordprocessingDrawing" xmlns:wp="http://schemas.openxmlformats.org/drawingml/2006/wordprocessingDrawing" xmlns:w10="urn:schemas-microsoft-com:office:word" xmlns:w="http://schemas.openxmlformats.org/wordprocessingml/2006/main" xmlns:w14="http://schemas.microsoft.com/office/word/2010/wordml" xmlns:w15="http://schemas.microsoft.com/office/word/2012/wordml" xmlns:w16cex="http://schemas.microsoft.com/office/word/2018/wordml/cex" xmlns:w16cid="http://schemas.microsoft.com/office/word/2016/wordml/cid" xmlns:w16="http://schemas.microsoft.com/office/word/2018/wordml" xmlns:w16du="http://schemas.microsoft.com/office/word/2023/wordml/word16du" xmlns:w16sdtdh="http://schemas.microsoft.com/office/word/2020/wordml/sdtdatahash" xmlns:w16sdtfl="http://schemas.microsoft.com/office/word/2024/wordml/sdtformatlock" xmlns:w16se="http://schemas.microsoft.com/office/word/2015/wordml/symex" xmlns:wpg="http://schemas.microsoft.com/office/word/2010/wordprocessingGroup" xmlns:wpi="http://schemas.microsoft.com/office/word/2010/wordprocessingInk" xmlns:wne="http://schemas.microsoft.com/office/word/2006/wordml" xmlns:wps="http://schemas.microsoft.com/office/word/2010/wordprocessingShape" mc:Ignorable="w14 w15 w16se w16cid w16 w16cex w16sdtdh w16sdtfl w16du wp14">
   <w:tbl>
     <w:tblPr>
-      <w:tblStyle w:val="TableGrid"/>
+      <w:tblStyle w:val="Grilledutableau"/>
       <w:tblW w:w="5000" w:type="pct"/>
       <w:jc w:val="center"/>
       <w:tblBorders>
@@ -4983,7 +3805,6 @@
             <w:r>
               <w:rPr>
                 <w:rFonts w:cs="Arial"/>
-                <w:noProof/>
                 <w:szCs w:val="16"/>
               </w:rPr>
               <w:t>Hugo Schweizer</w:t>
@@ -5035,14 +3856,7 @@
               <w:rFonts w:cs="Arial"/>
               <w:szCs w:val="16"/>
             </w:rPr>
-            <w:t>Création</w:t>
-          </w:r>
-          <w:r>
-            <w:rPr>
-              <w:rFonts w:cs="Arial"/>
-              <w:szCs w:val="16"/>
-            </w:rPr>
-            <w:t xml:space="preserve"> : </w:t>
+            <w:t xml:space="preserve">Création : </w:t>
           </w:r>
           <w:r>
             <w:rPr>
@@ -5068,7 +3882,6 @@
           <w:r>
             <w:rPr>
               <w:rFonts w:cs="Arial"/>
-              <w:noProof/>
               <w:szCs w:val="16"/>
             </w:rPr>
             <w:t>28.08.2026</w:t>
@@ -5116,7 +3929,6 @@
           <w:r>
             <w:rPr>
               <w:rFonts w:cs="Arial"/>
-              <w:noProof/>
               <w:szCs w:val="16"/>
             </w:rPr>
             <w:fldChar w:fldCharType="end"/>
@@ -5146,7 +3958,7 @@
           </w:r>
           <w:r>
             <w:rPr>
-              <w:rStyle w:val="PageNumber"/>
+              <w:rStyle w:val="Numrodepage"/>
               <w:rFonts w:cs="Arial"/>
               <w:szCs w:val="16"/>
             </w:rPr>
@@ -5154,7 +3966,7 @@
           </w:r>
           <w:r>
             <w:rPr>
-              <w:rStyle w:val="PageNumber"/>
+              <w:rStyle w:val="Numrodepage"/>
               <w:rFonts w:cs="Arial"/>
               <w:szCs w:val="16"/>
             </w:rPr>
@@ -5162,7 +3974,7 @@
           </w:r>
           <w:r>
             <w:rPr>
-              <w:rStyle w:val="PageNumber"/>
+              <w:rStyle w:val="Numrodepage"/>
               <w:rFonts w:cs="Arial"/>
               <w:szCs w:val="16"/>
             </w:rPr>
@@ -5170,16 +3982,15 @@
           </w:r>
           <w:r>
             <w:rPr>
-              <w:rStyle w:val="PageNumber"/>
+              <w:rStyle w:val="Numrodepage"/>
               <w:rFonts w:cs="Arial"/>
-              <w:noProof/>
               <w:szCs w:val="16"/>
             </w:rPr>
             <w:t>6</w:t>
           </w:r>
           <w:r>
             <w:rPr>
-              <w:rStyle w:val="PageNumber"/>
+              <w:rStyle w:val="Numrodepage"/>
               <w:rFonts w:cs="Arial"/>
               <w:szCs w:val="16"/>
             </w:rPr>
@@ -5187,7 +3998,7 @@
           </w:r>
           <w:r>
             <w:rPr>
-              <w:rStyle w:val="PageNumber"/>
+              <w:rStyle w:val="Numrodepage"/>
               <w:rFonts w:cs="Arial"/>
               <w:szCs w:val="16"/>
             </w:rPr>
@@ -5195,7 +4006,7 @@
           </w:r>
           <w:r>
             <w:rPr>
-              <w:rStyle w:val="PageNumber"/>
+              <w:rStyle w:val="Numrodepage"/>
               <w:rFonts w:cs="Arial"/>
               <w:szCs w:val="16"/>
             </w:rPr>
@@ -5203,7 +4014,7 @@
           </w:r>
           <w:r>
             <w:rPr>
-              <w:rStyle w:val="PageNumber"/>
+              <w:rStyle w:val="Numrodepage"/>
               <w:rFonts w:cs="Arial"/>
               <w:szCs w:val="16"/>
             </w:rPr>
@@ -5211,7 +4022,7 @@
           </w:r>
           <w:r>
             <w:rPr>
-              <w:rStyle w:val="PageNumber"/>
+              <w:rStyle w:val="Numrodepage"/>
               <w:rFonts w:cs="Arial"/>
               <w:szCs w:val="16"/>
             </w:rPr>
@@ -5219,16 +4030,15 @@
           </w:r>
           <w:r>
             <w:rPr>
-              <w:rStyle w:val="PageNumber"/>
+              <w:rStyle w:val="Numrodepage"/>
               <w:rFonts w:cs="Arial"/>
-              <w:noProof/>
               <w:szCs w:val="16"/>
             </w:rPr>
             <w:t>6</w:t>
           </w:r>
           <w:r>
             <w:rPr>
-              <w:rStyle w:val="PageNumber"/>
+              <w:rStyle w:val="Numrodepage"/>
               <w:rFonts w:cs="Arial"/>
               <w:szCs w:val="16"/>
             </w:rPr>
@@ -5255,14 +4065,7 @@
               <w:rFonts w:cs="Arial"/>
               <w:szCs w:val="16"/>
             </w:rPr>
-            <w:t>Impression</w:t>
-          </w:r>
-          <w:r>
-            <w:rPr>
-              <w:rFonts w:cs="Arial"/>
-              <w:szCs w:val="16"/>
-            </w:rPr>
-            <w:t xml:space="preserve"> : </w:t>
+            <w:t xml:space="preserve">Impression : </w:t>
           </w:r>
           <w:r>
             <w:rPr>
@@ -5288,10 +4091,25 @@
           <w:r>
             <w:rPr>
               <w:rFonts w:cs="Arial"/>
-              <w:noProof/>
               <w:szCs w:val="16"/>
             </w:rPr>
-            <w:t>04.09.2009 15:21</w:t>
+            <w:t xml:space="preserve">04.09.2009 </w:t>
+          </w:r>
+          <w:proofErr w:type="gramStart"/>
+          <w:r>
+            <w:rPr>
+              <w:rFonts w:cs="Arial"/>
+              <w:szCs w:val="16"/>
+            </w:rPr>
+            <w:t>15:</w:t>
+          </w:r>
+          <w:proofErr w:type="gramEnd"/>
+          <w:r>
+            <w:rPr>
+              <w:rFonts w:cs="Arial"/>
+              <w:szCs w:val="16"/>
+            </w:rPr>
+            <w:t>21</w:t>
           </w:r>
           <w:r>
             <w:rPr>
@@ -5340,7 +4158,6 @@
             <w:r>
               <w:rPr>
                 <w:rFonts w:cs="Arial"/>
-                <w:noProof/>
                 <w:szCs w:val="16"/>
               </w:rPr>
               <w:t>1</w:t>
@@ -5380,7 +4197,7 @@
               <w:noProof/>
               <w:szCs w:val="16"/>
             </w:rPr>
-            <w:t>11.09.2026 08:06</w:t>
+            <w:t>05.10.2026 10:35</w:t>
           </w:r>
           <w:r>
             <w:rPr>
@@ -5410,7 +4227,6 @@
             <w:r>
               <w:rPr>
                 <w:rFonts w:cs="Arial"/>
-                <w:noProof/>
                 <w:szCs w:val="16"/>
               </w:rPr>
               <w:t>Document2</w:t>
@@ -5422,7 +4238,7 @@
   </w:tbl>
   <w:p>
     <w:pPr>
-      <w:pStyle w:val="Footer"/>
+      <w:pStyle w:val="Pieddepage"/>
       <w:rPr>
         <w:sz w:val="2"/>
         <w:szCs w:val="2"/>
@@ -5455,7 +4271,7 @@
 <w:hdr xmlns:wpc="http://schemas.microsoft.com/office/word/2010/wordprocessingCanvas" xmlns:cx="http://schemas.microsoft.com/office/drawing/2014/chartex" xmlns:cx1="http://schemas.microsoft.com/office/drawing/2015/9/8/chartex" xmlns:cx2="http://schemas.microsoft.com/office/drawing/2015/10/21/chartex" xmlns:cx3="http://schemas.microsoft.com/office/drawing/2016/5/9/chartex" xmlns:cx4="http://schemas.microsoft.com/office/drawing/2016/5/10/chartex" xmlns:cx5="http://schemas.microsoft.com/office/drawing/2016/5/11/chartex" xmlns:cx6="http://schemas.microsoft.com/office/drawing/2016/5/12/chartex" xmlns:cx7="http://schemas.microsoft.com/office/drawing/2016/5/13/chartex" xmlns:cx8="http://schemas.microsoft.com/office/drawing/2016/5/14/chartex" xmlns:mc="http://schemas.openxmlformats.org/markup-compatibility/2006" xmlns:aink="http://schemas.microsoft.com/office/drawing/2016/ink" xmlns:am3d="http://schemas.microsoft.com/office/drawing/2017/model3d" xmlns:o="urn:schemas-microsoft-com:office:office" xmlns:oel="http://schemas.microsoft.com/office/2019/extlst" xmlns:r="http://schemas.openxmlformats.org/officeDocument/2006/relationships" xmlns:m="http://schemas.openxmlformats.org/officeDocument/2006/math" xmlns:v="urn:schemas-microsoft-com:vml" xmlns:wp14="http://schemas.microsoft.com/office/word/2010/wordprocessingDrawing" xmlns:wp="http://schemas.openxmlformats.org/drawingml/2006/wordprocessingDrawing" xmlns:w10="urn:schemas-microsoft-com:office:word" xmlns:w="http://schemas.openxmlformats.org/wordprocessingml/2006/main" xmlns:w14="http://schemas.microsoft.com/office/word/2010/wordml" xmlns:w15="http://schemas.microsoft.com/office/word/2012/wordml" xmlns:w16cex="http://schemas.microsoft.com/office/word/2018/wordml/cex" xmlns:w16cid="http://schemas.microsoft.com/office/word/2016/wordml/cid" xmlns:w16="http://schemas.microsoft.com/office/word/2018/wordml" xmlns:w16du="http://schemas.microsoft.com/office/word/2023/wordml/word16du" xmlns:w16sdtdh="http://schemas.microsoft.com/office/word/2020/wordml/sdtdatahash" xmlns:w16sdtfl="http://schemas.microsoft.com/office/word/2024/wordml/sdtformatlock" xmlns:w16se="http://schemas.microsoft.com/office/word/2015/wordml/symex" xmlns:wpg="http://schemas.microsoft.com/office/word/2010/wordprocessingGroup" xmlns:wpi="http://schemas.microsoft.com/office/word/2010/wordprocessingInk" xmlns:wne="http://schemas.microsoft.com/office/word/2006/wordml" xmlns:wps="http://schemas.microsoft.com/office/word/2010/wordprocessingShape" mc:Ignorable="w14 w15 w16se w16cid w16 w16cex w16sdtdh w16sdtfl w16du wp14">
   <w:tbl>
     <w:tblPr>
-      <w:tblStyle w:val="TableGrid"/>
+      <w:tblStyle w:val="Grilledutableau"/>
       <w:tblW w:w="5000" w:type="pct"/>
       <w:jc w:val="center"/>
       <w:tblBorders>
@@ -5467,9 +4283,9 @@
       <w:tblLook w:val="01E0" w:firstRow="1" w:lastRow="1" w:firstColumn="1" w:lastColumn="1" w:noHBand="0" w:noVBand="0"/>
     </w:tblPr>
     <w:tblGrid>
-      <w:gridCol w:w="2390"/>
-      <w:gridCol w:w="4411"/>
-      <w:gridCol w:w="2269"/>
+      <w:gridCol w:w="2402"/>
+      <w:gridCol w:w="4400"/>
+      <w:gridCol w:w="2268"/>
     </w:tblGrid>
     <w:tr>
       <w:trPr>
@@ -5504,7 +4320,7 @@
         </w:tcPr>
         <w:p>
           <w:pPr>
-            <w:pStyle w:val="Header"/>
+            <w:pStyle w:val="En-tte"/>
             <w:jc w:val="right"/>
           </w:pPr>
           <w:r>
@@ -5563,7 +4379,7 @@
   </w:tbl>
   <w:p>
     <w:pPr>
-      <w:pStyle w:val="Header"/>
+      <w:pStyle w:val="En-tte"/>
     </w:pPr>
   </w:p>
 </w:hdr>
@@ -5592,7 +4408,7 @@
         <v:path o:extrusionok="f" gradientshapeok="t" o:connecttype="rect"/>
         <o:lock v:ext="edit" aspectratio="t"/>
       </v:shapetype>
-      <v:shape id="_x0000_i1025" type="#_x0000_t75" style="width:11.95pt;height:11.95pt" o:bullet="t">
+      <v:shape id="_x0000_i1025" type="#_x0000_t75" style="width:12pt;height:12pt" o:bullet="t">
         <v:imagedata r:id="rId1" o:title="BD10263_"/>
       </v:shape>
     </w:pict>
@@ -5777,7 +4593,7 @@
     <w:lvl w:ilvl="4">
       <w:start w:val="1"/>
       <w:numFmt w:val="decimal"/>
-      <w:pStyle w:val="Heading5"/>
+      <w:pStyle w:val="Titre5"/>
       <w:lvlText w:val="%1.%2.%3.%4.%5"/>
       <w:lvlJc w:val="left"/>
       <w:pPr>
@@ -5793,7 +4609,7 @@
     <w:lvl w:ilvl="5">
       <w:start w:val="1"/>
       <w:numFmt w:val="decimal"/>
-      <w:pStyle w:val="Heading6"/>
+      <w:pStyle w:val="Titre6"/>
       <w:lvlText w:val="%1.%2.%3.%4.%5.%6"/>
       <w:lvlJc w:val="left"/>
       <w:pPr>
@@ -5809,7 +4625,7 @@
     <w:lvl w:ilvl="6">
       <w:start w:val="1"/>
       <w:numFmt w:val="decimal"/>
-      <w:pStyle w:val="Heading7"/>
+      <w:pStyle w:val="Titre7"/>
       <w:lvlText w:val="%1.%2.%3.%4.%5.%6.%7"/>
       <w:lvlJc w:val="left"/>
       <w:pPr>
@@ -5825,7 +4641,7 @@
     <w:lvl w:ilvl="7">
       <w:start w:val="1"/>
       <w:numFmt w:val="decimal"/>
-      <w:pStyle w:val="Heading8"/>
+      <w:pStyle w:val="Titre8"/>
       <w:lvlText w:val="%1.%2.%3.%4.%5.%6.%7.%8"/>
       <w:lvlJc w:val="left"/>
       <w:pPr>
@@ -5841,7 +4657,7 @@
     <w:lvl w:ilvl="8">
       <w:start w:val="1"/>
       <w:numFmt w:val="decimal"/>
-      <w:pStyle w:val="Heading9"/>
+      <w:pStyle w:val="Titre9"/>
       <w:lvlText w:val="%1.%2.%3.%4.%5.%6.%7.%8.%9"/>
       <w:lvlJc w:val="left"/>
       <w:pPr>
@@ -6957,11 +5773,11 @@
   <w:abstractNum w:abstractNumId="11" w15:restartNumberingAfterBreak="0">
     <w:nsid w:val="2A8F67FD"/>
     <w:multiLevelType w:val="multilevel"/>
-    <w:tmpl w:val="08EA5668"/>
+    <w:tmpl w:val="60ECDB9A"/>
     <w:lvl w:ilvl="0">
       <w:start w:val="1"/>
       <w:numFmt w:val="decimal"/>
-      <w:pStyle w:val="Heading1"/>
+      <w:pStyle w:val="Titre1"/>
       <w:lvlText w:val="%1"/>
       <w:lvlJc w:val="left"/>
       <w:pPr>
@@ -6977,7 +5793,7 @@
     <w:lvl w:ilvl="1">
       <w:start w:val="1"/>
       <w:numFmt w:val="decimal"/>
-      <w:pStyle w:val="Heading2"/>
+      <w:pStyle w:val="Titre2"/>
       <w:lvlText w:val="%1.%2"/>
       <w:lvlJc w:val="left"/>
       <w:pPr>
@@ -6993,7 +5809,7 @@
     <w:lvl w:ilvl="2">
       <w:start w:val="1"/>
       <w:numFmt w:val="decimal"/>
-      <w:pStyle w:val="Heading3"/>
+      <w:pStyle w:val="Titre3"/>
       <w:lvlText w:val="%1.%2.%3"/>
       <w:lvlJc w:val="left"/>
       <w:pPr>
@@ -8125,13 +6941,13 @@
     <w:qFormat/>
     <w:rsid w:val="00615583"/>
   </w:style>
-  <w:style w:type="paragraph" w:styleId="Heading1">
+  <w:style w:type="paragraph" w:styleId="Titre1">
     <w:name w:val="heading 1"/>
     <w:basedOn w:val="Normal"/>
-    <w:next w:val="BodyText"/>
+    <w:next w:val="Corpsdetexte"/>
     <w:autoRedefine/>
     <w:qFormat/>
-    <w:rsid w:val="00AA4393"/>
+    <w:rsid w:val="00F6564C"/>
     <w:pPr>
       <w:keepNext/>
       <w:keepLines/>
@@ -8151,10 +6967,10 @@
       <w:szCs w:val="32"/>
     </w:rPr>
   </w:style>
-  <w:style w:type="paragraph" w:styleId="Heading2">
+  <w:style w:type="paragraph" w:styleId="Titre2">
     <w:name w:val="heading 2"/>
     <w:basedOn w:val="Normal"/>
-    <w:next w:val="BodyTextIndent"/>
+    <w:next w:val="Retraitcorpsdetexte"/>
     <w:autoRedefine/>
     <w:qFormat/>
     <w:rsid w:val="00AA4393"/>
@@ -8176,10 +6992,10 @@
       <w:szCs w:val="28"/>
     </w:rPr>
   </w:style>
-  <w:style w:type="paragraph" w:styleId="Heading3">
+  <w:style w:type="paragraph" w:styleId="Titre3">
     <w:name w:val="heading 3"/>
     <w:basedOn w:val="Normal"/>
-    <w:next w:val="BodyTextIndent3"/>
+    <w:next w:val="Retraitcorpsdetexte3"/>
     <w:qFormat/>
     <w:rsid w:val="00AA4393"/>
     <w:pPr>
@@ -8199,7 +7015,7 @@
       <w:szCs w:val="26"/>
     </w:rPr>
   </w:style>
-  <w:style w:type="paragraph" w:styleId="Heading4">
+  <w:style w:type="paragraph" w:styleId="Titre4">
     <w:name w:val="heading 4"/>
     <w:basedOn w:val="Normal"/>
     <w:next w:val="Normal"/>
@@ -8218,7 +7034,7 @@
       <w:szCs w:val="28"/>
     </w:rPr>
   </w:style>
-  <w:style w:type="paragraph" w:styleId="Heading5">
+  <w:style w:type="paragraph" w:styleId="Titre5">
     <w:name w:val="heading 5"/>
     <w:basedOn w:val="Normal"/>
     <w:next w:val="Normal"/>
@@ -8242,7 +7058,7 @@
       <w:szCs w:val="26"/>
     </w:rPr>
   </w:style>
-  <w:style w:type="paragraph" w:styleId="Heading6">
+  <w:style w:type="paragraph" w:styleId="Titre6">
     <w:name w:val="heading 6"/>
     <w:basedOn w:val="Normal"/>
     <w:next w:val="Normal"/>
@@ -8264,7 +7080,7 @@
       <w:szCs w:val="22"/>
     </w:rPr>
   </w:style>
-  <w:style w:type="paragraph" w:styleId="Heading7">
+  <w:style w:type="paragraph" w:styleId="Titre7">
     <w:name w:val="heading 7"/>
     <w:basedOn w:val="Normal"/>
     <w:next w:val="Normal"/>
@@ -8282,7 +7098,7 @@
       <w:rFonts w:asciiTheme="majorHAnsi" w:hAnsiTheme="majorHAnsi"/>
     </w:rPr>
   </w:style>
-  <w:style w:type="paragraph" w:styleId="Heading8">
+  <w:style w:type="paragraph" w:styleId="Titre8">
     <w:name w:val="heading 8"/>
     <w:basedOn w:val="Normal"/>
     <w:next w:val="Normal"/>
@@ -8302,7 +7118,7 @@
       <w:iCs/>
     </w:rPr>
   </w:style>
-  <w:style w:type="paragraph" w:styleId="Heading9">
+  <w:style w:type="paragraph" w:styleId="Titre9">
     <w:name w:val="heading 9"/>
     <w:basedOn w:val="Normal"/>
     <w:next w:val="Normal"/>
@@ -8322,12 +7138,13 @@
       <w:szCs w:val="22"/>
     </w:rPr>
   </w:style>
-  <w:style w:type="character" w:default="1" w:styleId="DefaultParagraphFont">
+  <w:style w:type="character" w:default="1" w:styleId="Policepardfaut">
     <w:name w:val="Default Paragraph Font"/>
     <w:uiPriority w:val="1"/>
+    <w:semiHidden/>
     <w:unhideWhenUsed/>
   </w:style>
-  <w:style w:type="table" w:default="1" w:styleId="TableNormal">
+  <w:style w:type="table" w:default="1" w:styleId="TableauNormal">
     <w:name w:val="Normal Table"/>
     <w:uiPriority w:val="99"/>
     <w:semiHidden/>
@@ -8342,13 +7159,13 @@
       </w:tblCellMar>
     </w:tblPr>
   </w:style>
-  <w:style w:type="numbering" w:default="1" w:styleId="NoList">
+  <w:style w:type="numbering" w:default="1" w:styleId="Aucuneliste">
     <w:name w:val="No List"/>
     <w:uiPriority w:val="99"/>
     <w:semiHidden/>
     <w:unhideWhenUsed/>
   </w:style>
-  <w:style w:type="paragraph" w:styleId="Header">
+  <w:style w:type="paragraph" w:styleId="En-tte">
     <w:name w:val="header"/>
     <w:basedOn w:val="Normal"/>
     <w:semiHidden/>
@@ -8360,7 +7177,7 @@
       </w:tabs>
     </w:pPr>
   </w:style>
-  <w:style w:type="paragraph" w:styleId="Footer">
+  <w:style w:type="paragraph" w:styleId="Pieddepage">
     <w:name w:val="footer"/>
     <w:basedOn w:val="Normal"/>
     <w:semiHidden/>
@@ -8372,9 +7189,9 @@
       </w:tabs>
     </w:pPr>
   </w:style>
-  <w:style w:type="table" w:styleId="TableGrid">
+  <w:style w:type="table" w:styleId="Grilledutableau">
     <w:name w:val="Table Grid"/>
-    <w:basedOn w:val="TableNormal"/>
+    <w:basedOn w:val="TableauNormal"/>
     <w:semiHidden/>
     <w:rsid w:val="00AE282D"/>
     <w:tblPr>
@@ -8388,9 +7205,9 @@
       </w:tblBorders>
     </w:tblPr>
   </w:style>
-  <w:style w:type="character" w:styleId="PageNumber">
+  <w:style w:type="character" w:styleId="Numrodepage">
     <w:name w:val="page number"/>
-    <w:basedOn w:val="DefaultParagraphFont"/>
+    <w:basedOn w:val="Policepardfaut"/>
     <w:semiHidden/>
     <w:rsid w:val="005E6192"/>
   </w:style>
@@ -8419,10 +7236,10 @@
       <w:spacing w:line="360" w:lineRule="auto"/>
     </w:pPr>
   </w:style>
-  <w:style w:type="paragraph" w:styleId="BodyText">
+  <w:style w:type="paragraph" w:styleId="Corpsdetexte">
     <w:name w:val="Body Text"/>
     <w:basedOn w:val="Normal"/>
-    <w:link w:val="BodyTextChar"/>
+    <w:link w:val="CorpsdetexteCar"/>
     <w:rsid w:val="008E53F9"/>
     <w:pPr>
       <w:tabs>
@@ -8506,7 +7323,7 @@
       <w:sz w:val="28"/>
     </w:rPr>
   </w:style>
-  <w:style w:type="paragraph" w:styleId="TOC1">
+  <w:style w:type="paragraph" w:styleId="TM10">
     <w:name w:val="toc 1"/>
     <w:basedOn w:val="Normal"/>
     <w:next w:val="Normal"/>
@@ -8522,7 +7339,7 @@
       <w:caps/>
     </w:rPr>
   </w:style>
-  <w:style w:type="paragraph" w:styleId="TOC2">
+  <w:style w:type="paragraph" w:styleId="TM2">
     <w:name w:val="toc 2"/>
     <w:basedOn w:val="Normal"/>
     <w:next w:val="Normal"/>
@@ -8536,7 +7353,7 @@
       <w:smallCaps/>
     </w:rPr>
   </w:style>
-  <w:style w:type="paragraph" w:styleId="TOC3">
+  <w:style w:type="paragraph" w:styleId="TM3">
     <w:name w:val="toc 3"/>
     <w:basedOn w:val="Normal"/>
     <w:next w:val="Normal"/>
@@ -8552,7 +7369,7 @@
       <w:iCs/>
     </w:rPr>
   </w:style>
-  <w:style w:type="paragraph" w:styleId="TOC4">
+  <w:style w:type="paragraph" w:styleId="TM4">
     <w:name w:val="toc 4"/>
     <w:basedOn w:val="Normal"/>
     <w:next w:val="Normal"/>
@@ -8569,7 +7386,7 @@
   </w:style>
   <w:style w:type="character" w:customStyle="1" w:styleId="TM1Car">
     <w:name w:val="TM1 Car"/>
-    <w:basedOn w:val="DefaultParagraphFont"/>
+    <w:basedOn w:val="Policepardfaut"/>
     <w:link w:val="TM1"/>
     <w:rsid w:val="007F30AE"/>
     <w:rPr>
@@ -8581,9 +7398,9 @@
       <w:lang w:val="fr-FR" w:eastAsia="fr-FR" w:bidi="ar-SA"/>
     </w:rPr>
   </w:style>
-  <w:style w:type="character" w:styleId="Hyperlink">
+  <w:style w:type="character" w:styleId="Lienhypertexte">
     <w:name w:val="Hyperlink"/>
-    <w:basedOn w:val="DefaultParagraphFont"/>
+    <w:basedOn w:val="Policepardfaut"/>
     <w:uiPriority w:val="99"/>
     <w:rsid w:val="00932149"/>
     <w:rPr>
@@ -8591,10 +7408,10 @@
       <w:u w:val="single"/>
     </w:rPr>
   </w:style>
-  <w:style w:type="paragraph" w:styleId="BalloonText">
+  <w:style w:type="paragraph" w:styleId="Textedebulles">
     <w:name w:val="Balloon Text"/>
     <w:basedOn w:val="Normal"/>
-    <w:link w:val="BalloonTextChar"/>
+    <w:link w:val="TextedebullesCar"/>
     <w:rsid w:val="00B64C66"/>
     <w:rPr>
       <w:rFonts w:ascii="Tahoma" w:hAnsi="Tahoma" w:cs="Tahoma"/>
@@ -8602,10 +7419,10 @@
       <w:szCs w:val="16"/>
     </w:rPr>
   </w:style>
-  <w:style w:type="character" w:customStyle="1" w:styleId="BalloonTextChar">
-    <w:name w:val="Balloon Text Char"/>
-    <w:basedOn w:val="DefaultParagraphFont"/>
-    <w:link w:val="BalloonText"/>
+  <w:style w:type="character" w:customStyle="1" w:styleId="TextedebullesCar">
+    <w:name w:val="Texte de bulles Car"/>
+    <w:basedOn w:val="Policepardfaut"/>
+    <w:link w:val="Textedebulles"/>
     <w:rsid w:val="00B64C66"/>
     <w:rPr>
       <w:rFonts w:ascii="Tahoma" w:hAnsi="Tahoma" w:cs="Tahoma"/>
@@ -8638,16 +7455,16 @@
   </w:style>
   <w:style w:type="character" w:customStyle="1" w:styleId="paragraphe2Car">
     <w:name w:val="paragraphe2 Car"/>
-    <w:basedOn w:val="DefaultParagraphFont"/>
+    <w:basedOn w:val="Policepardfaut"/>
     <w:link w:val="paragraphe2"/>
     <w:rsid w:val="00753A51"/>
     <w:rPr>
       <w:rFonts w:asciiTheme="minorHAnsi" w:hAnsiTheme="minorHAnsi"/>
     </w:rPr>
   </w:style>
-  <w:style w:type="character" w:styleId="Strong">
+  <w:style w:type="character" w:styleId="lev">
     <w:name w:val="Strong"/>
-    <w:basedOn w:val="DefaultParagraphFont"/>
+    <w:basedOn w:val="Policepardfaut"/>
     <w:qFormat/>
     <w:rsid w:val="0037071E"/>
     <w:rPr>
@@ -8655,26 +7472,26 @@
       <w:bCs/>
     </w:rPr>
   </w:style>
-  <w:style w:type="paragraph" w:styleId="BodyTextIndent">
+  <w:style w:type="paragraph" w:styleId="Retraitcorpsdetexte">
     <w:name w:val="Body Text Indent"/>
-    <w:basedOn w:val="BodyText"/>
-    <w:link w:val="BodyTextIndentChar"/>
+    <w:basedOn w:val="Corpsdetexte"/>
+    <w:link w:val="RetraitcorpsdetexteCar"/>
     <w:rsid w:val="00AA4393"/>
     <w:pPr>
       <w:ind w:left="1134"/>
       <w:contextualSpacing/>
     </w:pPr>
   </w:style>
-  <w:style w:type="character" w:customStyle="1" w:styleId="BodyTextIndentChar">
-    <w:name w:val="Body Text Indent Char"/>
-    <w:basedOn w:val="DefaultParagraphFont"/>
-    <w:link w:val="BodyTextIndent"/>
+  <w:style w:type="character" w:customStyle="1" w:styleId="RetraitcorpsdetexteCar">
+    <w:name w:val="Retrait corps de texte Car"/>
+    <w:basedOn w:val="Policepardfaut"/>
+    <w:link w:val="Retraitcorpsdetexte"/>
     <w:rsid w:val="00AA4393"/>
   </w:style>
-  <w:style w:type="paragraph" w:styleId="BodyTextIndent3">
+  <w:style w:type="paragraph" w:styleId="Retraitcorpsdetexte3">
     <w:name w:val="Body Text Indent 3"/>
-    <w:basedOn w:val="BodyText"/>
-    <w:link w:val="BodyTextIndent3Char"/>
+    <w:basedOn w:val="Corpsdetexte"/>
+    <w:link w:val="Retraitcorpsdetexte3Car"/>
     <w:rsid w:val="00AA4393"/>
     <w:pPr>
       <w:ind w:left="1814"/>
@@ -8683,20 +7500,20 @@
       <w:szCs w:val="16"/>
     </w:rPr>
   </w:style>
-  <w:style w:type="character" w:customStyle="1" w:styleId="BodyTextIndent3Char">
-    <w:name w:val="Body Text Indent 3 Char"/>
-    <w:basedOn w:val="DefaultParagraphFont"/>
-    <w:link w:val="BodyTextIndent3"/>
+  <w:style w:type="character" w:customStyle="1" w:styleId="Retraitcorpsdetexte3Car">
+    <w:name w:val="Retrait corps de texte 3 Car"/>
+    <w:basedOn w:val="Policepardfaut"/>
+    <w:link w:val="Retraitcorpsdetexte3"/>
     <w:rsid w:val="00AA4393"/>
     <w:rPr>
       <w:szCs w:val="16"/>
     </w:rPr>
   </w:style>
-  <w:style w:type="paragraph" w:styleId="Title">
+  <w:style w:type="paragraph" w:styleId="Titre">
     <w:name w:val="Title"/>
     <w:basedOn w:val="Normal"/>
     <w:next w:val="Normal"/>
-    <w:link w:val="TitleChar"/>
+    <w:link w:val="TitreCar"/>
     <w:qFormat/>
     <w:rsid w:val="000E7483"/>
     <w:pPr>
@@ -8716,10 +7533,10 @@
       <w:szCs w:val="52"/>
     </w:rPr>
   </w:style>
-  <w:style w:type="character" w:customStyle="1" w:styleId="TitleChar">
-    <w:name w:val="Title Char"/>
-    <w:basedOn w:val="DefaultParagraphFont"/>
-    <w:link w:val="Title"/>
+  <w:style w:type="character" w:customStyle="1" w:styleId="TitreCar">
+    <w:name w:val="Titre Car"/>
+    <w:basedOn w:val="Policepardfaut"/>
+    <w:link w:val="Titre"/>
     <w:rsid w:val="000E7483"/>
     <w:rPr>
       <w:rFonts w:asciiTheme="majorHAnsi" w:eastAsiaTheme="majorEastAsia" w:hAnsiTheme="majorHAnsi" w:cstheme="majorBidi"/>
@@ -8732,7 +7549,7 @@
   </w:style>
   <w:style w:type="paragraph" w:customStyle="1" w:styleId="Informations">
     <w:name w:val="Informations"/>
-    <w:basedOn w:val="BodyTextIndent"/>
+    <w:basedOn w:val="Retraitcorpsdetexte"/>
     <w:qFormat/>
     <w:rsid w:val="00645760"/>
     <w:pPr>
@@ -8743,7 +7560,7 @@
       <w:sz w:val="16"/>
     </w:rPr>
   </w:style>
-  <w:style w:type="paragraph" w:styleId="TOC5">
+  <w:style w:type="paragraph" w:styleId="TM5">
     <w:name w:val="toc 5"/>
     <w:basedOn w:val="Normal"/>
     <w:next w:val="Normal"/>
@@ -8758,7 +7575,7 @@
       <w:szCs w:val="18"/>
     </w:rPr>
   </w:style>
-  <w:style w:type="paragraph" w:styleId="TOC6">
+  <w:style w:type="paragraph" w:styleId="TM6">
     <w:name w:val="toc 6"/>
     <w:basedOn w:val="Normal"/>
     <w:next w:val="Normal"/>
@@ -8773,7 +7590,7 @@
       <w:szCs w:val="18"/>
     </w:rPr>
   </w:style>
-  <w:style w:type="paragraph" w:styleId="TOC7">
+  <w:style w:type="paragraph" w:styleId="TM7">
     <w:name w:val="toc 7"/>
     <w:basedOn w:val="Normal"/>
     <w:next w:val="Normal"/>
@@ -8788,7 +7605,7 @@
       <w:szCs w:val="18"/>
     </w:rPr>
   </w:style>
-  <w:style w:type="paragraph" w:styleId="TOC8">
+  <w:style w:type="paragraph" w:styleId="TM8">
     <w:name w:val="toc 8"/>
     <w:basedOn w:val="Normal"/>
     <w:next w:val="Normal"/>
@@ -8803,7 +7620,7 @@
       <w:szCs w:val="18"/>
     </w:rPr>
   </w:style>
-  <w:style w:type="paragraph" w:styleId="TOC9">
+  <w:style w:type="paragraph" w:styleId="TM9">
     <w:name w:val="toc 9"/>
     <w:basedOn w:val="Normal"/>
     <w:next w:val="Normal"/>
@@ -8818,32 +7635,32 @@
       <w:szCs w:val="18"/>
     </w:rPr>
   </w:style>
-  <w:style w:type="paragraph" w:styleId="NoteHeading">
+  <w:style w:type="paragraph" w:styleId="Titredenote">
     <w:name w:val="Note Heading"/>
     <w:basedOn w:val="Normal"/>
     <w:next w:val="Normal"/>
-    <w:link w:val="NoteHeadingChar"/>
+    <w:link w:val="TitredenoteCar"/>
     <w:rsid w:val="00AA4393"/>
     <w:rPr>
       <w:rFonts w:asciiTheme="majorHAnsi" w:hAnsiTheme="majorHAnsi"/>
     </w:rPr>
   </w:style>
-  <w:style w:type="character" w:customStyle="1" w:styleId="BodyTextChar">
-    <w:name w:val="Body Text Char"/>
-    <w:basedOn w:val="DefaultParagraphFont"/>
-    <w:link w:val="BodyText"/>
+  <w:style w:type="character" w:customStyle="1" w:styleId="CorpsdetexteCar">
+    <w:name w:val="Corps de texte Car"/>
+    <w:basedOn w:val="Policepardfaut"/>
+    <w:link w:val="Corpsdetexte"/>
     <w:rsid w:val="00AA4393"/>
   </w:style>
-  <w:style w:type="character" w:customStyle="1" w:styleId="NoteHeadingChar">
-    <w:name w:val="Note Heading Char"/>
-    <w:basedOn w:val="DefaultParagraphFont"/>
-    <w:link w:val="NoteHeading"/>
+  <w:style w:type="character" w:customStyle="1" w:styleId="TitredenoteCar">
+    <w:name w:val="Titre de note Car"/>
+    <w:basedOn w:val="Policepardfaut"/>
+    <w:link w:val="Titredenote"/>
     <w:rsid w:val="00AA4393"/>
     <w:rPr>
       <w:rFonts w:asciiTheme="majorHAnsi" w:hAnsiTheme="majorHAnsi"/>
     </w:rPr>
   </w:style>
-  <w:style w:type="paragraph" w:styleId="ListParagraph">
+  <w:style w:type="paragraph" w:styleId="Paragraphedeliste">
     <w:name w:val="List Paragraph"/>
     <w:basedOn w:val="Normal"/>
     <w:uiPriority w:val="34"/>
@@ -8854,9 +7671,9 @@
       <w:contextualSpacing/>
     </w:pPr>
   </w:style>
-  <w:style w:type="character" w:styleId="UnresolvedMention">
+  <w:style w:type="character" w:styleId="Mentionnonrsolue">
     <w:name w:val="Unresolved Mention"/>
-    <w:basedOn w:val="DefaultParagraphFont"/>
+    <w:basedOn w:val="Policepardfaut"/>
     <w:uiPriority w:val="99"/>
     <w:semiHidden/>
     <w:unhideWhenUsed/>
@@ -9156,6 +7973,12 @@
 </file>
 
 <file path=customXml/item1.xml><?xml version="1.0" encoding="utf-8"?>
+<p:properties xmlns:p="http://schemas.microsoft.com/office/2006/metadata/properties" xmlns:xsi="http://www.w3.org/2001/XMLSchema-instance" xmlns:pc="http://schemas.microsoft.com/office/infopath/2007/PartnerControls">
+  <documentManagement/>
+</p:properties>
+</file>
+
+<file path=customXml/item2.xml><?xml version="1.0" encoding="utf-8"?>
 <ct:contentTypeSchema xmlns:ct="http://schemas.microsoft.com/office/2006/metadata/contentType" xmlns:ma="http://schemas.microsoft.com/office/2006/metadata/properties/metaAttributes" ct:_="" ma:_="" ma:contentTypeName="Document" ma:contentTypeID="0x010100FBB99F57F4D89D439F52EDCD0CED316B" ma:contentTypeVersion="7" ma:contentTypeDescription="Crée un document." ma:contentTypeScope="" ma:versionID="7f146099027e1b74c82fbe61e090590b">
   <xsd:schema xmlns:xsd="http://www.w3.org/2001/XMLSchema" xmlns:xs="http://www.w3.org/2001/XMLSchema" xmlns:p="http://schemas.microsoft.com/office/2006/metadata/properties" xmlns:ns2="6b19550a-bdc3-4796-8096-c6911560d534" targetNamespace="http://schemas.microsoft.com/office/2006/metadata/properties" ma:root="true" ma:fieldsID="7044bf5f632aa66a3f32a70d04b92caa" ns2:_="">
     <xsd:import namespace="6b19550a-bdc3-4796-8096-c6911560d534"/>
@@ -9317,17 +8140,7 @@
 </ct:contentTypeSchema>
 </file>
 
-<file path=customXml/item2.xml><?xml version="1.0" encoding="utf-8"?>
-<p:properties xmlns:p="http://schemas.microsoft.com/office/2006/metadata/properties" xmlns:xsi="http://www.w3.org/2001/XMLSchema-instance" xmlns:pc="http://schemas.microsoft.com/office/infopath/2007/PartnerControls">
-  <documentManagement/>
-</p:properties>
-</file>
-
 <file path=customXml/item3.xml><?xml version="1.0" encoding="utf-8"?>
-<b:Sources xmlns:b="http://schemas.openxmlformats.org/officeDocument/2006/bibliography" xmlns="http://schemas.openxmlformats.org/officeDocument/2006/bibliography" SelectedStyle="\APA.XSL" StyleName="APA"/>
-</file>
-
-<file path=customXml/item4.xml><?xml version="1.0" encoding="utf-8"?>
 <?mso-contentType ?>
 <FormTemplates xmlns="http://schemas.microsoft.com/sharepoint/v3/contenttype/forms">
   <Display>DocumentLibraryForm</Display>
@@ -9336,7 +8149,20 @@
 </FormTemplates>
 </file>
 
+<file path=customXml/item4.xml><?xml version="1.0" encoding="utf-8"?>
+<b:Sources xmlns:b="http://schemas.openxmlformats.org/officeDocument/2006/bibliography" xmlns="http://schemas.openxmlformats.org/officeDocument/2006/bibliography" SelectedStyle="\APA.XSL" StyleName="APA"/>
+</file>
+
 <file path=customXml/itemProps1.xml><?xml version="1.0" encoding="utf-8"?>
+<ds:datastoreItem xmlns:ds="http://schemas.openxmlformats.org/officeDocument/2006/customXml" ds:itemID="{2319CDB8-A2CD-412D-8359-13E6B4DF1FF4}">
+  <ds:schemaRefs>
+    <ds:schemaRef ds:uri="http://schemas.microsoft.com/office/2006/metadata/properties"/>
+    <ds:schemaRef ds:uri="http://schemas.microsoft.com/office/infopath/2007/PartnerControls"/>
+  </ds:schemaRefs>
+</ds:datastoreItem>
+</file>
+
+<file path=customXml/itemProps2.xml><?xml version="1.0" encoding="utf-8"?>
 <ds:datastoreItem xmlns:ds="http://schemas.openxmlformats.org/officeDocument/2006/customXml" ds:itemID="{75ED066B-A5C4-4F00-9682-79C6BF6A6E3B}">
   <ds:schemaRefs>
     <ds:schemaRef ds:uri="http://schemas.microsoft.com/office/2006/metadata/contentType"/>
@@ -9354,27 +8180,18 @@
 </ds:datastoreItem>
 </file>
 
-<file path=customXml/itemProps2.xml><?xml version="1.0" encoding="utf-8"?>
-<ds:datastoreItem xmlns:ds="http://schemas.openxmlformats.org/officeDocument/2006/customXml" ds:itemID="{2319CDB8-A2CD-412D-8359-13E6B4DF1FF4}">
+<file path=customXml/itemProps3.xml><?xml version="1.0" encoding="utf-8"?>
+<ds:datastoreItem xmlns:ds="http://schemas.openxmlformats.org/officeDocument/2006/customXml" ds:itemID="{6C3F7A66-EDE3-46FD-83EB-3C265E5D2669}">
   <ds:schemaRefs>
-    <ds:schemaRef ds:uri="http://schemas.microsoft.com/office/2006/metadata/properties"/>
-    <ds:schemaRef ds:uri="http://schemas.microsoft.com/office/infopath/2007/PartnerControls"/>
+    <ds:schemaRef ds:uri="http://schemas.microsoft.com/sharepoint/v3/contenttype/forms"/>
   </ds:schemaRefs>
 </ds:datastoreItem>
 </file>
 
-<file path=customXml/itemProps3.xml><?xml version="1.0" encoding="utf-8"?>
+<file path=customXml/itemProps4.xml><?xml version="1.0" encoding="utf-8"?>
 <ds:datastoreItem xmlns:ds="http://schemas.openxmlformats.org/officeDocument/2006/customXml" ds:itemID="{C8C35155-3E6A-4058-B6E4-303717845E3B}">
   <ds:schemaRefs>
     <ds:schemaRef ds:uri="http://schemas.openxmlformats.org/officeDocument/2006/bibliography"/>
   </ds:schemaRefs>
 </ds:datastoreItem>
-</file>
-
-<file path=customXml/itemProps4.xml><?xml version="1.0" encoding="utf-8"?>
-<ds:datastoreItem xmlns:ds="http://schemas.openxmlformats.org/officeDocument/2006/customXml" ds:itemID="{6C3F7A66-EDE3-46FD-83EB-3C265E5D2669}">
-  <ds:schemaRefs>
-    <ds:schemaRef ds:uri="http://schemas.microsoft.com/sharepoint/v3/contenttype/forms"/>
-  </ds:schemaRefs>
-</ds:datastoreItem>
 </file>
</xml_diff>

<commit_message>
chore() : Modification des commentaires avec les SUMMARY et les RETURNS pour les classes et les méthodes. Aussi modification du projet Test et modification des nom des méthodes de tests. Modification de la section test du rapport
</commit_message>
<xml_diff>
--- a/fichiers/R-P_Parking-HugoSchweizer.docx
+++ b/fichiers/R-P_Parking-HugoSchweizer.docx
@@ -9,14 +9,12 @@
           <w:color w:val="000000" w:themeColor="text1"/>
         </w:rPr>
       </w:pPr>
-      <w:proofErr w:type="spellStart"/>
       <w:r>
         <w:rPr>
           <w:color w:val="000000" w:themeColor="text1"/>
         </w:rPr>
         <w:t>P_Parking</w:t>
       </w:r>
-      <w:proofErr w:type="spellEnd"/>
     </w:p>
     <w:p>
       <w:pPr>
@@ -2513,9 +2511,9 @@
       <w:pPr>
         <w:pStyle w:val="Titre2"/>
       </w:pPr>
-      <w:bookmarkStart w:id="3" w:name="_Toc532179969"/>
-      <w:bookmarkStart w:id="4" w:name="_Toc165969639"/>
-      <w:bookmarkStart w:id="5" w:name="_Toc242089334"/>
+      <w:bookmarkStart w:id="3" w:name="_Toc242089334"/>
+      <w:bookmarkStart w:id="4" w:name="_Toc532179969"/>
+      <w:bookmarkStart w:id="5" w:name="_Toc165969639"/>
       <w:r>
         <w:t>T</w:t>
       </w:r>
@@ -2525,7 +2523,7 @@
       <w:r>
         <w:t>e</w:t>
       </w:r>
-      <w:bookmarkEnd w:id="5"/>
+      <w:bookmarkEnd w:id="3"/>
     </w:p>
     <w:p>
       <w:pPr>
@@ -2805,8 +2803,8 @@
       <w:r>
         <w:t>Planification</w:t>
       </w:r>
-      <w:bookmarkEnd w:id="3"/>
       <w:bookmarkEnd w:id="4"/>
+      <w:bookmarkEnd w:id="5"/>
       <w:r>
         <w:t xml:space="preserve"> Initiale</w:t>
       </w:r>
@@ -3162,13 +3160,9 @@
       <w:r>
         <w:t>« </w:t>
       </w:r>
-      <w:proofErr w:type="spellStart"/>
-      <w:proofErr w:type="gramStart"/>
       <w:r>
         <w:t>console.writeLine</w:t>
       </w:r>
-      <w:proofErr w:type="spellEnd"/>
-      <w:proofErr w:type="gramEnd"/>
       <w:r>
         <w:t> »</w:t>
       </w:r>
@@ -3413,6 +3407,48 @@
       </w:r>
     </w:p>
     <w:p>
+      <w:r>
+        <w:rPr>
+          <w:noProof/>
+        </w:rPr>
+        <w:drawing>
+          <wp:inline distT="0" distB="0" distL="0" distR="0" wp14:anchorId="1175E7CE" wp14:editId="734A7837">
+            <wp:extent cx="3190476" cy="1209524"/>
+            <wp:effectExtent l="0" t="0" r="0" b="0"/>
+            <wp:docPr id="317665327" name="Image 1"/>
+            <wp:cNvGraphicFramePr>
+              <a:graphicFrameLocks xmlns:a="http://schemas.openxmlformats.org/drawingml/2006/main" noChangeAspect="1"/>
+            </wp:cNvGraphicFramePr>
+            <a:graphic xmlns:a="http://schemas.openxmlformats.org/drawingml/2006/main">
+              <a:graphicData uri="http://schemas.openxmlformats.org/drawingml/2006/picture">
+                <pic:pic xmlns:pic="http://schemas.openxmlformats.org/drawingml/2006/picture">
+                  <pic:nvPicPr>
+                    <pic:cNvPr id="317665327" name=""/>
+                    <pic:cNvPicPr/>
+                  </pic:nvPicPr>
+                  <pic:blipFill>
+                    <a:blip r:embed="rId14"/>
+                    <a:stretch>
+                      <a:fillRect/>
+                    </a:stretch>
+                  </pic:blipFill>
+                  <pic:spPr>
+                    <a:xfrm>
+                      <a:off x="0" y="0"/>
+                      <a:ext cx="3190476" cy="1209524"/>
+                    </a:xfrm>
+                    <a:prstGeom prst="rect">
+                      <a:avLst/>
+                    </a:prstGeom>
+                  </pic:spPr>
+                </pic:pic>
+              </a:graphicData>
+            </a:graphic>
+          </wp:inline>
+        </w:drawing>
+      </w:r>
+    </w:p>
+    <w:p>
       <w:pPr>
         <w:pStyle w:val="Titre1"/>
       </w:pPr>
@@ -3459,7 +3495,7 @@
                     <pic:cNvPicPr/>
                   </pic:nvPicPr>
                   <pic:blipFill>
-                    <a:blip r:embed="rId14"/>
+                    <a:blip r:embed="rId15"/>
                     <a:stretch>
                       <a:fillRect/>
                     </a:stretch>
@@ -3526,13 +3562,8 @@
         <w:t>Nom</w:t>
       </w:r>
       <w:r>
-        <w:t xml:space="preserve"> : </w:t>
-      </w:r>
-      <w:proofErr w:type="spellStart"/>
-      <w:r>
-        <w:t>ChatGPT</w:t>
-      </w:r>
-      <w:proofErr w:type="spellEnd"/>
+        <w:t> : ChatGPT</w:t>
+      </w:r>
     </w:p>
     <w:p>
       <w:pPr>
@@ -3691,15 +3722,7 @@
         <w:pStyle w:val="Corpsdetexte"/>
       </w:pPr>
       <w:r>
-        <w:t xml:space="preserve">Le projet c’est très bien déroulé, tous les objectifs ont été rempli à 100% et dans les temps. L’utilisation de l’IA était plus que correcte. J’ai détaillé le plus possible mon journal de travail et j’ai respecté la norme pour les commit et les ai </w:t>
-      </w:r>
-      <w:proofErr w:type="gramStart"/>
-      <w:r>
-        <w:t>fait</w:t>
-      </w:r>
-      <w:proofErr w:type="gramEnd"/>
-      <w:r>
-        <w:t xml:space="preserve"> atomiquement. </w:t>
+        <w:t xml:space="preserve">Le projet c’est très bien déroulé, tous les objectifs ont été rempli à 100% et dans les temps. L’utilisation de l’IA était plus que correcte. J’ai détaillé le plus possible mon journal de travail et j’ai respecté la norme pour les commit et les ai fait atomiquement. </w:t>
       </w:r>
     </w:p>
     <w:p>
@@ -3707,15 +3730,7 @@
         <w:pStyle w:val="Corpsdetexte"/>
       </w:pPr>
       <w:r>
-        <w:t xml:space="preserve">Si c’était à refaire j’aurais commencé à commenter mon code dès le début et non à la fin comme je l’ai fait. J’aurais aussi rendu plus atomique </w:t>
-      </w:r>
-      <w:proofErr w:type="gramStart"/>
-      <w:r>
-        <w:t>mes méthode</w:t>
-      </w:r>
-      <w:proofErr w:type="gramEnd"/>
-      <w:r>
-        <w:t xml:space="preserve"> dès le départ.</w:t>
+        <w:t>Si c’était à refaire j’aurais commencé à commenter mon code dès le début et non à la fin comme je l’ai fait. J’aurais aussi rendu plus atomique mes méthode dès le départ.</w:t>
       </w:r>
     </w:p>
     <w:p>
@@ -3725,8 +3740,8 @@
       </w:pPr>
     </w:p>
     <w:sectPr>
-      <w:headerReference w:type="default" r:id="rId15"/>
-      <w:footerReference w:type="default" r:id="rId16"/>
+      <w:headerReference w:type="default" r:id="rId16"/>
+      <w:footerReference w:type="default" r:id="rId17"/>
       <w:pgSz w:w="11906" w:h="16838" w:code="9"/>
       <w:pgMar w:top="1418" w:right="1418" w:bottom="1418" w:left="1418" w:header="709" w:footer="709" w:gutter="0"/>
       <w:cols w:space="708"/>
@@ -4093,23 +4108,7 @@
               <w:rFonts w:cs="Arial"/>
               <w:szCs w:val="16"/>
             </w:rPr>
-            <w:t xml:space="preserve">04.09.2009 </w:t>
-          </w:r>
-          <w:proofErr w:type="gramStart"/>
-          <w:r>
-            <w:rPr>
-              <w:rFonts w:cs="Arial"/>
-              <w:szCs w:val="16"/>
-            </w:rPr>
-            <w:t>15:</w:t>
-          </w:r>
-          <w:proofErr w:type="gramEnd"/>
-          <w:r>
-            <w:rPr>
-              <w:rFonts w:cs="Arial"/>
-              <w:szCs w:val="16"/>
-            </w:rPr>
-            <w:t>21</w:t>
+            <w:t>04.09.2009 15:21</w:t>
           </w:r>
           <w:r>
             <w:rPr>
@@ -4138,21 +4137,12 @@
               <w:szCs w:val="16"/>
             </w:rPr>
           </w:pPr>
-          <w:proofErr w:type="gramStart"/>
           <w:r>
             <w:rPr>
               <w:rFonts w:cs="Arial"/>
               <w:szCs w:val="16"/>
             </w:rPr>
-            <w:t>Version:</w:t>
-          </w:r>
-          <w:proofErr w:type="gramEnd"/>
-          <w:r>
-            <w:rPr>
-              <w:rFonts w:cs="Arial"/>
-              <w:szCs w:val="16"/>
-            </w:rPr>
-            <w:t xml:space="preserve"> </w:t>
+            <w:t xml:space="preserve">Version: </w:t>
           </w:r>
           <w:fldSimple w:instr=" REVNUM   \* MERGEFORMAT ">
             <w:r>
@@ -4197,7 +4187,7 @@
               <w:noProof/>
               <w:szCs w:val="16"/>
             </w:rPr>
-            <w:t>05.10.2026 10:35</w:t>
+            <w:t>05.10.2026 10:41</w:t>
           </w:r>
           <w:r>
             <w:rPr>
@@ -7973,12 +7963,6 @@
 </file>
 
 <file path=customXml/item1.xml><?xml version="1.0" encoding="utf-8"?>
-<p:properties xmlns:p="http://schemas.microsoft.com/office/2006/metadata/properties" xmlns:xsi="http://www.w3.org/2001/XMLSchema-instance" xmlns:pc="http://schemas.microsoft.com/office/infopath/2007/PartnerControls">
-  <documentManagement/>
-</p:properties>
-</file>
-
-<file path=customXml/item2.xml><?xml version="1.0" encoding="utf-8"?>
 <ct:contentTypeSchema xmlns:ct="http://schemas.microsoft.com/office/2006/metadata/contentType" xmlns:ma="http://schemas.microsoft.com/office/2006/metadata/properties/metaAttributes" ct:_="" ma:_="" ma:contentTypeName="Document" ma:contentTypeID="0x010100FBB99F57F4D89D439F52EDCD0CED316B" ma:contentTypeVersion="7" ma:contentTypeDescription="Crée un document." ma:contentTypeScope="" ma:versionID="7f146099027e1b74c82fbe61e090590b">
   <xsd:schema xmlns:xsd="http://www.w3.org/2001/XMLSchema" xmlns:xs="http://www.w3.org/2001/XMLSchema" xmlns:p="http://schemas.microsoft.com/office/2006/metadata/properties" xmlns:ns2="6b19550a-bdc3-4796-8096-c6911560d534" targetNamespace="http://schemas.microsoft.com/office/2006/metadata/properties" ma:root="true" ma:fieldsID="7044bf5f632aa66a3f32a70d04b92caa" ns2:_="">
     <xsd:import namespace="6b19550a-bdc3-4796-8096-c6911560d534"/>
@@ -8140,7 +8124,17 @@
 </ct:contentTypeSchema>
 </file>
 
+<file path=customXml/item2.xml><?xml version="1.0" encoding="utf-8"?>
+<p:properties xmlns:p="http://schemas.microsoft.com/office/2006/metadata/properties" xmlns:xsi="http://www.w3.org/2001/XMLSchema-instance" xmlns:pc="http://schemas.microsoft.com/office/infopath/2007/PartnerControls">
+  <documentManagement/>
+</p:properties>
+</file>
+
 <file path=customXml/item3.xml><?xml version="1.0" encoding="utf-8"?>
+<b:Sources xmlns:b="http://schemas.openxmlformats.org/officeDocument/2006/bibliography" xmlns="http://schemas.openxmlformats.org/officeDocument/2006/bibliography" SelectedStyle="\APA.XSL" StyleName="APA"/>
+</file>
+
+<file path=customXml/item4.xml><?xml version="1.0" encoding="utf-8"?>
 <?mso-contentType ?>
 <FormTemplates xmlns="http://schemas.microsoft.com/sharepoint/v3/contenttype/forms">
   <Display>DocumentLibraryForm</Display>
@@ -8149,20 +8143,7 @@
 </FormTemplates>
 </file>
 
-<file path=customXml/item4.xml><?xml version="1.0" encoding="utf-8"?>
-<b:Sources xmlns:b="http://schemas.openxmlformats.org/officeDocument/2006/bibliography" xmlns="http://schemas.openxmlformats.org/officeDocument/2006/bibliography" SelectedStyle="\APA.XSL" StyleName="APA"/>
-</file>
-
 <file path=customXml/itemProps1.xml><?xml version="1.0" encoding="utf-8"?>
-<ds:datastoreItem xmlns:ds="http://schemas.openxmlformats.org/officeDocument/2006/customXml" ds:itemID="{2319CDB8-A2CD-412D-8359-13E6B4DF1FF4}">
-  <ds:schemaRefs>
-    <ds:schemaRef ds:uri="http://schemas.microsoft.com/office/2006/metadata/properties"/>
-    <ds:schemaRef ds:uri="http://schemas.microsoft.com/office/infopath/2007/PartnerControls"/>
-  </ds:schemaRefs>
-</ds:datastoreItem>
-</file>
-
-<file path=customXml/itemProps2.xml><?xml version="1.0" encoding="utf-8"?>
 <ds:datastoreItem xmlns:ds="http://schemas.openxmlformats.org/officeDocument/2006/customXml" ds:itemID="{75ED066B-A5C4-4F00-9682-79C6BF6A6E3B}">
   <ds:schemaRefs>
     <ds:schemaRef ds:uri="http://schemas.microsoft.com/office/2006/metadata/contentType"/>
@@ -8180,18 +8161,27 @@
 </ds:datastoreItem>
 </file>
 
+<file path=customXml/itemProps2.xml><?xml version="1.0" encoding="utf-8"?>
+<ds:datastoreItem xmlns:ds="http://schemas.openxmlformats.org/officeDocument/2006/customXml" ds:itemID="{2319CDB8-A2CD-412D-8359-13E6B4DF1FF4}">
+  <ds:schemaRefs>
+    <ds:schemaRef ds:uri="http://schemas.microsoft.com/office/2006/metadata/properties"/>
+    <ds:schemaRef ds:uri="http://schemas.microsoft.com/office/infopath/2007/PartnerControls"/>
+  </ds:schemaRefs>
+</ds:datastoreItem>
+</file>
+
 <file path=customXml/itemProps3.xml><?xml version="1.0" encoding="utf-8"?>
+<ds:datastoreItem xmlns:ds="http://schemas.openxmlformats.org/officeDocument/2006/customXml" ds:itemID="{C8C35155-3E6A-4058-B6E4-303717845E3B}">
+  <ds:schemaRefs>
+    <ds:schemaRef ds:uri="http://schemas.openxmlformats.org/officeDocument/2006/bibliography"/>
+  </ds:schemaRefs>
+</ds:datastoreItem>
+</file>
+
+<file path=customXml/itemProps4.xml><?xml version="1.0" encoding="utf-8"?>
 <ds:datastoreItem xmlns:ds="http://schemas.openxmlformats.org/officeDocument/2006/customXml" ds:itemID="{6C3F7A66-EDE3-46FD-83EB-3C265E5D2669}">
   <ds:schemaRefs>
     <ds:schemaRef ds:uri="http://schemas.microsoft.com/sharepoint/v3/contenttype/forms"/>
   </ds:schemaRefs>
 </ds:datastoreItem>
-</file>
-
-<file path=customXml/itemProps4.xml><?xml version="1.0" encoding="utf-8"?>
-<ds:datastoreItem xmlns:ds="http://schemas.openxmlformats.org/officeDocument/2006/customXml" ds:itemID="{C8C35155-3E6A-4058-B6E4-303717845E3B}">
-  <ds:schemaRefs>
-    <ds:schemaRef ds:uri="http://schemas.openxmlformats.org/officeDocument/2006/bibliography"/>
-  </ds:schemaRefs>
-</ds:datastoreItem>
 </file>
</xml_diff>

<commit_message>
Refactor(ExitVehicule) : je me suis rendu compte que la place envoyée à ExitChoice() n'était pas la même que entrée par l'utilisateur donc ça ne supprimais pas la place.
</commit_message>
<xml_diff>
--- a/fichiers/R-P_Parking-HugoSchweizer.docx
+++ b/fichiers/R-P_Parking-HugoSchweizer.docx
@@ -4,7 +4,7 @@
   <w:body>
     <w:p>
       <w:pPr>
-        <w:pStyle w:val="Titre"/>
+        <w:pStyle w:val="Title"/>
         <w:rPr>
           <w:color w:val="000000" w:themeColor="text1"/>
         </w:rPr>
@@ -132,7 +132,7 @@
     </w:p>
     <w:p>
       <w:pPr>
-        <w:pStyle w:val="Titre"/>
+        <w:pStyle w:val="Title"/>
       </w:pPr>
       <w:r>
         <w:br w:type="page"/>
@@ -144,7 +144,7 @@
     </w:p>
     <w:p>
       <w:pPr>
-        <w:pStyle w:val="TM10"/>
+        <w:pStyle w:val="TOC1"/>
         <w:tabs>
           <w:tab w:val="left" w:pos="400"/>
           <w:tab w:val="right" w:leader="dot" w:pos="9060"/>
@@ -194,10 +194,10 @@
         </w:rPr>
         <w:fldChar w:fldCharType="separate"/>
       </w:r>
-      <w:hyperlink w:anchor="_Toc242089333" w:history="1">
-        <w:r>
-          <w:rPr>
-            <w:rStyle w:val="Lienhypertexte"/>
+      <w:hyperlink w:anchor="_Toc243470254" w:history="1">
+        <w:r>
+          <w:rPr>
+            <w:rStyle w:val="Hyperlink"/>
             <w:noProof/>
           </w:rPr>
           <w:t>1</w:t>
@@ -218,7 +218,7 @@
         </w:r>
         <w:r>
           <w:rPr>
-            <w:rStyle w:val="Lienhypertexte"/>
+            <w:rStyle w:val="Hyperlink"/>
             <w:noProof/>
           </w:rPr>
           <w:t>Spécifications</w:t>
@@ -242,7 +242,7 @@
             <w:noProof/>
             <w:webHidden/>
           </w:rPr>
-          <w:instrText xml:space="preserve"> PAGEREF _Toc242089333 \h </w:instrText>
+          <w:instrText xml:space="preserve"> PAGEREF _Toc243470254 \h </w:instrText>
         </w:r>
         <w:r>
           <w:rPr>
@@ -275,7 +275,7 @@
     </w:p>
     <w:p>
       <w:pPr>
-        <w:pStyle w:val="TM2"/>
+        <w:pStyle w:val="TOC2"/>
         <w:tabs>
           <w:tab w:val="left" w:pos="800"/>
           <w:tab w:val="right" w:leader="dot" w:pos="9060"/>
@@ -290,10 +290,10 @@
           <w14:ligatures w14:val="standardContextual"/>
         </w:rPr>
       </w:pPr>
-      <w:hyperlink w:anchor="_Toc242089334" w:history="1">
-        <w:r>
-          <w:rPr>
-            <w:rStyle w:val="Lienhypertexte"/>
+      <w:hyperlink w:anchor="_Toc243470255" w:history="1">
+        <w:r>
+          <w:rPr>
+            <w:rStyle w:val="Hyperlink"/>
             <w:noProof/>
           </w:rPr>
           <w:t>1.1</w:t>
@@ -312,7 +312,7 @@
         </w:r>
         <w:r>
           <w:rPr>
-            <w:rStyle w:val="Lienhypertexte"/>
+            <w:rStyle w:val="Hyperlink"/>
             <w:noProof/>
           </w:rPr>
           <w:t>Titre</w:t>
@@ -336,7 +336,7 @@
             <w:noProof/>
             <w:webHidden/>
           </w:rPr>
-          <w:instrText xml:space="preserve"> PAGEREF _Toc242089334 \h </w:instrText>
+          <w:instrText xml:space="preserve"> PAGEREF _Toc243470255 \h </w:instrText>
         </w:r>
         <w:r>
           <w:rPr>
@@ -369,7 +369,7 @@
     </w:p>
     <w:p>
       <w:pPr>
-        <w:pStyle w:val="TM2"/>
+        <w:pStyle w:val="TOC2"/>
         <w:tabs>
           <w:tab w:val="left" w:pos="800"/>
           <w:tab w:val="right" w:leader="dot" w:pos="9060"/>
@@ -384,10 +384,10 @@
           <w14:ligatures w14:val="standardContextual"/>
         </w:rPr>
       </w:pPr>
-      <w:hyperlink w:anchor="_Toc242089335" w:history="1">
-        <w:r>
-          <w:rPr>
-            <w:rStyle w:val="Lienhypertexte"/>
+      <w:hyperlink w:anchor="_Toc243470256" w:history="1">
+        <w:r>
+          <w:rPr>
+            <w:rStyle w:val="Hyperlink"/>
             <w:noProof/>
           </w:rPr>
           <w:t>1.2</w:t>
@@ -406,7 +406,7 @@
         </w:r>
         <w:r>
           <w:rPr>
-            <w:rStyle w:val="Lienhypertexte"/>
+            <w:rStyle w:val="Hyperlink"/>
             <w:noProof/>
           </w:rPr>
           <w:t>Description</w:t>
@@ -430,7 +430,7 @@
             <w:noProof/>
             <w:webHidden/>
           </w:rPr>
-          <w:instrText xml:space="preserve"> PAGEREF _Toc242089335 \h </w:instrText>
+          <w:instrText xml:space="preserve"> PAGEREF _Toc243470256 \h </w:instrText>
         </w:r>
         <w:r>
           <w:rPr>
@@ -463,7 +463,7 @@
     </w:p>
     <w:p>
       <w:pPr>
-        <w:pStyle w:val="TM2"/>
+        <w:pStyle w:val="TOC2"/>
         <w:tabs>
           <w:tab w:val="left" w:pos="800"/>
           <w:tab w:val="right" w:leader="dot" w:pos="9060"/>
@@ -478,10 +478,10 @@
           <w14:ligatures w14:val="standardContextual"/>
         </w:rPr>
       </w:pPr>
-      <w:hyperlink w:anchor="_Toc242089336" w:history="1">
-        <w:r>
-          <w:rPr>
-            <w:rStyle w:val="Lienhypertexte"/>
+      <w:hyperlink w:anchor="_Toc243470257" w:history="1">
+        <w:r>
+          <w:rPr>
+            <w:rStyle w:val="Hyperlink"/>
             <w:noProof/>
           </w:rPr>
           <w:t>1.3</w:t>
@@ -500,7 +500,7 @@
         </w:r>
         <w:r>
           <w:rPr>
-            <w:rStyle w:val="Lienhypertexte"/>
+            <w:rStyle w:val="Hyperlink"/>
             <w:noProof/>
           </w:rPr>
           <w:t>Matériel et logiciels à disposition</w:t>
@@ -524,7 +524,7 @@
             <w:noProof/>
             <w:webHidden/>
           </w:rPr>
-          <w:instrText xml:space="preserve"> PAGEREF _Toc242089336 \h </w:instrText>
+          <w:instrText xml:space="preserve"> PAGEREF _Toc243470257 \h </w:instrText>
         </w:r>
         <w:r>
           <w:rPr>
@@ -557,7 +557,7 @@
     </w:p>
     <w:p>
       <w:pPr>
-        <w:pStyle w:val="TM2"/>
+        <w:pStyle w:val="TOC2"/>
         <w:tabs>
           <w:tab w:val="left" w:pos="800"/>
           <w:tab w:val="right" w:leader="dot" w:pos="9060"/>
@@ -572,10 +572,10 @@
           <w14:ligatures w14:val="standardContextual"/>
         </w:rPr>
       </w:pPr>
-      <w:hyperlink w:anchor="_Toc242089337" w:history="1">
-        <w:r>
-          <w:rPr>
-            <w:rStyle w:val="Lienhypertexte"/>
+      <w:hyperlink w:anchor="_Toc243470258" w:history="1">
+        <w:r>
+          <w:rPr>
+            <w:rStyle w:val="Hyperlink"/>
             <w:noProof/>
           </w:rPr>
           <w:t>1.4</w:t>
@@ -594,7 +594,7 @@
         </w:r>
         <w:r>
           <w:rPr>
-            <w:rStyle w:val="Lienhypertexte"/>
+            <w:rStyle w:val="Hyperlink"/>
             <w:noProof/>
           </w:rPr>
           <w:t>Prérequis</w:t>
@@ -618,7 +618,7 @@
             <w:noProof/>
             <w:webHidden/>
           </w:rPr>
-          <w:instrText xml:space="preserve"> PAGEREF _Toc242089337 \h </w:instrText>
+          <w:instrText xml:space="preserve"> PAGEREF _Toc243470258 \h </w:instrText>
         </w:r>
         <w:r>
           <w:rPr>
@@ -651,7 +651,7 @@
     </w:p>
     <w:p>
       <w:pPr>
-        <w:pStyle w:val="TM2"/>
+        <w:pStyle w:val="TOC2"/>
         <w:tabs>
           <w:tab w:val="left" w:pos="800"/>
           <w:tab w:val="right" w:leader="dot" w:pos="9060"/>
@@ -666,10 +666,10 @@
           <w14:ligatures w14:val="standardContextual"/>
         </w:rPr>
       </w:pPr>
-      <w:hyperlink w:anchor="_Toc242089338" w:history="1">
-        <w:r>
-          <w:rPr>
-            <w:rStyle w:val="Lienhypertexte"/>
+      <w:hyperlink w:anchor="_Toc243470259" w:history="1">
+        <w:r>
+          <w:rPr>
+            <w:rStyle w:val="Hyperlink"/>
             <w:noProof/>
           </w:rPr>
           <w:t>1.5</w:t>
@@ -688,7 +688,7 @@
         </w:r>
         <w:r>
           <w:rPr>
-            <w:rStyle w:val="Lienhypertexte"/>
+            <w:rStyle w:val="Hyperlink"/>
             <w:noProof/>
           </w:rPr>
           <w:t>Cahier des charges</w:t>
@@ -712,7 +712,7 @@
             <w:noProof/>
             <w:webHidden/>
           </w:rPr>
-          <w:instrText xml:space="preserve"> PAGEREF _Toc242089338 \h </w:instrText>
+          <w:instrText xml:space="preserve"> PAGEREF _Toc243470259 \h </w:instrText>
         </w:r>
         <w:r>
           <w:rPr>
@@ -745,7 +745,7 @@
     </w:p>
     <w:p>
       <w:pPr>
-        <w:pStyle w:val="TM2"/>
+        <w:pStyle w:val="TOC2"/>
         <w:tabs>
           <w:tab w:val="left" w:pos="800"/>
           <w:tab w:val="right" w:leader="dot" w:pos="9060"/>
@@ -760,10 +760,10 @@
           <w14:ligatures w14:val="standardContextual"/>
         </w:rPr>
       </w:pPr>
-      <w:hyperlink w:anchor="_Toc242089339" w:history="1">
-        <w:r>
-          <w:rPr>
-            <w:rStyle w:val="Lienhypertexte"/>
+      <w:hyperlink w:anchor="_Toc243470260" w:history="1">
+        <w:r>
+          <w:rPr>
+            <w:rStyle w:val="Hyperlink"/>
             <w:noProof/>
           </w:rPr>
           <w:t>1.6</w:t>
@@ -782,7 +782,7 @@
         </w:r>
         <w:r>
           <w:rPr>
-            <w:rStyle w:val="Lienhypertexte"/>
+            <w:rStyle w:val="Hyperlink"/>
             <w:noProof/>
           </w:rPr>
           <w:t>Les points suivants seront évalués</w:t>
@@ -806,7 +806,7 @@
             <w:noProof/>
             <w:webHidden/>
           </w:rPr>
-          <w:instrText xml:space="preserve"> PAGEREF _Toc242089339 \h </w:instrText>
+          <w:instrText xml:space="preserve"> PAGEREF _Toc243470260 \h </w:instrText>
         </w:r>
         <w:r>
           <w:rPr>
@@ -839,7 +839,7 @@
     </w:p>
     <w:p>
       <w:pPr>
-        <w:pStyle w:val="TM2"/>
+        <w:pStyle w:val="TOC2"/>
         <w:tabs>
           <w:tab w:val="left" w:pos="800"/>
           <w:tab w:val="right" w:leader="dot" w:pos="9060"/>
@@ -854,10 +854,10 @@
           <w14:ligatures w14:val="standardContextual"/>
         </w:rPr>
       </w:pPr>
-      <w:hyperlink w:anchor="_Toc242089340" w:history="1">
-        <w:r>
-          <w:rPr>
-            <w:rStyle w:val="Lienhypertexte"/>
+      <w:hyperlink w:anchor="_Toc243470261" w:history="1">
+        <w:r>
+          <w:rPr>
+            <w:rStyle w:val="Hyperlink"/>
             <w:noProof/>
           </w:rPr>
           <w:t>1.7</w:t>
@@ -876,7 +876,7 @@
         </w:r>
         <w:r>
           <w:rPr>
-            <w:rStyle w:val="Lienhypertexte"/>
+            <w:rStyle w:val="Hyperlink"/>
             <w:noProof/>
           </w:rPr>
           <w:t>Validation et conditions de réussite</w:t>
@@ -900,7 +900,7 @@
             <w:noProof/>
             <w:webHidden/>
           </w:rPr>
-          <w:instrText xml:space="preserve"> PAGEREF _Toc242089340 \h </w:instrText>
+          <w:instrText xml:space="preserve"> PAGEREF _Toc243470261 \h </w:instrText>
         </w:r>
         <w:r>
           <w:rPr>
@@ -933,7 +933,7 @@
     </w:p>
     <w:p>
       <w:pPr>
-        <w:pStyle w:val="TM10"/>
+        <w:pStyle w:val="TOC1"/>
         <w:tabs>
           <w:tab w:val="left" w:pos="400"/>
           <w:tab w:val="right" w:leader="dot" w:pos="9060"/>
@@ -950,10 +950,10 @@
           <w14:ligatures w14:val="standardContextual"/>
         </w:rPr>
       </w:pPr>
-      <w:hyperlink w:anchor="_Toc242089341" w:history="1">
-        <w:r>
-          <w:rPr>
-            <w:rStyle w:val="Lienhypertexte"/>
+      <w:hyperlink w:anchor="_Toc243470262" w:history="1">
+        <w:r>
+          <w:rPr>
+            <w:rStyle w:val="Hyperlink"/>
             <w:noProof/>
           </w:rPr>
           <w:t>2</w:t>
@@ -974,7 +974,7 @@
         </w:r>
         <w:r>
           <w:rPr>
-            <w:rStyle w:val="Lienhypertexte"/>
+            <w:rStyle w:val="Hyperlink"/>
             <w:noProof/>
           </w:rPr>
           <w:t>Planification Initiale</w:t>
@@ -998,7 +998,7 @@
             <w:noProof/>
             <w:webHidden/>
           </w:rPr>
-          <w:instrText xml:space="preserve"> PAGEREF _Toc242089341 \h </w:instrText>
+          <w:instrText xml:space="preserve"> PAGEREF _Toc243470262 \h </w:instrText>
         </w:r>
         <w:r>
           <w:rPr>
@@ -1031,7 +1031,7 @@
     </w:p>
     <w:p>
       <w:pPr>
-        <w:pStyle w:val="TM10"/>
+        <w:pStyle w:val="TOC1"/>
         <w:tabs>
           <w:tab w:val="left" w:pos="400"/>
           <w:tab w:val="right" w:leader="dot" w:pos="9060"/>
@@ -1048,10 +1048,10 @@
           <w14:ligatures w14:val="standardContextual"/>
         </w:rPr>
       </w:pPr>
-      <w:hyperlink w:anchor="_Toc242089342" w:history="1">
-        <w:r>
-          <w:rPr>
-            <w:rStyle w:val="Lienhypertexte"/>
+      <w:hyperlink w:anchor="_Toc243470263" w:history="1">
+        <w:r>
+          <w:rPr>
+            <w:rStyle w:val="Hyperlink"/>
             <w:noProof/>
           </w:rPr>
           <w:t>3</w:t>
@@ -1072,7 +1072,7 @@
         </w:r>
         <w:r>
           <w:rPr>
-            <w:rStyle w:val="Lienhypertexte"/>
+            <w:rStyle w:val="Hyperlink"/>
             <w:noProof/>
           </w:rPr>
           <w:t>Analyse</w:t>
@@ -1096,7 +1096,7 @@
             <w:noProof/>
             <w:webHidden/>
           </w:rPr>
-          <w:instrText xml:space="preserve"> PAGEREF _Toc242089342 \h </w:instrText>
+          <w:instrText xml:space="preserve"> PAGEREF _Toc243470263 \h </w:instrText>
         </w:r>
         <w:r>
           <w:rPr>
@@ -1129,7 +1129,7 @@
     </w:p>
     <w:p>
       <w:pPr>
-        <w:pStyle w:val="TM2"/>
+        <w:pStyle w:val="TOC2"/>
         <w:tabs>
           <w:tab w:val="left" w:pos="800"/>
           <w:tab w:val="right" w:leader="dot" w:pos="9060"/>
@@ -1144,10 +1144,10 @@
           <w14:ligatures w14:val="standardContextual"/>
         </w:rPr>
       </w:pPr>
-      <w:hyperlink w:anchor="_Toc242089343" w:history="1">
-        <w:r>
-          <w:rPr>
-            <w:rStyle w:val="Lienhypertexte"/>
+      <w:hyperlink w:anchor="_Toc243470264" w:history="1">
+        <w:r>
+          <w:rPr>
+            <w:rStyle w:val="Hyperlink"/>
             <w:noProof/>
           </w:rPr>
           <w:t>3.1</w:t>
@@ -1166,7 +1166,7 @@
         </w:r>
         <w:r>
           <w:rPr>
-            <w:rStyle w:val="Lienhypertexte"/>
+            <w:rStyle w:val="Hyperlink"/>
             <w:noProof/>
           </w:rPr>
           <w:t>Opportunités</w:t>
@@ -1190,7 +1190,7 @@
             <w:noProof/>
             <w:webHidden/>
           </w:rPr>
-          <w:instrText xml:space="preserve"> PAGEREF _Toc242089343 \h </w:instrText>
+          <w:instrText xml:space="preserve"> PAGEREF _Toc243470264 \h </w:instrText>
         </w:r>
         <w:r>
           <w:rPr>
@@ -1223,7 +1223,7 @@
     </w:p>
     <w:p>
       <w:pPr>
-        <w:pStyle w:val="TM2"/>
+        <w:pStyle w:val="TOC2"/>
         <w:tabs>
           <w:tab w:val="left" w:pos="800"/>
           <w:tab w:val="right" w:leader="dot" w:pos="9060"/>
@@ -1238,10 +1238,10 @@
           <w14:ligatures w14:val="standardContextual"/>
         </w:rPr>
       </w:pPr>
-      <w:hyperlink w:anchor="_Toc242089344" w:history="1">
-        <w:r>
-          <w:rPr>
-            <w:rStyle w:val="Lienhypertexte"/>
+      <w:hyperlink w:anchor="_Toc243470265" w:history="1">
+        <w:r>
+          <w:rPr>
+            <w:rStyle w:val="Hyperlink"/>
             <w:noProof/>
           </w:rPr>
           <w:t>3.2</w:t>
@@ -1260,7 +1260,7 @@
         </w:r>
         <w:r>
           <w:rPr>
-            <w:rStyle w:val="Lienhypertexte"/>
+            <w:rStyle w:val="Hyperlink"/>
             <w:noProof/>
           </w:rPr>
           <w:t>Document d’analyse et conception</w:t>
@@ -1284,7 +1284,7 @@
             <w:noProof/>
             <w:webHidden/>
           </w:rPr>
-          <w:instrText xml:space="preserve"> PAGEREF _Toc242089344 \h </w:instrText>
+          <w:instrText xml:space="preserve"> PAGEREF _Toc243470265 \h </w:instrText>
         </w:r>
         <w:r>
           <w:rPr>
@@ -1317,7 +1317,7 @@
     </w:p>
     <w:p>
       <w:pPr>
-        <w:pStyle w:val="TM2"/>
+        <w:pStyle w:val="TOC2"/>
         <w:tabs>
           <w:tab w:val="left" w:pos="800"/>
           <w:tab w:val="right" w:leader="dot" w:pos="9060"/>
@@ -1332,10 +1332,10 @@
           <w14:ligatures w14:val="standardContextual"/>
         </w:rPr>
       </w:pPr>
-      <w:hyperlink w:anchor="_Toc242089345" w:history="1">
-        <w:r>
-          <w:rPr>
-            <w:rStyle w:val="Lienhypertexte"/>
+      <w:hyperlink w:anchor="_Toc243470266" w:history="1">
+        <w:r>
+          <w:rPr>
+            <w:rStyle w:val="Hyperlink"/>
             <w:noProof/>
           </w:rPr>
           <w:t>3.3</w:t>
@@ -1354,7 +1354,7 @@
         </w:r>
         <w:r>
           <w:rPr>
-            <w:rStyle w:val="Lienhypertexte"/>
+            <w:rStyle w:val="Hyperlink"/>
             <w:noProof/>
           </w:rPr>
           <w:t>Conception des tests</w:t>
@@ -1378,7 +1378,7 @@
             <w:noProof/>
             <w:webHidden/>
           </w:rPr>
-          <w:instrText xml:space="preserve"> PAGEREF _Toc242089345 \h </w:instrText>
+          <w:instrText xml:space="preserve"> PAGEREF _Toc243470266 \h </w:instrText>
         </w:r>
         <w:r>
           <w:rPr>
@@ -1411,7 +1411,7 @@
     </w:p>
     <w:p>
       <w:pPr>
-        <w:pStyle w:val="TM10"/>
+        <w:pStyle w:val="TOC1"/>
         <w:tabs>
           <w:tab w:val="left" w:pos="400"/>
           <w:tab w:val="right" w:leader="dot" w:pos="9060"/>
@@ -1428,10 +1428,10 @@
           <w14:ligatures w14:val="standardContextual"/>
         </w:rPr>
       </w:pPr>
-      <w:hyperlink w:anchor="_Toc242089346" w:history="1">
-        <w:r>
-          <w:rPr>
-            <w:rStyle w:val="Lienhypertexte"/>
+      <w:hyperlink w:anchor="_Toc243470267" w:history="1">
+        <w:r>
+          <w:rPr>
+            <w:rStyle w:val="Hyperlink"/>
             <w:noProof/>
           </w:rPr>
           <w:t>4</w:t>
@@ -1452,7 +1452,7 @@
         </w:r>
         <w:r>
           <w:rPr>
-            <w:rStyle w:val="Lienhypertexte"/>
+            <w:rStyle w:val="Hyperlink"/>
             <w:noProof/>
           </w:rPr>
           <w:t>Réalisation</w:t>
@@ -1476,7 +1476,7 @@
             <w:noProof/>
             <w:webHidden/>
           </w:rPr>
-          <w:instrText xml:space="preserve"> PAGEREF _Toc242089346 \h </w:instrText>
+          <w:instrText xml:space="preserve"> PAGEREF _Toc243470267 \h </w:instrText>
         </w:r>
         <w:r>
           <w:rPr>
@@ -1509,7 +1509,7 @@
     </w:p>
     <w:p>
       <w:pPr>
-        <w:pStyle w:val="TM2"/>
+        <w:pStyle w:val="TOC2"/>
         <w:tabs>
           <w:tab w:val="left" w:pos="800"/>
           <w:tab w:val="right" w:leader="dot" w:pos="9060"/>
@@ -1524,10 +1524,10 @@
           <w14:ligatures w14:val="standardContextual"/>
         </w:rPr>
       </w:pPr>
-      <w:hyperlink w:anchor="_Toc242089347" w:history="1">
-        <w:r>
-          <w:rPr>
-            <w:rStyle w:val="Lienhypertexte"/>
+      <w:hyperlink w:anchor="_Toc243470268" w:history="1">
+        <w:r>
+          <w:rPr>
+            <w:rStyle w:val="Hyperlink"/>
             <w:noProof/>
           </w:rPr>
           <w:t>4.1</w:t>
@@ -1546,7 +1546,7 @@
         </w:r>
         <w:r>
           <w:rPr>
-            <w:rStyle w:val="Lienhypertexte"/>
+            <w:rStyle w:val="Hyperlink"/>
             <w:noProof/>
           </w:rPr>
           <w:t>Dossier de Réalisation</w:t>
@@ -1570,7 +1570,7 @@
             <w:noProof/>
             <w:webHidden/>
           </w:rPr>
-          <w:instrText xml:space="preserve"> PAGEREF _Toc242089347 \h </w:instrText>
+          <w:instrText xml:space="preserve"> PAGEREF _Toc243470268 \h </w:instrText>
         </w:r>
         <w:r>
           <w:rPr>
@@ -1603,7 +1603,7 @@
     </w:p>
     <w:p>
       <w:pPr>
-        <w:pStyle w:val="TM2"/>
+        <w:pStyle w:val="TOC2"/>
         <w:tabs>
           <w:tab w:val="left" w:pos="800"/>
           <w:tab w:val="right" w:leader="dot" w:pos="9060"/>
@@ -1618,10 +1618,10 @@
           <w14:ligatures w14:val="standardContextual"/>
         </w:rPr>
       </w:pPr>
-      <w:hyperlink w:anchor="_Toc242089348" w:history="1">
-        <w:r>
-          <w:rPr>
-            <w:rStyle w:val="Lienhypertexte"/>
+      <w:hyperlink w:anchor="_Toc243470269" w:history="1">
+        <w:r>
+          <w:rPr>
+            <w:rStyle w:val="Hyperlink"/>
             <w:noProof/>
           </w:rPr>
           <w:t>4.2</w:t>
@@ -1640,7 +1640,7 @@
         </w:r>
         <w:r>
           <w:rPr>
-            <w:rStyle w:val="Lienhypertexte"/>
+            <w:rStyle w:val="Hyperlink"/>
             <w:noProof/>
           </w:rPr>
           <w:t>Modifications</w:t>
@@ -1664,7 +1664,7 @@
             <w:noProof/>
             <w:webHidden/>
           </w:rPr>
-          <w:instrText xml:space="preserve"> PAGEREF _Toc242089348 \h </w:instrText>
+          <w:instrText xml:space="preserve"> PAGEREF _Toc243470269 \h </w:instrText>
         </w:r>
         <w:r>
           <w:rPr>
@@ -1697,7 +1697,7 @@
     </w:p>
     <w:p>
       <w:pPr>
-        <w:pStyle w:val="TM10"/>
+        <w:pStyle w:val="TOC1"/>
         <w:tabs>
           <w:tab w:val="left" w:pos="400"/>
           <w:tab w:val="right" w:leader="dot" w:pos="9060"/>
@@ -1714,10 +1714,10 @@
           <w14:ligatures w14:val="standardContextual"/>
         </w:rPr>
       </w:pPr>
-      <w:hyperlink w:anchor="_Toc242089349" w:history="1">
-        <w:r>
-          <w:rPr>
-            <w:rStyle w:val="Lienhypertexte"/>
+      <w:hyperlink w:anchor="_Toc243470270" w:history="1">
+        <w:r>
+          <w:rPr>
+            <w:rStyle w:val="Hyperlink"/>
             <w:noProof/>
           </w:rPr>
           <w:t>5</w:t>
@@ -1738,10 +1738,24 @@
         </w:r>
         <w:r>
           <w:rPr>
-            <w:rStyle w:val="Lienhypertexte"/>
-            <w:noProof/>
-          </w:rPr>
-          <w:t>Tests</w:t>
+            <w:rStyle w:val="Hyperlink"/>
+            <w:noProof/>
+          </w:rPr>
+          <w:t>Tes</w:t>
+        </w:r>
+        <w:r>
+          <w:rPr>
+            <w:rStyle w:val="Hyperlink"/>
+            <w:noProof/>
+          </w:rPr>
+          <w:t>t</w:t>
+        </w:r>
+        <w:r>
+          <w:rPr>
+            <w:rStyle w:val="Hyperlink"/>
+            <w:noProof/>
+          </w:rPr>
+          <w:t>s</w:t>
         </w:r>
         <w:r>
           <w:rPr>
@@ -1762,7 +1776,7 @@
             <w:noProof/>
             <w:webHidden/>
           </w:rPr>
-          <w:instrText xml:space="preserve"> PAGEREF _Toc242089349 \h </w:instrText>
+          <w:instrText xml:space="preserve"> PAGEREF _Toc243470270 \h </w:instrText>
         </w:r>
         <w:r>
           <w:rPr>
@@ -1795,7 +1809,7 @@
     </w:p>
     <w:p>
       <w:pPr>
-        <w:pStyle w:val="TM2"/>
+        <w:pStyle w:val="TOC2"/>
         <w:tabs>
           <w:tab w:val="left" w:pos="800"/>
           <w:tab w:val="right" w:leader="dot" w:pos="9060"/>
@@ -1810,10 +1824,10 @@
           <w14:ligatures w14:val="standardContextual"/>
         </w:rPr>
       </w:pPr>
-      <w:hyperlink w:anchor="_Toc242089350" w:history="1">
-        <w:r>
-          <w:rPr>
-            <w:rStyle w:val="Lienhypertexte"/>
+      <w:hyperlink w:anchor="_Toc243470271" w:history="1">
+        <w:r>
+          <w:rPr>
+            <w:rStyle w:val="Hyperlink"/>
             <w:noProof/>
           </w:rPr>
           <w:t>5.1</w:t>
@@ -1832,7 +1846,7 @@
         </w:r>
         <w:r>
           <w:rPr>
-            <w:rStyle w:val="Lienhypertexte"/>
+            <w:rStyle w:val="Hyperlink"/>
             <w:noProof/>
           </w:rPr>
           <w:t>Dossier des tests</w:t>
@@ -1856,7 +1870,7 @@
             <w:noProof/>
             <w:webHidden/>
           </w:rPr>
-          <w:instrText xml:space="preserve"> PAGEREF _Toc242089350 \h </w:instrText>
+          <w:instrText xml:space="preserve"> PAGEREF _Toc243470271 \h </w:instrText>
         </w:r>
         <w:r>
           <w:rPr>
@@ -1889,7 +1903,7 @@
     </w:p>
     <w:p>
       <w:pPr>
-        <w:pStyle w:val="TM10"/>
+        <w:pStyle w:val="TOC1"/>
         <w:tabs>
           <w:tab w:val="left" w:pos="400"/>
           <w:tab w:val="right" w:leader="dot" w:pos="9060"/>
@@ -1906,10 +1920,10 @@
           <w14:ligatures w14:val="standardContextual"/>
         </w:rPr>
       </w:pPr>
-      <w:hyperlink w:anchor="_Toc242089351" w:history="1">
-        <w:r>
-          <w:rPr>
-            <w:rStyle w:val="Lienhypertexte"/>
+      <w:hyperlink w:anchor="_Toc243470272" w:history="1">
+        <w:r>
+          <w:rPr>
+            <w:rStyle w:val="Hyperlink"/>
             <w:noProof/>
           </w:rPr>
           <w:t>6</w:t>
@@ -1930,7 +1944,7 @@
         </w:r>
         <w:r>
           <w:rPr>
-            <w:rStyle w:val="Lienhypertexte"/>
+            <w:rStyle w:val="Hyperlink"/>
             <w:noProof/>
           </w:rPr>
           <w:t>CONCEPTION</w:t>
@@ -1954,7 +1968,7 @@
             <w:noProof/>
             <w:webHidden/>
           </w:rPr>
-          <w:instrText xml:space="preserve"> PAGEREF _Toc242089351 \h </w:instrText>
+          <w:instrText xml:space="preserve"> PAGEREF _Toc243470272 \h </w:instrText>
         </w:r>
         <w:r>
           <w:rPr>
@@ -1987,7 +2001,7 @@
     </w:p>
     <w:p>
       <w:pPr>
-        <w:pStyle w:val="TM2"/>
+        <w:pStyle w:val="TOC2"/>
         <w:tabs>
           <w:tab w:val="left" w:pos="800"/>
           <w:tab w:val="right" w:leader="dot" w:pos="9060"/>
@@ -2002,10 +2016,10 @@
           <w14:ligatures w14:val="standardContextual"/>
         </w:rPr>
       </w:pPr>
-      <w:hyperlink w:anchor="_Toc242089352" w:history="1">
-        <w:r>
-          <w:rPr>
-            <w:rStyle w:val="Lienhypertexte"/>
+      <w:hyperlink w:anchor="_Toc243470273" w:history="1">
+        <w:r>
+          <w:rPr>
+            <w:rStyle w:val="Hyperlink"/>
             <w:noProof/>
           </w:rPr>
           <w:t>6.1</w:t>
@@ -2024,7 +2038,7 @@
         </w:r>
         <w:r>
           <w:rPr>
-            <w:rStyle w:val="Lienhypertexte"/>
+            <w:rStyle w:val="Hyperlink"/>
             <w:noProof/>
           </w:rPr>
           <w:t>Diagramme de classe :</w:t>
@@ -2048,7 +2062,7 @@
             <w:noProof/>
             <w:webHidden/>
           </w:rPr>
-          <w:instrText xml:space="preserve"> PAGEREF _Toc242089352 \h </w:instrText>
+          <w:instrText xml:space="preserve"> PAGEREF _Toc243470273 \h </w:instrText>
         </w:r>
         <w:r>
           <w:rPr>
@@ -2081,7 +2095,7 @@
     </w:p>
     <w:p>
       <w:pPr>
-        <w:pStyle w:val="TM10"/>
+        <w:pStyle w:val="TOC1"/>
         <w:tabs>
           <w:tab w:val="left" w:pos="400"/>
           <w:tab w:val="right" w:leader="dot" w:pos="9060"/>
@@ -2098,10 +2112,10 @@
           <w14:ligatures w14:val="standardContextual"/>
         </w:rPr>
       </w:pPr>
-      <w:hyperlink w:anchor="_Toc242089353" w:history="1">
-        <w:r>
-          <w:rPr>
-            <w:rStyle w:val="Lienhypertexte"/>
+      <w:hyperlink w:anchor="_Toc243470274" w:history="1">
+        <w:r>
+          <w:rPr>
+            <w:rStyle w:val="Hyperlink"/>
             <w:noProof/>
           </w:rPr>
           <w:t>7</w:t>
@@ -2122,10 +2136,24 @@
         </w:r>
         <w:r>
           <w:rPr>
-            <w:rStyle w:val="Lienhypertexte"/>
-            <w:noProof/>
-          </w:rPr>
-          <w:t>Utilisation de l’IA</w:t>
+            <w:rStyle w:val="Hyperlink"/>
+            <w:noProof/>
+          </w:rPr>
+          <w:t>Utilisation d</w:t>
+        </w:r>
+        <w:r>
+          <w:rPr>
+            <w:rStyle w:val="Hyperlink"/>
+            <w:noProof/>
+          </w:rPr>
+          <w:t>e</w:t>
+        </w:r>
+        <w:r>
+          <w:rPr>
+            <w:rStyle w:val="Hyperlink"/>
+            <w:noProof/>
+          </w:rPr>
+          <w:t xml:space="preserve"> l’IA</w:t>
         </w:r>
         <w:r>
           <w:rPr>
@@ -2146,7 +2174,7 @@
             <w:noProof/>
             <w:webHidden/>
           </w:rPr>
-          <w:instrText xml:space="preserve"> PAGEREF _Toc242089353 \h </w:instrText>
+          <w:instrText xml:space="preserve"> PAGEREF _Toc243470274 \h </w:instrText>
         </w:r>
         <w:r>
           <w:rPr>
@@ -2179,7 +2207,7 @@
     </w:p>
     <w:p>
       <w:pPr>
-        <w:pStyle w:val="TM10"/>
+        <w:pStyle w:val="TOC1"/>
         <w:tabs>
           <w:tab w:val="left" w:pos="400"/>
           <w:tab w:val="right" w:leader="dot" w:pos="9060"/>
@@ -2196,10 +2224,10 @@
           <w14:ligatures w14:val="standardContextual"/>
         </w:rPr>
       </w:pPr>
-      <w:hyperlink w:anchor="_Toc242089354" w:history="1">
-        <w:r>
-          <w:rPr>
-            <w:rStyle w:val="Lienhypertexte"/>
+      <w:hyperlink w:anchor="_Toc243470275" w:history="1">
+        <w:r>
+          <w:rPr>
+            <w:rStyle w:val="Hyperlink"/>
             <w:noProof/>
           </w:rPr>
           <w:t>8</w:t>
@@ -2220,7 +2248,7 @@
         </w:r>
         <w:r>
           <w:rPr>
-            <w:rStyle w:val="Lienhypertexte"/>
+            <w:rStyle w:val="Hyperlink"/>
             <w:noProof/>
           </w:rPr>
           <w:t>Bilan déroulement</w:t>
@@ -2244,7 +2272,7 @@
             <w:noProof/>
             <w:webHidden/>
           </w:rPr>
-          <w:instrText xml:space="preserve"> PAGEREF _Toc242089354 \h </w:instrText>
+          <w:instrText xml:space="preserve"> PAGEREF _Toc243470275 \h </w:instrText>
         </w:r>
         <w:r>
           <w:rPr>
@@ -2277,7 +2305,7 @@
     </w:p>
     <w:p>
       <w:pPr>
-        <w:pStyle w:val="TM10"/>
+        <w:pStyle w:val="TOC1"/>
         <w:tabs>
           <w:tab w:val="left" w:pos="400"/>
           <w:tab w:val="right" w:leader="dot" w:pos="9060"/>
@@ -2294,10 +2322,10 @@
           <w14:ligatures w14:val="standardContextual"/>
         </w:rPr>
       </w:pPr>
-      <w:hyperlink w:anchor="_Toc242089355" w:history="1">
-        <w:r>
-          <w:rPr>
-            <w:rStyle w:val="Lienhypertexte"/>
+      <w:hyperlink w:anchor="_Toc243470276" w:history="1">
+        <w:r>
+          <w:rPr>
+            <w:rStyle w:val="Hyperlink"/>
             <w:noProof/>
           </w:rPr>
           <w:t>9</w:t>
@@ -2318,7 +2346,7 @@
         </w:r>
         <w:r>
           <w:rPr>
-            <w:rStyle w:val="Lienhypertexte"/>
+            <w:rStyle w:val="Hyperlink"/>
             <w:noProof/>
           </w:rPr>
           <w:t>Bilan produit</w:t>
@@ -2342,7 +2370,7 @@
             <w:noProof/>
             <w:webHidden/>
           </w:rPr>
-          <w:instrText xml:space="preserve"> PAGEREF _Toc242089355 \h </w:instrText>
+          <w:instrText xml:space="preserve"> PAGEREF _Toc243470276 \h </w:instrText>
         </w:r>
         <w:r>
           <w:rPr>
@@ -2375,7 +2403,7 @@
     </w:p>
     <w:p>
       <w:pPr>
-        <w:pStyle w:val="TM10"/>
+        <w:pStyle w:val="TOC1"/>
         <w:tabs>
           <w:tab w:val="left" w:pos="600"/>
           <w:tab w:val="right" w:leader="dot" w:pos="9060"/>
@@ -2392,10 +2420,10 @@
           <w14:ligatures w14:val="standardContextual"/>
         </w:rPr>
       </w:pPr>
-      <w:hyperlink w:anchor="_Toc242089356" w:history="1">
-        <w:r>
-          <w:rPr>
-            <w:rStyle w:val="Lienhypertexte"/>
+      <w:hyperlink w:anchor="_Toc243470277" w:history="1">
+        <w:r>
+          <w:rPr>
+            <w:rStyle w:val="Hyperlink"/>
             <w:noProof/>
           </w:rPr>
           <w:t>10</w:t>
@@ -2416,7 +2444,7 @@
         </w:r>
         <w:r>
           <w:rPr>
-            <w:rStyle w:val="Lienhypertexte"/>
+            <w:rStyle w:val="Hyperlink"/>
             <w:noProof/>
           </w:rPr>
           <w:t>Conclusion</w:t>
@@ -2440,7 +2468,7 @@
             <w:noProof/>
             <w:webHidden/>
           </w:rPr>
-          <w:instrText xml:space="preserve"> PAGEREF _Toc242089356 \h </w:instrText>
+          <w:instrText xml:space="preserve"> PAGEREF _Toc243470277 \h </w:instrText>
         </w:r>
         <w:r>
           <w:rPr>
@@ -2489,11 +2517,11 @@
     </w:p>
     <w:p>
       <w:pPr>
-        <w:pStyle w:val="Titre1"/>
+        <w:pStyle w:val="Heading1"/>
       </w:pPr>
       <w:bookmarkStart w:id="0" w:name="_Toc532179955"/>
       <w:bookmarkStart w:id="1" w:name="_Toc165969637"/>
-      <w:bookmarkStart w:id="2" w:name="_Toc242089333"/>
+      <w:bookmarkStart w:id="2" w:name="_Toc243470254"/>
       <w:r>
         <w:lastRenderedPageBreak/>
         <w:t>Spécifications</w:t>
@@ -2504,16 +2532,16 @@
     </w:p>
     <w:p>
       <w:pPr>
-        <w:pStyle w:val="Corpsdetexte"/>
-      </w:pPr>
-    </w:p>
-    <w:p>
-      <w:pPr>
-        <w:pStyle w:val="Titre2"/>
-      </w:pPr>
-      <w:bookmarkStart w:id="3" w:name="_Toc242089334"/>
-      <w:bookmarkStart w:id="4" w:name="_Toc532179969"/>
-      <w:bookmarkStart w:id="5" w:name="_Toc165969639"/>
+        <w:pStyle w:val="BodyText"/>
+      </w:pPr>
+    </w:p>
+    <w:p>
+      <w:pPr>
+        <w:pStyle w:val="Heading2"/>
+      </w:pPr>
+      <w:bookmarkStart w:id="3" w:name="_Toc532179969"/>
+      <w:bookmarkStart w:id="4" w:name="_Toc165969639"/>
+      <w:bookmarkStart w:id="5" w:name="_Toc243470255"/>
       <w:r>
         <w:t>T</w:t>
       </w:r>
@@ -2523,11 +2551,11 @@
       <w:r>
         <w:t>e</w:t>
       </w:r>
-      <w:bookmarkEnd w:id="3"/>
-    </w:p>
-    <w:p>
-      <w:pPr>
-        <w:pStyle w:val="Retraitcorpsdetexte"/>
+      <w:bookmarkEnd w:id="5"/>
+    </w:p>
+    <w:p>
+      <w:pPr>
+        <w:pStyle w:val="BodyTextIndent"/>
         <w:ind w:left="0"/>
       </w:pPr>
       <w:r>
@@ -2536,9 +2564,9 @@
     </w:p>
     <w:p>
       <w:pPr>
-        <w:pStyle w:val="Titre2"/>
-      </w:pPr>
-      <w:bookmarkStart w:id="6" w:name="_Toc242089335"/>
+        <w:pStyle w:val="Heading2"/>
+      </w:pPr>
+      <w:bookmarkStart w:id="6" w:name="_Toc243470256"/>
       <w:r>
         <w:t>Description</w:t>
       </w:r>
@@ -2546,12 +2574,12 @@
     </w:p>
     <w:p>
       <w:pPr>
-        <w:pStyle w:val="Retraitcorpsdetexte"/>
-      </w:pPr>
-    </w:p>
-    <w:p>
-      <w:pPr>
-        <w:pStyle w:val="Retraitcorpsdetexte"/>
+        <w:pStyle w:val="BodyTextIndent"/>
+      </w:pPr>
+    </w:p>
+    <w:p>
+      <w:pPr>
+        <w:pStyle w:val="BodyTextIndent"/>
         <w:ind w:left="0"/>
       </w:pPr>
       <w:r>
@@ -2560,9 +2588,9 @@
     </w:p>
     <w:p>
       <w:pPr>
-        <w:pStyle w:val="Titre2"/>
-      </w:pPr>
-      <w:bookmarkStart w:id="7" w:name="_Toc242089336"/>
+        <w:pStyle w:val="Heading2"/>
+      </w:pPr>
+      <w:bookmarkStart w:id="7" w:name="_Toc243470257"/>
       <w:r>
         <w:t>Matériel et logiciels à disposition</w:t>
       </w:r>
@@ -2570,13 +2598,13 @@
     </w:p>
     <w:p>
       <w:pPr>
-        <w:pStyle w:val="Retraitcorpsdetexte"/>
+        <w:pStyle w:val="BodyTextIndent"/>
         <w:ind w:left="0"/>
       </w:pPr>
     </w:p>
     <w:p>
       <w:pPr>
-        <w:pStyle w:val="Paragraphedeliste"/>
+        <w:pStyle w:val="ListParagraph"/>
         <w:numPr>
           <w:ilvl w:val="0"/>
           <w:numId w:val="10"/>
@@ -2588,7 +2616,7 @@
     </w:p>
     <w:p>
       <w:pPr>
-        <w:pStyle w:val="Paragraphedeliste"/>
+        <w:pStyle w:val="ListParagraph"/>
         <w:numPr>
           <w:ilvl w:val="0"/>
           <w:numId w:val="10"/>
@@ -2600,9 +2628,9 @@
     </w:p>
     <w:p>
       <w:pPr>
-        <w:pStyle w:val="Titre2"/>
-      </w:pPr>
-      <w:bookmarkStart w:id="8" w:name="_Toc242089337"/>
+        <w:pStyle w:val="Heading2"/>
+      </w:pPr>
+      <w:bookmarkStart w:id="8" w:name="_Toc243470258"/>
       <w:r>
         <w:t>P</w:t>
       </w:r>
@@ -2613,12 +2641,12 @@
     </w:p>
     <w:p>
       <w:pPr>
-        <w:pStyle w:val="Retraitcorpsdetexte"/>
-      </w:pPr>
-    </w:p>
-    <w:p>
-      <w:pPr>
-        <w:pStyle w:val="Retraitcorpsdetexte"/>
+        <w:pStyle w:val="BodyTextIndent"/>
+      </w:pPr>
+    </w:p>
+    <w:p>
+      <w:pPr>
+        <w:pStyle w:val="BodyTextIndent"/>
         <w:numPr>
           <w:ilvl w:val="0"/>
           <w:numId w:val="10"/>
@@ -2630,7 +2658,7 @@
     </w:p>
     <w:p>
       <w:pPr>
-        <w:pStyle w:val="Retraitcorpsdetexte"/>
+        <w:pStyle w:val="BodyTextIndent"/>
         <w:numPr>
           <w:ilvl w:val="0"/>
           <w:numId w:val="10"/>
@@ -2642,9 +2670,9 @@
     </w:p>
     <w:p>
       <w:pPr>
-        <w:pStyle w:val="Titre2"/>
-      </w:pPr>
-      <w:bookmarkStart w:id="9" w:name="_Toc242089338"/>
+        <w:pStyle w:val="Heading2"/>
+      </w:pPr>
+      <w:bookmarkStart w:id="9" w:name="_Toc243470259"/>
       <w:r>
         <w:t>Cahier des charges</w:t>
       </w:r>
@@ -2652,7 +2680,7 @@
     </w:p>
     <w:p>
       <w:pPr>
-        <w:pStyle w:val="Retraitcorpsdetexte3"/>
+        <w:pStyle w:val="BodyTextIndent3"/>
       </w:pPr>
       <w:r>
         <w:t xml:space="preserve">Cahier des charges en </w:t>
@@ -2666,9 +2694,9 @@
     </w:p>
     <w:p>
       <w:pPr>
-        <w:pStyle w:val="Titre2"/>
-      </w:pPr>
-      <w:bookmarkStart w:id="10" w:name="_Toc242089339"/>
+        <w:pStyle w:val="Heading2"/>
+      </w:pPr>
+      <w:bookmarkStart w:id="10" w:name="_Toc243470260"/>
       <w:r>
         <w:t>Les points suivants seront évalués</w:t>
       </w:r>
@@ -2676,7 +2704,7 @@
     </w:p>
     <w:p>
       <w:pPr>
-        <w:pStyle w:val="Retraitcorpsdetexte"/>
+        <w:pStyle w:val="BodyTextIndent"/>
         <w:numPr>
           <w:ilvl w:val="0"/>
           <w:numId w:val="5"/>
@@ -2688,7 +2716,7 @@
     </w:p>
     <w:p>
       <w:pPr>
-        <w:pStyle w:val="Retraitcorpsdetexte"/>
+        <w:pStyle w:val="BodyTextIndent"/>
         <w:numPr>
           <w:ilvl w:val="0"/>
           <w:numId w:val="5"/>
@@ -2709,7 +2737,7 @@
     </w:p>
     <w:p>
       <w:pPr>
-        <w:pStyle w:val="Retraitcorpsdetexte"/>
+        <w:pStyle w:val="BodyTextIndent"/>
         <w:numPr>
           <w:ilvl w:val="0"/>
           <w:numId w:val="5"/>
@@ -2721,7 +2749,7 @@
     </w:p>
     <w:p>
       <w:pPr>
-        <w:pStyle w:val="Retraitcorpsdetexte"/>
+        <w:pStyle w:val="BodyTextIndent"/>
         <w:numPr>
           <w:ilvl w:val="0"/>
           <w:numId w:val="5"/>
@@ -2739,7 +2767,7 @@
     </w:p>
     <w:p>
       <w:pPr>
-        <w:pStyle w:val="Retraitcorpsdetexte"/>
+        <w:pStyle w:val="BodyTextIndent"/>
         <w:numPr>
           <w:ilvl w:val="0"/>
           <w:numId w:val="5"/>
@@ -2751,9 +2779,9 @@
     </w:p>
     <w:p>
       <w:pPr>
-        <w:pStyle w:val="Titre2"/>
-      </w:pPr>
-      <w:bookmarkStart w:id="11" w:name="_Toc242089340"/>
+        <w:pStyle w:val="Heading2"/>
+      </w:pPr>
+      <w:bookmarkStart w:id="11" w:name="_Toc243470261"/>
       <w:r>
         <w:t>Validation et conditions de réussite</w:t>
       </w:r>
@@ -2761,7 +2789,7 @@
     </w:p>
     <w:p>
       <w:pPr>
-        <w:pStyle w:val="Retraitcorpsdetexte"/>
+        <w:pStyle w:val="BodyTextIndent"/>
         <w:numPr>
           <w:ilvl w:val="0"/>
           <w:numId w:val="5"/>
@@ -2773,7 +2801,7 @@
     </w:p>
     <w:p>
       <w:pPr>
-        <w:pStyle w:val="Retraitcorpsdetexte"/>
+        <w:pStyle w:val="BodyTextIndent"/>
         <w:numPr>
           <w:ilvl w:val="0"/>
           <w:numId w:val="5"/>
@@ -2785,7 +2813,7 @@
     </w:p>
     <w:p>
       <w:pPr>
-        <w:pStyle w:val="Retraitcorpsdetexte"/>
+        <w:pStyle w:val="BodyTextIndent"/>
         <w:numPr>
           <w:ilvl w:val="0"/>
           <w:numId w:val="5"/>
@@ -2797,14 +2825,14 @@
     </w:p>
     <w:p>
       <w:pPr>
-        <w:pStyle w:val="Titre1"/>
-      </w:pPr>
-      <w:bookmarkStart w:id="12" w:name="_Toc242089341"/>
+        <w:pStyle w:val="Heading1"/>
+      </w:pPr>
+      <w:bookmarkStart w:id="12" w:name="_Toc243470262"/>
       <w:r>
         <w:t>Planification</w:t>
       </w:r>
+      <w:bookmarkEnd w:id="3"/>
       <w:bookmarkEnd w:id="4"/>
-      <w:bookmarkEnd w:id="5"/>
       <w:r>
         <w:t xml:space="preserve"> Initiale</w:t>
       </w:r>
@@ -2812,7 +2840,7 @@
     </w:p>
     <w:p>
       <w:pPr>
-        <w:pStyle w:val="Corpsdetexte"/>
+        <w:pStyle w:val="BodyText"/>
       </w:pPr>
       <w:r>
         <w:t xml:space="preserve">Se référer à </w:t>
@@ -2820,7 +2848,7 @@
       <w:hyperlink r:id="rId12" w:history="1">
         <w:r>
           <w:rPr>
-            <w:rStyle w:val="Lienhypertexte"/>
+            <w:rStyle w:val="Hyperlink"/>
           </w:rPr>
           <w:t>Planning — pm2etml</w:t>
         </w:r>
@@ -2837,11 +2865,11 @@
     </w:p>
     <w:p>
       <w:pPr>
-        <w:pStyle w:val="Titre1"/>
+        <w:pStyle w:val="Heading1"/>
       </w:pPr>
       <w:bookmarkStart w:id="13" w:name="_Toc532179957"/>
       <w:bookmarkStart w:id="14" w:name="_Toc165969641"/>
-      <w:bookmarkStart w:id="15" w:name="_Toc242089342"/>
+      <w:bookmarkStart w:id="15" w:name="_Toc243470263"/>
       <w:r>
         <w:t>Analyse</w:t>
       </w:r>
@@ -2851,9 +2879,9 @@
     </w:p>
     <w:p>
       <w:pPr>
-        <w:pStyle w:val="Titre2"/>
-      </w:pPr>
-      <w:bookmarkStart w:id="16" w:name="_Toc242089343"/>
+        <w:pStyle w:val="Heading2"/>
+      </w:pPr>
+      <w:bookmarkStart w:id="16" w:name="_Toc243470264"/>
       <w:r>
         <w:t>Opportunités</w:t>
       </w:r>
@@ -2861,7 +2889,7 @@
     </w:p>
     <w:p>
       <w:pPr>
-        <w:pStyle w:val="Retraitcorpsdetexte"/>
+        <w:pStyle w:val="BodyTextIndent"/>
       </w:pPr>
     </w:p>
     <w:p>
@@ -2871,7 +2899,7 @@
     </w:p>
     <w:p>
       <w:pPr>
-        <w:pStyle w:val="Paragraphedeliste"/>
+        <w:pStyle w:val="ListParagraph"/>
         <w:numPr>
           <w:ilvl w:val="0"/>
           <w:numId w:val="10"/>
@@ -2883,7 +2911,7 @@
     </w:p>
     <w:p>
       <w:pPr>
-        <w:pStyle w:val="Paragraphedeliste"/>
+        <w:pStyle w:val="ListParagraph"/>
         <w:numPr>
           <w:ilvl w:val="0"/>
           <w:numId w:val="10"/>
@@ -2906,11 +2934,11 @@
     </w:p>
     <w:p>
       <w:pPr>
-        <w:pStyle w:val="Titre2"/>
+        <w:pStyle w:val="Heading2"/>
       </w:pPr>
       <w:bookmarkStart w:id="17" w:name="_Toc532179959"/>
       <w:bookmarkStart w:id="18" w:name="_Toc165969643"/>
-      <w:bookmarkStart w:id="19" w:name="_Toc242089344"/>
+      <w:bookmarkStart w:id="19" w:name="_Toc243470265"/>
       <w:r>
         <w:lastRenderedPageBreak/>
         <w:t>Document d’analyse</w:t>
@@ -2924,7 +2952,7 @@
     </w:p>
     <w:p>
       <w:pPr>
-        <w:pStyle w:val="Retraitcorpsdetexte"/>
+        <w:pStyle w:val="BodyTextIndent"/>
         <w:ind w:left="0"/>
       </w:pPr>
       <w:r>
@@ -2933,7 +2961,7 @@
     </w:p>
     <w:p>
       <w:pPr>
-        <w:pStyle w:val="Retraitcorpsdetexte"/>
+        <w:pStyle w:val="BodyTextIndent"/>
         <w:numPr>
           <w:ilvl w:val="0"/>
           <w:numId w:val="10"/>
@@ -2953,7 +2981,7 @@
     </w:p>
     <w:p>
       <w:pPr>
-        <w:pStyle w:val="Retraitcorpsdetexte"/>
+        <w:pStyle w:val="BodyTextIndent"/>
         <w:ind w:left="720"/>
       </w:pPr>
       <w:r>
@@ -2962,7 +2990,7 @@
     </w:p>
     <w:p>
       <w:pPr>
-        <w:pStyle w:val="Retraitcorpsdetexte"/>
+        <w:pStyle w:val="BodyTextIndent"/>
         <w:numPr>
           <w:ilvl w:val="0"/>
           <w:numId w:val="10"/>
@@ -2996,7 +3024,7 @@
     </w:p>
     <w:p>
       <w:pPr>
-        <w:pStyle w:val="Retraitcorpsdetexte"/>
+        <w:pStyle w:val="BodyTextIndent"/>
         <w:ind w:left="720"/>
       </w:pPr>
       <w:r>
@@ -3005,13 +3033,13 @@
     </w:p>
     <w:p>
       <w:pPr>
-        <w:pStyle w:val="Retraitcorpsdetexte"/>
+        <w:pStyle w:val="BodyTextIndent"/>
         <w:ind w:left="0"/>
       </w:pPr>
     </w:p>
     <w:p>
       <w:pPr>
-        <w:pStyle w:val="Retraitcorpsdetexte"/>
+        <w:pStyle w:val="BodyTextIndent"/>
         <w:numPr>
           <w:ilvl w:val="0"/>
           <w:numId w:val="10"/>
@@ -3030,7 +3058,7 @@
     </w:p>
     <w:p>
       <w:pPr>
-        <w:pStyle w:val="Retraitcorpsdetexte"/>
+        <w:pStyle w:val="BodyTextIndent"/>
         <w:ind w:left="720"/>
       </w:pPr>
       <w:r>
@@ -3039,7 +3067,7 @@
     </w:p>
     <w:p>
       <w:pPr>
-        <w:pStyle w:val="Retraitcorpsdetexte"/>
+        <w:pStyle w:val="BodyTextIndent"/>
         <w:numPr>
           <w:ilvl w:val="0"/>
           <w:numId w:val="10"/>
@@ -3058,7 +3086,7 @@
     </w:p>
     <w:p>
       <w:pPr>
-        <w:pStyle w:val="Retraitcorpsdetexte"/>
+        <w:pStyle w:val="BodyTextIndent"/>
         <w:ind w:left="720"/>
       </w:pPr>
       <w:r>
@@ -3067,7 +3095,7 @@
     </w:p>
     <w:p>
       <w:pPr>
-        <w:pStyle w:val="Retraitcorpsdetexte"/>
+        <w:pStyle w:val="BodyTextIndent"/>
         <w:numPr>
           <w:ilvl w:val="0"/>
           <w:numId w:val="10"/>
@@ -3086,7 +3114,7 @@
     </w:p>
     <w:p>
       <w:pPr>
-        <w:pStyle w:val="Retraitcorpsdetexte"/>
+        <w:pStyle w:val="BodyTextIndent"/>
         <w:ind w:left="720"/>
       </w:pPr>
       <w:r>
@@ -3095,7 +3123,7 @@
     </w:p>
     <w:p>
       <w:pPr>
-        <w:pStyle w:val="Retraitcorpsdetexte"/>
+        <w:pStyle w:val="BodyTextIndent"/>
         <w:numPr>
           <w:ilvl w:val="0"/>
           <w:numId w:val="10"/>
@@ -3114,7 +3142,7 @@
     </w:p>
     <w:p>
       <w:pPr>
-        <w:pStyle w:val="Retraitcorpsdetexte"/>
+        <w:pStyle w:val="BodyTextIndent"/>
         <w:ind w:left="720"/>
       </w:pPr>
       <w:r>
@@ -3141,11 +3169,11 @@
     </w:p>
     <w:p>
       <w:pPr>
-        <w:pStyle w:val="Titre2"/>
+        <w:pStyle w:val="Heading2"/>
       </w:pPr>
       <w:bookmarkStart w:id="20" w:name="_Toc532179967"/>
       <w:bookmarkStart w:id="21" w:name="_Toc165969651"/>
-      <w:bookmarkStart w:id="22" w:name="_Toc242089345"/>
+      <w:bookmarkStart w:id="22" w:name="_Toc243470266"/>
       <w:r>
         <w:t>Conception des tests</w:t>
       </w:r>
@@ -3188,11 +3216,11 @@
     </w:p>
     <w:p>
       <w:pPr>
-        <w:pStyle w:val="Titre1"/>
+        <w:pStyle w:val="Heading1"/>
       </w:pPr>
       <w:bookmarkStart w:id="24" w:name="_Toc532179964"/>
       <w:bookmarkStart w:id="25" w:name="_Toc165969648"/>
-      <w:bookmarkStart w:id="26" w:name="_Toc242089346"/>
+      <w:bookmarkStart w:id="26" w:name="_Toc243470267"/>
       <w:bookmarkEnd w:id="23"/>
       <w:r>
         <w:t>Réalisation</w:t>
@@ -3203,11 +3231,11 @@
     </w:p>
     <w:p>
       <w:pPr>
-        <w:pStyle w:val="Titre2"/>
+        <w:pStyle w:val="Heading2"/>
       </w:pPr>
       <w:bookmarkStart w:id="27" w:name="_Toc532179965"/>
       <w:bookmarkStart w:id="28" w:name="_Toc165969649"/>
-      <w:bookmarkStart w:id="29" w:name="_Toc242089347"/>
+      <w:bookmarkStart w:id="29" w:name="_Toc243470268"/>
       <w:r>
         <w:t>Dossier de Réalisation</w:t>
       </w:r>
@@ -3217,7 +3245,7 @@
     </w:p>
     <w:p>
       <w:pPr>
-        <w:pStyle w:val="Retraitcorpsdetexte"/>
+        <w:pStyle w:val="BodyTextIndent"/>
       </w:pPr>
       <w:r>
         <w:t xml:space="preserve">Outils utilisés : </w:t>
@@ -3225,7 +3253,7 @@
     </w:p>
     <w:p>
       <w:pPr>
-        <w:pStyle w:val="Retraitcorpsdetexte"/>
+        <w:pStyle w:val="BodyTextIndent"/>
       </w:pPr>
       <w:r>
         <w:t>Windows 11, Visual Studio 2022, .Net Framework</w:t>
@@ -3233,7 +3261,7 @@
     </w:p>
     <w:p>
       <w:pPr>
-        <w:pStyle w:val="Retraitcorpsdetexte"/>
+        <w:pStyle w:val="BodyTextIndent"/>
       </w:pPr>
       <w:r>
         <w:t>Configurations spéciales</w:t>
@@ -3244,7 +3272,7 @@
     </w:p>
     <w:p>
       <w:pPr>
-        <w:pStyle w:val="Retraitcorpsdetexte"/>
+        <w:pStyle w:val="BodyTextIndent"/>
       </w:pPr>
       <w:r>
         <w:t>Aucune</w:t>
@@ -3252,11 +3280,11 @@
     </w:p>
     <w:p>
       <w:pPr>
-        <w:pStyle w:val="Titre2"/>
+        <w:pStyle w:val="Heading2"/>
       </w:pPr>
       <w:bookmarkStart w:id="30" w:name="_Toc532179960"/>
       <w:bookmarkStart w:id="31" w:name="_Toc165969644"/>
-      <w:bookmarkStart w:id="32" w:name="_Toc242089348"/>
+      <w:bookmarkStart w:id="32" w:name="_Toc243470269"/>
       <w:r>
         <w:t>Modifications</w:t>
       </w:r>
@@ -3266,7 +3294,7 @@
     </w:p>
     <w:p>
       <w:pPr>
-        <w:pStyle w:val="Retraitcorpsdetexte"/>
+        <w:pStyle w:val="BodyTextIndent"/>
       </w:pPr>
       <w:r>
         <w:t>Aucune Modification n’a été faite.</w:t>
@@ -3274,11 +3302,11 @@
     </w:p>
     <w:p>
       <w:pPr>
-        <w:pStyle w:val="Titre1"/>
+        <w:pStyle w:val="Heading1"/>
       </w:pPr>
       <w:bookmarkStart w:id="33" w:name="_Toc532179966"/>
       <w:bookmarkStart w:id="34" w:name="_Toc165969650"/>
-      <w:bookmarkStart w:id="35" w:name="_Toc242089349"/>
+      <w:bookmarkStart w:id="35" w:name="_Toc243470270"/>
       <w:r>
         <w:t>Tests</w:t>
       </w:r>
@@ -3288,12 +3316,12 @@
     </w:p>
     <w:p>
       <w:pPr>
-        <w:pStyle w:val="Titre2"/>
+        <w:pStyle w:val="Heading2"/>
       </w:pPr>
       <w:bookmarkStart w:id="36" w:name="_Toc532179968"/>
       <w:bookmarkStart w:id="37" w:name="_Toc165969652"/>
       <w:bookmarkStart w:id="38" w:name="_Ref308525868"/>
-      <w:bookmarkStart w:id="39" w:name="_Toc242089350"/>
+      <w:bookmarkStart w:id="39" w:name="_Toc243470271"/>
       <w:r>
         <w:t>Dossier des tests</w:t>
       </w:r>
@@ -3304,7 +3332,7 @@
     </w:p>
     <w:p>
       <w:pPr>
-        <w:pStyle w:val="Retraitcorpsdetexte"/>
+        <w:pStyle w:val="BodyTextIndent"/>
       </w:pPr>
     </w:p>
     <w:p>
@@ -3450,9 +3478,9 @@
     </w:p>
     <w:p>
       <w:pPr>
-        <w:pStyle w:val="Titre1"/>
-      </w:pPr>
-      <w:bookmarkStart w:id="40" w:name="_Toc242089351"/>
+        <w:pStyle w:val="Heading1"/>
+      </w:pPr>
+      <w:bookmarkStart w:id="40" w:name="_Toc243470272"/>
       <w:r>
         <w:t>CONCEPTION</w:t>
       </w:r>
@@ -3460,9 +3488,9 @@
     </w:p>
     <w:p>
       <w:pPr>
-        <w:pStyle w:val="Titre2"/>
-      </w:pPr>
-      <w:bookmarkStart w:id="41" w:name="_Toc242089352"/>
+        <w:pStyle w:val="Heading2"/>
+      </w:pPr>
+      <w:bookmarkStart w:id="41" w:name="_Toc243470273"/>
       <w:r>
         <w:t>Diagramme de classe :</w:t>
       </w:r>
@@ -3473,7 +3501,7 @@
     </w:p>
     <w:p>
       <w:pPr>
-        <w:pStyle w:val="Corpsdetexte"/>
+        <w:pStyle w:val="BodyText"/>
       </w:pPr>
       <w:r>
         <w:rPr>
@@ -3518,7 +3546,7 @@
     </w:p>
     <w:p>
       <w:pPr>
-        <w:pStyle w:val="Corpsdetexte"/>
+        <w:pStyle w:val="BodyText"/>
       </w:pPr>
       <w:r>
         <w:t xml:space="preserve">Fait sur looping, Toutes les classes sont reliées à la class Parking et sont accessible de toutes. Il n’y a que parking et ticket qui ont </w:t>
@@ -3537,14 +3565,14 @@
     </w:p>
     <w:p>
       <w:pPr>
-        <w:pStyle w:val="Corpsdetexte"/>
-      </w:pPr>
-    </w:p>
-    <w:p>
-      <w:pPr>
-        <w:pStyle w:val="Titre1"/>
-      </w:pPr>
-      <w:bookmarkStart w:id="42" w:name="_Toc242089353"/>
+        <w:pStyle w:val="BodyText"/>
+      </w:pPr>
+    </w:p>
+    <w:p>
+      <w:pPr>
+        <w:pStyle w:val="Heading1"/>
+      </w:pPr>
+      <w:bookmarkStart w:id="42" w:name="_Toc243470274"/>
       <w:r>
         <w:t>Utilisation de l’IA</w:t>
       </w:r>
@@ -3552,7 +3580,7 @@
     </w:p>
     <w:p>
       <w:pPr>
-        <w:pStyle w:val="Corpsdetexte"/>
+        <w:pStyle w:val="BodyText"/>
       </w:pPr>
       <w:r>
         <w:rPr>
@@ -3567,7 +3595,7 @@
     </w:p>
     <w:p>
       <w:pPr>
-        <w:pStyle w:val="Corpsdetexte"/>
+        <w:pStyle w:val="BodyText"/>
       </w:pPr>
       <w:r>
         <w:rPr>
@@ -3597,7 +3625,7 @@
     </w:p>
     <w:p>
       <w:pPr>
-        <w:pStyle w:val="Corpsdetexte"/>
+        <w:pStyle w:val="BodyText"/>
       </w:pPr>
       <w:r>
         <w:rPr>
@@ -3618,19 +3646,19 @@
     </w:p>
     <w:p>
       <w:pPr>
-        <w:pStyle w:val="Corpsdetexte"/>
-      </w:pPr>
-    </w:p>
-    <w:p>
-      <w:pPr>
-        <w:pStyle w:val="Corpsdetexte"/>
-      </w:pPr>
-    </w:p>
-    <w:p>
-      <w:pPr>
-        <w:pStyle w:val="Titre1"/>
-      </w:pPr>
-      <w:bookmarkStart w:id="43" w:name="_Toc242089354"/>
+        <w:pStyle w:val="BodyText"/>
+      </w:pPr>
+    </w:p>
+    <w:p>
+      <w:pPr>
+        <w:pStyle w:val="BodyText"/>
+      </w:pPr>
+    </w:p>
+    <w:p>
+      <w:pPr>
+        <w:pStyle w:val="Heading1"/>
+      </w:pPr>
+      <w:bookmarkStart w:id="43" w:name="_Toc243470275"/>
       <w:r>
         <w:t>Bi</w:t>
       </w:r>
@@ -3641,7 +3669,7 @@
     </w:p>
     <w:p>
       <w:pPr>
-        <w:pStyle w:val="Corpsdetexte"/>
+        <w:pStyle w:val="BodyText"/>
       </w:pPr>
       <w:r>
         <w:t>La planification était finalement très surestimée car finalement j’ai réussi à finir tous les objectifs le 4 octobre au lieu du 30 octobre.</w:t>
@@ -3649,7 +3677,7 @@
     </w:p>
     <w:p>
       <w:pPr>
-        <w:pStyle w:val="Corpsdetexte"/>
+        <w:pStyle w:val="BodyText"/>
       </w:pPr>
       <w:r>
         <w:t>Ma méthodologie était de simplement suivre les points de ma planification et dès que je terminais une étape, je la mettais en « Effectué » puis je remplissais mon journal de travail et finalement mon commit.</w:t>
@@ -3657,7 +3685,7 @@
     </w:p>
     <w:p>
       <w:pPr>
-        <w:pStyle w:val="Corpsdetexte"/>
+        <w:pStyle w:val="BodyText"/>
       </w:pPr>
       <w:r>
         <w:t>Je n’ai pas rencontré de problème durant le proje</w:t>
@@ -3671,19 +3699,19 @@
     </w:p>
     <w:p>
       <w:pPr>
-        <w:pStyle w:val="Corpsdetexte"/>
-      </w:pPr>
-    </w:p>
-    <w:p>
-      <w:pPr>
-        <w:pStyle w:val="Corpsdetexte"/>
-      </w:pPr>
-    </w:p>
-    <w:p>
-      <w:pPr>
-        <w:pStyle w:val="Titre1"/>
-      </w:pPr>
-      <w:bookmarkStart w:id="44" w:name="_Toc242089355"/>
+        <w:pStyle w:val="BodyText"/>
+      </w:pPr>
+    </w:p>
+    <w:p>
+      <w:pPr>
+        <w:pStyle w:val="BodyText"/>
+      </w:pPr>
+    </w:p>
+    <w:p>
+      <w:pPr>
+        <w:pStyle w:val="Heading1"/>
+      </w:pPr>
+      <w:bookmarkStart w:id="44" w:name="_Toc243470276"/>
       <w:r>
         <w:t>Bilan produit</w:t>
       </w:r>
@@ -3691,7 +3719,7 @@
     </w:p>
     <w:p>
       <w:pPr>
-        <w:pStyle w:val="Corpsdetexte"/>
+        <w:pStyle w:val="BodyText"/>
       </w:pPr>
       <w:r>
         <w:t>Tous les objectifs ont été fait et à 100%.</w:t>
@@ -3699,7 +3727,7 @@
     </w:p>
     <w:p>
       <w:pPr>
-        <w:pStyle w:val="Corpsdetexte"/>
+        <w:pStyle w:val="BodyText"/>
       </w:pPr>
       <w:r>
         <w:t>Tous les objectifs que j’avais mis je les ai suivis à la lettre, quasiment aucune modification n’a été faite sur les objectifs de la planification.</w:t>
@@ -3707,10 +3735,10 @@
     </w:p>
     <w:p>
       <w:pPr>
-        <w:pStyle w:val="Titre1"/>
+        <w:pStyle w:val="Heading1"/>
       </w:pPr>
       <w:bookmarkStart w:id="45" w:name="_Toc165969653"/>
-      <w:bookmarkStart w:id="46" w:name="_Toc242089356"/>
+      <w:bookmarkStart w:id="46" w:name="_Toc243470277"/>
       <w:r>
         <w:t>Conclusion</w:t>
       </w:r>
@@ -3719,18 +3747,30 @@
     </w:p>
     <w:p>
       <w:pPr>
-        <w:pStyle w:val="Corpsdetexte"/>
-      </w:pPr>
-      <w:r>
-        <w:t xml:space="preserve">Le projet c’est très bien déroulé, tous les objectifs ont été rempli à 100% et dans les temps. L’utilisation de l’IA était plus que correcte. J’ai détaillé le plus possible mon journal de travail et j’ai respecté la norme pour les commit et les ai fait atomiquement. </w:t>
-      </w:r>
-    </w:p>
-    <w:p>
-      <w:pPr>
-        <w:pStyle w:val="Corpsdetexte"/>
-      </w:pPr>
-      <w:r>
-        <w:t>Si c’était à refaire j’aurais commencé à commenter mon code dès le début et non à la fin comme je l’ai fait. J’aurais aussi rendu plus atomique mes méthode dès le départ.</w:t>
+        <w:pStyle w:val="BodyText"/>
+      </w:pPr>
+      <w:r>
+        <w:t xml:space="preserve">Le projet c’est très bien déroulé, tous les objectifs ont été rempli à 100% et dans les temps. L’utilisation de l’IA était plus que correcte. J’ai détaillé le plus possible mon journal de travail et j’ai respecté la norme pour les commit et les ai </w:t>
+      </w:r>
+      <w:r>
+        <w:t>faits</w:t>
+      </w:r>
+      <w:r>
+        <w:t xml:space="preserve"> atomiquement. </w:t>
+      </w:r>
+    </w:p>
+    <w:p>
+      <w:pPr>
+        <w:pStyle w:val="BodyText"/>
+      </w:pPr>
+      <w:r>
+        <w:t xml:space="preserve">Si c’était à refaire j’aurais commencé à commenter mon code dès le début et non à la fin comme je l’ai fait. J’aurais aussi rendu plus atomique </w:t>
+      </w:r>
+      <w:r>
+        <w:t>mes méthodes</w:t>
+      </w:r>
+      <w:r>
+        <w:t xml:space="preserve"> dès le départ.</w:t>
       </w:r>
     </w:p>
     <w:p>
@@ -3775,7 +3815,7 @@
 <w:ftr xmlns:wpc="http://schemas.microsoft.com/office/word/2010/wordprocessingCanvas" xmlns:cx="http://schemas.microsoft.com/office/drawing/2014/chartex" xmlns:cx1="http://schemas.microsoft.com/office/drawing/2015/9/8/chartex" xmlns:cx2="http://schemas.microsoft.com/office/drawing/2015/10/21/chartex" xmlns:cx3="http://schemas.microsoft.com/office/drawing/2016/5/9/chartex" xmlns:cx4="http://schemas.microsoft.com/office/drawing/2016/5/10/chartex" xmlns:cx5="http://schemas.microsoft.com/office/drawing/2016/5/11/chartex" xmlns:cx6="http://schemas.microsoft.com/office/drawing/2016/5/12/chartex" xmlns:cx7="http://schemas.microsoft.com/office/drawing/2016/5/13/chartex" xmlns:cx8="http://schemas.microsoft.com/office/drawing/2016/5/14/chartex" xmlns:mc="http://schemas.openxmlformats.org/markup-compatibility/2006" xmlns:aink="http://schemas.microsoft.com/office/drawing/2016/ink" xmlns:am3d="http://schemas.microsoft.com/office/drawing/2017/model3d" xmlns:o="urn:schemas-microsoft-com:office:office" xmlns:oel="http://schemas.microsoft.com/office/2019/extlst" xmlns:r="http://schemas.openxmlformats.org/officeDocument/2006/relationships" xmlns:m="http://schemas.openxmlformats.org/officeDocument/2006/math" xmlns:v="urn:schemas-microsoft-com:vml" xmlns:wp14="http://schemas.microsoft.com/office/word/2010/wordprocessingDrawing" xmlns:wp="http://schemas.openxmlformats.org/drawingml/2006/wordprocessingDrawing" xmlns:w10="urn:schemas-microsoft-com:office:word" xmlns:w="http://schemas.openxmlformats.org/wordprocessingml/2006/main" xmlns:w14="http://schemas.microsoft.com/office/word/2010/wordml" xmlns:w15="http://schemas.microsoft.com/office/word/2012/wordml" xmlns:w16cex="http://schemas.microsoft.com/office/word/2018/wordml/cex" xmlns:w16cid="http://schemas.microsoft.com/office/word/2016/wordml/cid" xmlns:w16="http://schemas.microsoft.com/office/word/2018/wordml" xmlns:w16du="http://schemas.microsoft.com/office/word/2023/wordml/word16du" xmlns:w16sdtdh="http://schemas.microsoft.com/office/word/2020/wordml/sdtdatahash" xmlns:w16sdtfl="http://schemas.microsoft.com/office/word/2024/wordml/sdtformatlock" xmlns:w16se="http://schemas.microsoft.com/office/word/2015/wordml/symex" xmlns:wpg="http://schemas.microsoft.com/office/word/2010/wordprocessingGroup" xmlns:wpi="http://schemas.microsoft.com/office/word/2010/wordprocessingInk" xmlns:wne="http://schemas.microsoft.com/office/word/2006/wordml" xmlns:wps="http://schemas.microsoft.com/office/word/2010/wordprocessingShape" mc:Ignorable="w14 w15 w16se w16cid w16 w16cex w16sdtdh w16sdtfl w16du wp14">
   <w:tbl>
     <w:tblPr>
-      <w:tblStyle w:val="Grilledutableau"/>
+      <w:tblStyle w:val="TableGrid"/>
       <w:tblW w:w="5000" w:type="pct"/>
       <w:jc w:val="center"/>
       <w:tblBorders>
@@ -3973,7 +4013,7 @@
           </w:r>
           <w:r>
             <w:rPr>
-              <w:rStyle w:val="Numrodepage"/>
+              <w:rStyle w:val="PageNumber"/>
               <w:rFonts w:cs="Arial"/>
               <w:szCs w:val="16"/>
             </w:rPr>
@@ -3981,7 +4021,7 @@
           </w:r>
           <w:r>
             <w:rPr>
-              <w:rStyle w:val="Numrodepage"/>
+              <w:rStyle w:val="PageNumber"/>
               <w:rFonts w:cs="Arial"/>
               <w:szCs w:val="16"/>
             </w:rPr>
@@ -3989,7 +4029,7 @@
           </w:r>
           <w:r>
             <w:rPr>
-              <w:rStyle w:val="Numrodepage"/>
+              <w:rStyle w:val="PageNumber"/>
               <w:rFonts w:cs="Arial"/>
               <w:szCs w:val="16"/>
             </w:rPr>
@@ -3997,7 +4037,7 @@
           </w:r>
           <w:r>
             <w:rPr>
-              <w:rStyle w:val="Numrodepage"/>
+              <w:rStyle w:val="PageNumber"/>
               <w:rFonts w:cs="Arial"/>
               <w:szCs w:val="16"/>
             </w:rPr>
@@ -4005,7 +4045,7 @@
           </w:r>
           <w:r>
             <w:rPr>
-              <w:rStyle w:val="Numrodepage"/>
+              <w:rStyle w:val="PageNumber"/>
               <w:rFonts w:cs="Arial"/>
               <w:szCs w:val="16"/>
             </w:rPr>
@@ -4013,7 +4053,7 @@
           </w:r>
           <w:r>
             <w:rPr>
-              <w:rStyle w:val="Numrodepage"/>
+              <w:rStyle w:val="PageNumber"/>
               <w:rFonts w:cs="Arial"/>
               <w:szCs w:val="16"/>
             </w:rPr>
@@ -4021,7 +4061,7 @@
           </w:r>
           <w:r>
             <w:rPr>
-              <w:rStyle w:val="Numrodepage"/>
+              <w:rStyle w:val="PageNumber"/>
               <w:rFonts w:cs="Arial"/>
               <w:szCs w:val="16"/>
             </w:rPr>
@@ -4029,7 +4069,7 @@
           </w:r>
           <w:r>
             <w:rPr>
-              <w:rStyle w:val="Numrodepage"/>
+              <w:rStyle w:val="PageNumber"/>
               <w:rFonts w:cs="Arial"/>
               <w:szCs w:val="16"/>
             </w:rPr>
@@ -4037,7 +4077,7 @@
           </w:r>
           <w:r>
             <w:rPr>
-              <w:rStyle w:val="Numrodepage"/>
+              <w:rStyle w:val="PageNumber"/>
               <w:rFonts w:cs="Arial"/>
               <w:szCs w:val="16"/>
             </w:rPr>
@@ -4045,7 +4085,7 @@
           </w:r>
           <w:r>
             <w:rPr>
-              <w:rStyle w:val="Numrodepage"/>
+              <w:rStyle w:val="PageNumber"/>
               <w:rFonts w:cs="Arial"/>
               <w:szCs w:val="16"/>
             </w:rPr>
@@ -4053,7 +4093,7 @@
           </w:r>
           <w:r>
             <w:rPr>
-              <w:rStyle w:val="Numrodepage"/>
+              <w:rStyle w:val="PageNumber"/>
               <w:rFonts w:cs="Arial"/>
               <w:szCs w:val="16"/>
             </w:rPr>
@@ -4187,7 +4227,7 @@
               <w:noProof/>
               <w:szCs w:val="16"/>
             </w:rPr>
-            <w:t>05.10.2026 10:41</w:t>
+            <w:t>11.10.2026 21:51</w:t>
           </w:r>
           <w:r>
             <w:rPr>
@@ -4228,7 +4268,7 @@
   </w:tbl>
   <w:p>
     <w:pPr>
-      <w:pStyle w:val="Pieddepage"/>
+      <w:pStyle w:val="Footer"/>
       <w:rPr>
         <w:sz w:val="2"/>
         <w:szCs w:val="2"/>
@@ -4261,7 +4301,7 @@
 <w:hdr xmlns:wpc="http://schemas.microsoft.com/office/word/2010/wordprocessingCanvas" xmlns:cx="http://schemas.microsoft.com/office/drawing/2014/chartex" xmlns:cx1="http://schemas.microsoft.com/office/drawing/2015/9/8/chartex" xmlns:cx2="http://schemas.microsoft.com/office/drawing/2015/10/21/chartex" xmlns:cx3="http://schemas.microsoft.com/office/drawing/2016/5/9/chartex" xmlns:cx4="http://schemas.microsoft.com/office/drawing/2016/5/10/chartex" xmlns:cx5="http://schemas.microsoft.com/office/drawing/2016/5/11/chartex" xmlns:cx6="http://schemas.microsoft.com/office/drawing/2016/5/12/chartex" xmlns:cx7="http://schemas.microsoft.com/office/drawing/2016/5/13/chartex" xmlns:cx8="http://schemas.microsoft.com/office/drawing/2016/5/14/chartex" xmlns:mc="http://schemas.openxmlformats.org/markup-compatibility/2006" xmlns:aink="http://schemas.microsoft.com/office/drawing/2016/ink" xmlns:am3d="http://schemas.microsoft.com/office/drawing/2017/model3d" xmlns:o="urn:schemas-microsoft-com:office:office" xmlns:oel="http://schemas.microsoft.com/office/2019/extlst" xmlns:r="http://schemas.openxmlformats.org/officeDocument/2006/relationships" xmlns:m="http://schemas.openxmlformats.org/officeDocument/2006/math" xmlns:v="urn:schemas-microsoft-com:vml" xmlns:wp14="http://schemas.microsoft.com/office/word/2010/wordprocessingDrawing" xmlns:wp="http://schemas.openxmlformats.org/drawingml/2006/wordprocessingDrawing" xmlns:w10="urn:schemas-microsoft-com:office:word" xmlns:w="http://schemas.openxmlformats.org/wordprocessingml/2006/main" xmlns:w14="http://schemas.microsoft.com/office/word/2010/wordml" xmlns:w15="http://schemas.microsoft.com/office/word/2012/wordml" xmlns:w16cex="http://schemas.microsoft.com/office/word/2018/wordml/cex" xmlns:w16cid="http://schemas.microsoft.com/office/word/2016/wordml/cid" xmlns:w16="http://schemas.microsoft.com/office/word/2018/wordml" xmlns:w16du="http://schemas.microsoft.com/office/word/2023/wordml/word16du" xmlns:w16sdtdh="http://schemas.microsoft.com/office/word/2020/wordml/sdtdatahash" xmlns:w16sdtfl="http://schemas.microsoft.com/office/word/2024/wordml/sdtformatlock" xmlns:w16se="http://schemas.microsoft.com/office/word/2015/wordml/symex" xmlns:wpg="http://schemas.microsoft.com/office/word/2010/wordprocessingGroup" xmlns:wpi="http://schemas.microsoft.com/office/word/2010/wordprocessingInk" xmlns:wne="http://schemas.microsoft.com/office/word/2006/wordml" xmlns:wps="http://schemas.microsoft.com/office/word/2010/wordprocessingShape" mc:Ignorable="w14 w15 w16se w16cid w16 w16cex w16sdtdh w16sdtfl w16du wp14">
   <w:tbl>
     <w:tblPr>
-      <w:tblStyle w:val="Grilledutableau"/>
+      <w:tblStyle w:val="TableGrid"/>
       <w:tblW w:w="5000" w:type="pct"/>
       <w:jc w:val="center"/>
       <w:tblBorders>
@@ -4273,9 +4313,9 @@
       <w:tblLook w:val="01E0" w:firstRow="1" w:lastRow="1" w:firstColumn="1" w:lastColumn="1" w:noHBand="0" w:noVBand="0"/>
     </w:tblPr>
     <w:tblGrid>
-      <w:gridCol w:w="2402"/>
-      <w:gridCol w:w="4400"/>
-      <w:gridCol w:w="2268"/>
+      <w:gridCol w:w="2390"/>
+      <w:gridCol w:w="4411"/>
+      <w:gridCol w:w="2269"/>
     </w:tblGrid>
     <w:tr>
       <w:trPr>
@@ -4310,7 +4350,7 @@
         </w:tcPr>
         <w:p>
           <w:pPr>
-            <w:pStyle w:val="En-tte"/>
+            <w:pStyle w:val="Header"/>
             <w:jc w:val="right"/>
           </w:pPr>
           <w:r>
@@ -4369,7 +4409,7 @@
   </w:tbl>
   <w:p>
     <w:pPr>
-      <w:pStyle w:val="En-tte"/>
+      <w:pStyle w:val="Header"/>
     </w:pPr>
   </w:p>
 </w:hdr>
@@ -4398,7 +4438,7 @@
         <v:path o:extrusionok="f" gradientshapeok="t" o:connecttype="rect"/>
         <o:lock v:ext="edit" aspectratio="t"/>
       </v:shapetype>
-      <v:shape id="_x0000_i1025" type="#_x0000_t75" style="width:12pt;height:12pt" o:bullet="t">
+      <v:shape id="_x0000_i1025" type="#_x0000_t75" style="width:11.5pt;height:11.5pt" o:bullet="t">
         <v:imagedata r:id="rId1" o:title="BD10263_"/>
       </v:shape>
     </w:pict>
@@ -4583,7 +4623,7 @@
     <w:lvl w:ilvl="4">
       <w:start w:val="1"/>
       <w:numFmt w:val="decimal"/>
-      <w:pStyle w:val="Titre5"/>
+      <w:pStyle w:val="Heading5"/>
       <w:lvlText w:val="%1.%2.%3.%4.%5"/>
       <w:lvlJc w:val="left"/>
       <w:pPr>
@@ -4599,7 +4639,7 @@
     <w:lvl w:ilvl="5">
       <w:start w:val="1"/>
       <w:numFmt w:val="decimal"/>
-      <w:pStyle w:val="Titre6"/>
+      <w:pStyle w:val="Heading6"/>
       <w:lvlText w:val="%1.%2.%3.%4.%5.%6"/>
       <w:lvlJc w:val="left"/>
       <w:pPr>
@@ -4615,7 +4655,7 @@
     <w:lvl w:ilvl="6">
       <w:start w:val="1"/>
       <w:numFmt w:val="decimal"/>
-      <w:pStyle w:val="Titre7"/>
+      <w:pStyle w:val="Heading7"/>
       <w:lvlText w:val="%1.%2.%3.%4.%5.%6.%7"/>
       <w:lvlJc w:val="left"/>
       <w:pPr>
@@ -4631,7 +4671,7 @@
     <w:lvl w:ilvl="7">
       <w:start w:val="1"/>
       <w:numFmt w:val="decimal"/>
-      <w:pStyle w:val="Titre8"/>
+      <w:pStyle w:val="Heading8"/>
       <w:lvlText w:val="%1.%2.%3.%4.%5.%6.%7.%8"/>
       <w:lvlJc w:val="left"/>
       <w:pPr>
@@ -4647,7 +4687,7 @@
     <w:lvl w:ilvl="8">
       <w:start w:val="1"/>
       <w:numFmt w:val="decimal"/>
-      <w:pStyle w:val="Titre9"/>
+      <w:pStyle w:val="Heading9"/>
       <w:lvlText w:val="%1.%2.%3.%4.%5.%6.%7.%8.%9"/>
       <w:lvlJc w:val="left"/>
       <w:pPr>
@@ -5767,7 +5807,7 @@
     <w:lvl w:ilvl="0">
       <w:start w:val="1"/>
       <w:numFmt w:val="decimal"/>
-      <w:pStyle w:val="Titre1"/>
+      <w:pStyle w:val="Heading1"/>
       <w:lvlText w:val="%1"/>
       <w:lvlJc w:val="left"/>
       <w:pPr>
@@ -5783,7 +5823,7 @@
     <w:lvl w:ilvl="1">
       <w:start w:val="1"/>
       <w:numFmt w:val="decimal"/>
-      <w:pStyle w:val="Titre2"/>
+      <w:pStyle w:val="Heading2"/>
       <w:lvlText w:val="%1.%2"/>
       <w:lvlJc w:val="left"/>
       <w:pPr>
@@ -5799,7 +5839,7 @@
     <w:lvl w:ilvl="2">
       <w:start w:val="1"/>
       <w:numFmt w:val="decimal"/>
-      <w:pStyle w:val="Titre3"/>
+      <w:pStyle w:val="Heading3"/>
       <w:lvlText w:val="%1.%2.%3"/>
       <w:lvlJc w:val="left"/>
       <w:pPr>
@@ -6931,10 +6971,10 @@
     <w:qFormat/>
     <w:rsid w:val="00615583"/>
   </w:style>
-  <w:style w:type="paragraph" w:styleId="Titre1">
+  <w:style w:type="paragraph" w:styleId="Heading1">
     <w:name w:val="heading 1"/>
     <w:basedOn w:val="Normal"/>
-    <w:next w:val="Corpsdetexte"/>
+    <w:next w:val="BodyText"/>
     <w:autoRedefine/>
     <w:qFormat/>
     <w:rsid w:val="00F6564C"/>
@@ -6957,10 +6997,10 @@
       <w:szCs w:val="32"/>
     </w:rPr>
   </w:style>
-  <w:style w:type="paragraph" w:styleId="Titre2">
+  <w:style w:type="paragraph" w:styleId="Heading2">
     <w:name w:val="heading 2"/>
     <w:basedOn w:val="Normal"/>
-    <w:next w:val="Retraitcorpsdetexte"/>
+    <w:next w:val="BodyTextIndent"/>
     <w:autoRedefine/>
     <w:qFormat/>
     <w:rsid w:val="00AA4393"/>
@@ -6982,10 +7022,10 @@
       <w:szCs w:val="28"/>
     </w:rPr>
   </w:style>
-  <w:style w:type="paragraph" w:styleId="Titre3">
+  <w:style w:type="paragraph" w:styleId="Heading3">
     <w:name w:val="heading 3"/>
     <w:basedOn w:val="Normal"/>
-    <w:next w:val="Retraitcorpsdetexte3"/>
+    <w:next w:val="BodyTextIndent3"/>
     <w:qFormat/>
     <w:rsid w:val="00AA4393"/>
     <w:pPr>
@@ -7005,7 +7045,7 @@
       <w:szCs w:val="26"/>
     </w:rPr>
   </w:style>
-  <w:style w:type="paragraph" w:styleId="Titre4">
+  <w:style w:type="paragraph" w:styleId="Heading4">
     <w:name w:val="heading 4"/>
     <w:basedOn w:val="Normal"/>
     <w:next w:val="Normal"/>
@@ -7024,7 +7064,7 @@
       <w:szCs w:val="28"/>
     </w:rPr>
   </w:style>
-  <w:style w:type="paragraph" w:styleId="Titre5">
+  <w:style w:type="paragraph" w:styleId="Heading5">
     <w:name w:val="heading 5"/>
     <w:basedOn w:val="Normal"/>
     <w:next w:val="Normal"/>
@@ -7048,7 +7088,7 @@
       <w:szCs w:val="26"/>
     </w:rPr>
   </w:style>
-  <w:style w:type="paragraph" w:styleId="Titre6">
+  <w:style w:type="paragraph" w:styleId="Heading6">
     <w:name w:val="heading 6"/>
     <w:basedOn w:val="Normal"/>
     <w:next w:val="Normal"/>
@@ -7070,7 +7110,7 @@
       <w:szCs w:val="22"/>
     </w:rPr>
   </w:style>
-  <w:style w:type="paragraph" w:styleId="Titre7">
+  <w:style w:type="paragraph" w:styleId="Heading7">
     <w:name w:val="heading 7"/>
     <w:basedOn w:val="Normal"/>
     <w:next w:val="Normal"/>
@@ -7088,7 +7128,7 @@
       <w:rFonts w:asciiTheme="majorHAnsi" w:hAnsiTheme="majorHAnsi"/>
     </w:rPr>
   </w:style>
-  <w:style w:type="paragraph" w:styleId="Titre8">
+  <w:style w:type="paragraph" w:styleId="Heading8">
     <w:name w:val="heading 8"/>
     <w:basedOn w:val="Normal"/>
     <w:next w:val="Normal"/>
@@ -7108,7 +7148,7 @@
       <w:iCs/>
     </w:rPr>
   </w:style>
-  <w:style w:type="paragraph" w:styleId="Titre9">
+  <w:style w:type="paragraph" w:styleId="Heading9">
     <w:name w:val="heading 9"/>
     <w:basedOn w:val="Normal"/>
     <w:next w:val="Normal"/>
@@ -7128,13 +7168,13 @@
       <w:szCs w:val="22"/>
     </w:rPr>
   </w:style>
-  <w:style w:type="character" w:default="1" w:styleId="Policepardfaut">
+  <w:style w:type="character" w:default="1" w:styleId="DefaultParagraphFont">
     <w:name w:val="Default Paragraph Font"/>
     <w:uiPriority w:val="1"/>
     <w:semiHidden/>
     <w:unhideWhenUsed/>
   </w:style>
-  <w:style w:type="table" w:default="1" w:styleId="TableauNormal">
+  <w:style w:type="table" w:default="1" w:styleId="TableNormal">
     <w:name w:val="Normal Table"/>
     <w:uiPriority w:val="99"/>
     <w:semiHidden/>
@@ -7149,13 +7189,13 @@
       </w:tblCellMar>
     </w:tblPr>
   </w:style>
-  <w:style w:type="numbering" w:default="1" w:styleId="Aucuneliste">
+  <w:style w:type="numbering" w:default="1" w:styleId="NoList">
     <w:name w:val="No List"/>
     <w:uiPriority w:val="99"/>
     <w:semiHidden/>
     <w:unhideWhenUsed/>
   </w:style>
-  <w:style w:type="paragraph" w:styleId="En-tte">
+  <w:style w:type="paragraph" w:styleId="Header">
     <w:name w:val="header"/>
     <w:basedOn w:val="Normal"/>
     <w:semiHidden/>
@@ -7167,7 +7207,7 @@
       </w:tabs>
     </w:pPr>
   </w:style>
-  <w:style w:type="paragraph" w:styleId="Pieddepage">
+  <w:style w:type="paragraph" w:styleId="Footer">
     <w:name w:val="footer"/>
     <w:basedOn w:val="Normal"/>
     <w:semiHidden/>
@@ -7179,9 +7219,9 @@
       </w:tabs>
     </w:pPr>
   </w:style>
-  <w:style w:type="table" w:styleId="Grilledutableau">
+  <w:style w:type="table" w:styleId="TableGrid">
     <w:name w:val="Table Grid"/>
-    <w:basedOn w:val="TableauNormal"/>
+    <w:basedOn w:val="TableNormal"/>
     <w:semiHidden/>
     <w:rsid w:val="00AE282D"/>
     <w:tblPr>
@@ -7195,9 +7235,9 @@
       </w:tblBorders>
     </w:tblPr>
   </w:style>
-  <w:style w:type="character" w:styleId="Numrodepage">
+  <w:style w:type="character" w:styleId="PageNumber">
     <w:name w:val="page number"/>
-    <w:basedOn w:val="Policepardfaut"/>
+    <w:basedOn w:val="DefaultParagraphFont"/>
     <w:semiHidden/>
     <w:rsid w:val="005E6192"/>
   </w:style>
@@ -7226,10 +7266,10 @@
       <w:spacing w:line="360" w:lineRule="auto"/>
     </w:pPr>
   </w:style>
-  <w:style w:type="paragraph" w:styleId="Corpsdetexte">
+  <w:style w:type="paragraph" w:styleId="BodyText">
     <w:name w:val="Body Text"/>
     <w:basedOn w:val="Normal"/>
-    <w:link w:val="CorpsdetexteCar"/>
+    <w:link w:val="BodyTextChar"/>
     <w:rsid w:val="008E53F9"/>
     <w:pPr>
       <w:tabs>
@@ -7313,7 +7353,7 @@
       <w:sz w:val="28"/>
     </w:rPr>
   </w:style>
-  <w:style w:type="paragraph" w:styleId="TM10">
+  <w:style w:type="paragraph" w:styleId="TOC1">
     <w:name w:val="toc 1"/>
     <w:basedOn w:val="Normal"/>
     <w:next w:val="Normal"/>
@@ -7329,7 +7369,7 @@
       <w:caps/>
     </w:rPr>
   </w:style>
-  <w:style w:type="paragraph" w:styleId="TM2">
+  <w:style w:type="paragraph" w:styleId="TOC2">
     <w:name w:val="toc 2"/>
     <w:basedOn w:val="Normal"/>
     <w:next w:val="Normal"/>
@@ -7343,7 +7383,7 @@
       <w:smallCaps/>
     </w:rPr>
   </w:style>
-  <w:style w:type="paragraph" w:styleId="TM3">
+  <w:style w:type="paragraph" w:styleId="TOC3">
     <w:name w:val="toc 3"/>
     <w:basedOn w:val="Normal"/>
     <w:next w:val="Normal"/>
@@ -7359,7 +7399,7 @@
       <w:iCs/>
     </w:rPr>
   </w:style>
-  <w:style w:type="paragraph" w:styleId="TM4">
+  <w:style w:type="paragraph" w:styleId="TOC4">
     <w:name w:val="toc 4"/>
     <w:basedOn w:val="Normal"/>
     <w:next w:val="Normal"/>
@@ -7376,7 +7416,7 @@
   </w:style>
   <w:style w:type="character" w:customStyle="1" w:styleId="TM1Car">
     <w:name w:val="TM1 Car"/>
-    <w:basedOn w:val="Policepardfaut"/>
+    <w:basedOn w:val="DefaultParagraphFont"/>
     <w:link w:val="TM1"/>
     <w:rsid w:val="007F30AE"/>
     <w:rPr>
@@ -7388,9 +7428,9 @@
       <w:lang w:val="fr-FR" w:eastAsia="fr-FR" w:bidi="ar-SA"/>
     </w:rPr>
   </w:style>
-  <w:style w:type="character" w:styleId="Lienhypertexte">
+  <w:style w:type="character" w:styleId="Hyperlink">
     <w:name w:val="Hyperlink"/>
-    <w:basedOn w:val="Policepardfaut"/>
+    <w:basedOn w:val="DefaultParagraphFont"/>
     <w:uiPriority w:val="99"/>
     <w:rsid w:val="00932149"/>
     <w:rPr>
@@ -7398,10 +7438,10 @@
       <w:u w:val="single"/>
     </w:rPr>
   </w:style>
-  <w:style w:type="paragraph" w:styleId="Textedebulles">
+  <w:style w:type="paragraph" w:styleId="BalloonText">
     <w:name w:val="Balloon Text"/>
     <w:basedOn w:val="Normal"/>
-    <w:link w:val="TextedebullesCar"/>
+    <w:link w:val="BalloonTextChar"/>
     <w:rsid w:val="00B64C66"/>
     <w:rPr>
       <w:rFonts w:ascii="Tahoma" w:hAnsi="Tahoma" w:cs="Tahoma"/>
@@ -7409,10 +7449,10 @@
       <w:szCs w:val="16"/>
     </w:rPr>
   </w:style>
-  <w:style w:type="character" w:customStyle="1" w:styleId="TextedebullesCar">
-    <w:name w:val="Texte de bulles Car"/>
-    <w:basedOn w:val="Policepardfaut"/>
-    <w:link w:val="Textedebulles"/>
+  <w:style w:type="character" w:customStyle="1" w:styleId="BalloonTextChar">
+    <w:name w:val="Balloon Text Char"/>
+    <w:basedOn w:val="DefaultParagraphFont"/>
+    <w:link w:val="BalloonText"/>
     <w:rsid w:val="00B64C66"/>
     <w:rPr>
       <w:rFonts w:ascii="Tahoma" w:hAnsi="Tahoma" w:cs="Tahoma"/>
@@ -7445,16 +7485,16 @@
   </w:style>
   <w:style w:type="character" w:customStyle="1" w:styleId="paragraphe2Car">
     <w:name w:val="paragraphe2 Car"/>
-    <w:basedOn w:val="Policepardfaut"/>
+    <w:basedOn w:val="DefaultParagraphFont"/>
     <w:link w:val="paragraphe2"/>
     <w:rsid w:val="00753A51"/>
     <w:rPr>
       <w:rFonts w:asciiTheme="minorHAnsi" w:hAnsiTheme="minorHAnsi"/>
     </w:rPr>
   </w:style>
-  <w:style w:type="character" w:styleId="lev">
+  <w:style w:type="character" w:styleId="Strong">
     <w:name w:val="Strong"/>
-    <w:basedOn w:val="Policepardfaut"/>
+    <w:basedOn w:val="DefaultParagraphFont"/>
     <w:qFormat/>
     <w:rsid w:val="0037071E"/>
     <w:rPr>
@@ -7462,26 +7502,26 @@
       <w:bCs/>
     </w:rPr>
   </w:style>
-  <w:style w:type="paragraph" w:styleId="Retraitcorpsdetexte">
+  <w:style w:type="paragraph" w:styleId="BodyTextIndent">
     <w:name w:val="Body Text Indent"/>
-    <w:basedOn w:val="Corpsdetexte"/>
-    <w:link w:val="RetraitcorpsdetexteCar"/>
+    <w:basedOn w:val="BodyText"/>
+    <w:link w:val="BodyTextIndentChar"/>
     <w:rsid w:val="00AA4393"/>
     <w:pPr>
       <w:ind w:left="1134"/>
       <w:contextualSpacing/>
     </w:pPr>
   </w:style>
-  <w:style w:type="character" w:customStyle="1" w:styleId="RetraitcorpsdetexteCar">
-    <w:name w:val="Retrait corps de texte Car"/>
-    <w:basedOn w:val="Policepardfaut"/>
-    <w:link w:val="Retraitcorpsdetexte"/>
+  <w:style w:type="character" w:customStyle="1" w:styleId="BodyTextIndentChar">
+    <w:name w:val="Body Text Indent Char"/>
+    <w:basedOn w:val="DefaultParagraphFont"/>
+    <w:link w:val="BodyTextIndent"/>
     <w:rsid w:val="00AA4393"/>
   </w:style>
-  <w:style w:type="paragraph" w:styleId="Retraitcorpsdetexte3">
+  <w:style w:type="paragraph" w:styleId="BodyTextIndent3">
     <w:name w:val="Body Text Indent 3"/>
-    <w:basedOn w:val="Corpsdetexte"/>
-    <w:link w:val="Retraitcorpsdetexte3Car"/>
+    <w:basedOn w:val="BodyText"/>
+    <w:link w:val="BodyTextIndent3Char"/>
     <w:rsid w:val="00AA4393"/>
     <w:pPr>
       <w:ind w:left="1814"/>
@@ -7490,20 +7530,20 @@
       <w:szCs w:val="16"/>
     </w:rPr>
   </w:style>
-  <w:style w:type="character" w:customStyle="1" w:styleId="Retraitcorpsdetexte3Car">
-    <w:name w:val="Retrait corps de texte 3 Car"/>
-    <w:basedOn w:val="Policepardfaut"/>
-    <w:link w:val="Retraitcorpsdetexte3"/>
+  <w:style w:type="character" w:customStyle="1" w:styleId="BodyTextIndent3Char">
+    <w:name w:val="Body Text Indent 3 Char"/>
+    <w:basedOn w:val="DefaultParagraphFont"/>
+    <w:link w:val="BodyTextIndent3"/>
     <w:rsid w:val="00AA4393"/>
     <w:rPr>
       <w:szCs w:val="16"/>
     </w:rPr>
   </w:style>
-  <w:style w:type="paragraph" w:styleId="Titre">
+  <w:style w:type="paragraph" w:styleId="Title">
     <w:name w:val="Title"/>
     <w:basedOn w:val="Normal"/>
     <w:next w:val="Normal"/>
-    <w:link w:val="TitreCar"/>
+    <w:link w:val="TitleChar"/>
     <w:qFormat/>
     <w:rsid w:val="000E7483"/>
     <w:pPr>
@@ -7523,10 +7563,10 @@
       <w:szCs w:val="52"/>
     </w:rPr>
   </w:style>
-  <w:style w:type="character" w:customStyle="1" w:styleId="TitreCar">
-    <w:name w:val="Titre Car"/>
-    <w:basedOn w:val="Policepardfaut"/>
-    <w:link w:val="Titre"/>
+  <w:style w:type="character" w:customStyle="1" w:styleId="TitleChar">
+    <w:name w:val="Title Char"/>
+    <w:basedOn w:val="DefaultParagraphFont"/>
+    <w:link w:val="Title"/>
     <w:rsid w:val="000E7483"/>
     <w:rPr>
       <w:rFonts w:asciiTheme="majorHAnsi" w:eastAsiaTheme="majorEastAsia" w:hAnsiTheme="majorHAnsi" w:cstheme="majorBidi"/>
@@ -7539,7 +7579,7 @@
   </w:style>
   <w:style w:type="paragraph" w:customStyle="1" w:styleId="Informations">
     <w:name w:val="Informations"/>
-    <w:basedOn w:val="Retraitcorpsdetexte"/>
+    <w:basedOn w:val="BodyTextIndent"/>
     <w:qFormat/>
     <w:rsid w:val="00645760"/>
     <w:pPr>
@@ -7550,7 +7590,7 @@
       <w:sz w:val="16"/>
     </w:rPr>
   </w:style>
-  <w:style w:type="paragraph" w:styleId="TM5">
+  <w:style w:type="paragraph" w:styleId="TOC5">
     <w:name w:val="toc 5"/>
     <w:basedOn w:val="Normal"/>
     <w:next w:val="Normal"/>
@@ -7565,7 +7605,7 @@
       <w:szCs w:val="18"/>
     </w:rPr>
   </w:style>
-  <w:style w:type="paragraph" w:styleId="TM6">
+  <w:style w:type="paragraph" w:styleId="TOC6">
     <w:name w:val="toc 6"/>
     <w:basedOn w:val="Normal"/>
     <w:next w:val="Normal"/>
@@ -7580,7 +7620,7 @@
       <w:szCs w:val="18"/>
     </w:rPr>
   </w:style>
-  <w:style w:type="paragraph" w:styleId="TM7">
+  <w:style w:type="paragraph" w:styleId="TOC7">
     <w:name w:val="toc 7"/>
     <w:basedOn w:val="Normal"/>
     <w:next w:val="Normal"/>
@@ -7595,7 +7635,7 @@
       <w:szCs w:val="18"/>
     </w:rPr>
   </w:style>
-  <w:style w:type="paragraph" w:styleId="TM8">
+  <w:style w:type="paragraph" w:styleId="TOC8">
     <w:name w:val="toc 8"/>
     <w:basedOn w:val="Normal"/>
     <w:next w:val="Normal"/>
@@ -7610,7 +7650,7 @@
       <w:szCs w:val="18"/>
     </w:rPr>
   </w:style>
-  <w:style w:type="paragraph" w:styleId="TM9">
+  <w:style w:type="paragraph" w:styleId="TOC9">
     <w:name w:val="toc 9"/>
     <w:basedOn w:val="Normal"/>
     <w:next w:val="Normal"/>
@@ -7625,32 +7665,32 @@
       <w:szCs w:val="18"/>
     </w:rPr>
   </w:style>
-  <w:style w:type="paragraph" w:styleId="Titredenote">
+  <w:style w:type="paragraph" w:styleId="NoteHeading">
     <w:name w:val="Note Heading"/>
     <w:basedOn w:val="Normal"/>
     <w:next w:val="Normal"/>
-    <w:link w:val="TitredenoteCar"/>
+    <w:link w:val="NoteHeadingChar"/>
     <w:rsid w:val="00AA4393"/>
     <w:rPr>
       <w:rFonts w:asciiTheme="majorHAnsi" w:hAnsiTheme="majorHAnsi"/>
     </w:rPr>
   </w:style>
-  <w:style w:type="character" w:customStyle="1" w:styleId="CorpsdetexteCar">
-    <w:name w:val="Corps de texte Car"/>
-    <w:basedOn w:val="Policepardfaut"/>
-    <w:link w:val="Corpsdetexte"/>
+  <w:style w:type="character" w:customStyle="1" w:styleId="BodyTextChar">
+    <w:name w:val="Body Text Char"/>
+    <w:basedOn w:val="DefaultParagraphFont"/>
+    <w:link w:val="BodyText"/>
     <w:rsid w:val="00AA4393"/>
   </w:style>
-  <w:style w:type="character" w:customStyle="1" w:styleId="TitredenoteCar">
-    <w:name w:val="Titre de note Car"/>
-    <w:basedOn w:val="Policepardfaut"/>
-    <w:link w:val="Titredenote"/>
+  <w:style w:type="character" w:customStyle="1" w:styleId="NoteHeadingChar">
+    <w:name w:val="Note Heading Char"/>
+    <w:basedOn w:val="DefaultParagraphFont"/>
+    <w:link w:val="NoteHeading"/>
     <w:rsid w:val="00AA4393"/>
     <w:rPr>
       <w:rFonts w:asciiTheme="majorHAnsi" w:hAnsiTheme="majorHAnsi"/>
     </w:rPr>
   </w:style>
-  <w:style w:type="paragraph" w:styleId="Paragraphedeliste">
+  <w:style w:type="paragraph" w:styleId="ListParagraph">
     <w:name w:val="List Paragraph"/>
     <w:basedOn w:val="Normal"/>
     <w:uiPriority w:val="34"/>
@@ -7661,9 +7701,9 @@
       <w:contextualSpacing/>
     </w:pPr>
   </w:style>
-  <w:style w:type="character" w:styleId="Mentionnonrsolue">
+  <w:style w:type="character" w:styleId="UnresolvedMention">
     <w:name w:val="Unresolved Mention"/>
-    <w:basedOn w:val="Policepardfaut"/>
+    <w:basedOn w:val="DefaultParagraphFont"/>
     <w:uiPriority w:val="99"/>
     <w:semiHidden/>
     <w:unhideWhenUsed/>
@@ -8125,22 +8165,22 @@
 </file>
 
 <file path=customXml/item2.xml><?xml version="1.0" encoding="utf-8"?>
-<p:properties xmlns:p="http://schemas.microsoft.com/office/2006/metadata/properties" xmlns:xsi="http://www.w3.org/2001/XMLSchema-instance" xmlns:pc="http://schemas.microsoft.com/office/infopath/2007/PartnerControls">
-  <documentManagement/>
-</p:properties>
+<b:Sources xmlns:b="http://schemas.openxmlformats.org/officeDocument/2006/bibliography" xmlns="http://schemas.openxmlformats.org/officeDocument/2006/bibliography" SelectedStyle="\APA.XSL" StyleName="APA"/>
 </file>
 
 <file path=customXml/item3.xml><?xml version="1.0" encoding="utf-8"?>
-<b:Sources xmlns:b="http://schemas.openxmlformats.org/officeDocument/2006/bibliography" xmlns="http://schemas.openxmlformats.org/officeDocument/2006/bibliography" SelectedStyle="\APA.XSL" StyleName="APA"/>
-</file>
-
-<file path=customXml/item4.xml><?xml version="1.0" encoding="utf-8"?>
 <?mso-contentType ?>
 <FormTemplates xmlns="http://schemas.microsoft.com/sharepoint/v3/contenttype/forms">
   <Display>DocumentLibraryForm</Display>
   <Edit>DocumentLibraryForm</Edit>
   <New>DocumentLibraryForm</New>
 </FormTemplates>
+</file>
+
+<file path=customXml/item4.xml><?xml version="1.0" encoding="utf-8"?>
+<p:properties xmlns:p="http://schemas.microsoft.com/office/2006/metadata/properties" xmlns:xsi="http://www.w3.org/2001/XMLSchema-instance" xmlns:pc="http://schemas.microsoft.com/office/infopath/2007/PartnerControls">
+  <documentManagement/>
+</p:properties>
 </file>
 
 <file path=customXml/itemProps1.xml><?xml version="1.0" encoding="utf-8"?>
@@ -8162,15 +8202,6 @@
 </file>
 
 <file path=customXml/itemProps2.xml><?xml version="1.0" encoding="utf-8"?>
-<ds:datastoreItem xmlns:ds="http://schemas.openxmlformats.org/officeDocument/2006/customXml" ds:itemID="{2319CDB8-A2CD-412D-8359-13E6B4DF1FF4}">
-  <ds:schemaRefs>
-    <ds:schemaRef ds:uri="http://schemas.microsoft.com/office/2006/metadata/properties"/>
-    <ds:schemaRef ds:uri="http://schemas.microsoft.com/office/infopath/2007/PartnerControls"/>
-  </ds:schemaRefs>
-</ds:datastoreItem>
-</file>
-
-<file path=customXml/itemProps3.xml><?xml version="1.0" encoding="utf-8"?>
 <ds:datastoreItem xmlns:ds="http://schemas.openxmlformats.org/officeDocument/2006/customXml" ds:itemID="{C8C35155-3E6A-4058-B6E4-303717845E3B}">
   <ds:schemaRefs>
     <ds:schemaRef ds:uri="http://schemas.openxmlformats.org/officeDocument/2006/bibliography"/>
@@ -8178,10 +8209,19 @@
 </ds:datastoreItem>
 </file>
 
-<file path=customXml/itemProps4.xml><?xml version="1.0" encoding="utf-8"?>
+<file path=customXml/itemProps3.xml><?xml version="1.0" encoding="utf-8"?>
 <ds:datastoreItem xmlns:ds="http://schemas.openxmlformats.org/officeDocument/2006/customXml" ds:itemID="{6C3F7A66-EDE3-46FD-83EB-3C265E5D2669}">
   <ds:schemaRefs>
     <ds:schemaRef ds:uri="http://schemas.microsoft.com/sharepoint/v3/contenttype/forms"/>
   </ds:schemaRefs>
 </ds:datastoreItem>
+</file>
+
+<file path=customXml/itemProps4.xml><?xml version="1.0" encoding="utf-8"?>
+<ds:datastoreItem xmlns:ds="http://schemas.openxmlformats.org/officeDocument/2006/customXml" ds:itemID="{2319CDB8-A2CD-412D-8359-13E6B4DF1FF4}">
+  <ds:schemaRefs>
+    <ds:schemaRef ds:uri="http://schemas.microsoft.com/office/2006/metadata/properties"/>
+    <ds:schemaRef ds:uri="http://schemas.microsoft.com/office/infopath/2007/PartnerControls"/>
+  </ds:schemaRefs>
+</ds:datastoreItem>
 </file>
</xml_diff>